<commit_message>
P0-01 - Consolidar baseline PostgreSQL e migrations
</commit_message>
<xml_diff>
--- a/JobsIA_Documentacao_Arquitetura.docx
+++ b/JobsIA_Documentacao_Arquitetura.docx
@@ -88,8 +88,45 @@
           <w:sz w:val="28"/>
           <w:szCs w:val="28"/>
         </w:rPr>
-        <w:t>Especificação Técnica de Arquitetura, Frontend e Backend</w:t>
-      </w:r>
+        <w:t xml:space="preserve">Especificação Técnica de Arquitetura, </w:t>
+      </w:r>
+      <w:proofErr w:type="spellStart"/>
+      <w:r>
+        <w:rPr>
+          <w:rFonts w:ascii="Calibri" w:eastAsia="Calibri" w:hAnsi="Calibri" w:cs="Calibri"/>
+          <w:b/>
+          <w:bCs/>
+          <w:color w:val="333333"/>
+          <w:sz w:val="28"/>
+          <w:szCs w:val="28"/>
+        </w:rPr>
+        <w:t>Frontend</w:t>
+      </w:r>
+      <w:proofErr w:type="spellEnd"/>
+      <w:r>
+        <w:rPr>
+          <w:rFonts w:ascii="Calibri" w:eastAsia="Calibri" w:hAnsi="Calibri" w:cs="Calibri"/>
+          <w:b/>
+          <w:bCs/>
+          <w:color w:val="333333"/>
+          <w:sz w:val="28"/>
+          <w:szCs w:val="28"/>
+        </w:rPr>
+        <w:t xml:space="preserve"> e </w:t>
+      </w:r>
+      <w:proofErr w:type="spellStart"/>
+      <w:r>
+        <w:rPr>
+          <w:rFonts w:ascii="Calibri" w:eastAsia="Calibri" w:hAnsi="Calibri" w:cs="Calibri"/>
+          <w:b/>
+          <w:bCs/>
+          <w:color w:val="333333"/>
+          <w:sz w:val="28"/>
+          <w:szCs w:val="28"/>
+        </w:rPr>
+        <w:t>Backend</w:t>
+      </w:r>
+      <w:proofErr w:type="spellEnd"/>
     </w:p>
     <w:p>
       <w:pPr>
@@ -2132,215 +2169,101 @@
       <w:pPr>
         <w:spacing w:before="120" w:after="4800" w:line="288" w:lineRule="auto"/>
         <w:jc w:val="both"/>
-      </w:pPr>
-      <w:r>
-        <w:rPr>
-          <w:rFonts w:ascii="Calibri" w:eastAsia="Calibri" w:hAnsi="Calibri" w:cs="Calibri"/>
-          <w:color w:val="333333"/>
-          <w:sz w:val="22"/>
-          <w:szCs w:val="22"/>
-        </w:rPr>
-        <w:t>Este documento detalha de forma exaustiva a arquitetura de software, a infraestrutura do backend e a interface do frontend do sistema Jobs IA, uma plataforma desenvolvida sob medida para a Dataprev (DIOT). O sistema tem como foco a automação e simplificação na geração de checklists e comandos para execução de workloads (jobs) de lote, utilizando inteligência artificial generativa baseada em processamento de linguagem natural.</w:t>
-      </w:r>
-    </w:p>
-    <w:p>
-      <w:pPr>
-        <w:pStyle w:val="Ttulo2"/>
-        <w:keepNext/>
-        <w:spacing w:before="240" w:after="120"/>
-      </w:pPr>
-      <w:bookmarkStart w:id="2" w:name="_Toc233183120"/>
-      <w:r>
-        <w:rPr>
-          <w:rFonts w:ascii="Calibri" w:eastAsia="Calibri" w:hAnsi="Calibri" w:cs="Calibri"/>
-          <w:b/>
-          <w:bCs/>
-          <w:color w:val="1B365D"/>
-          <w:sz w:val="28"/>
-          <w:szCs w:val="28"/>
-        </w:rPr>
-        <w:t>Estrutura do Documento</w:t>
-      </w:r>
-      <w:bookmarkEnd w:id="2"/>
-    </w:p>
-    <w:p>
-      <w:pPr>
-        <w:pStyle w:val="PargrafodaLista"/>
-        <w:numPr>
-          <w:ilvl w:val="0"/>
-          <w:numId w:val="1"/>
-        </w:numPr>
-        <w:spacing w:before="60" w:after="60"/>
-      </w:pPr>
-      <w:r>
-        <w:rPr>
-          <w:rFonts w:ascii="Calibri" w:eastAsia="Calibri" w:hAnsi="Calibri" w:cs="Calibri"/>
-          <w:b/>
-          <w:bCs/>
-          <w:color w:val="333333"/>
-          <w:sz w:val="22"/>
-          <w:szCs w:val="22"/>
-        </w:rPr>
-        <w:t xml:space="preserve">Seção 1: </w:t>
-      </w:r>
-      <w:r>
-        <w:rPr>
-          <w:rFonts w:ascii="Calibri" w:eastAsia="Calibri" w:hAnsi="Calibri" w:cs="Calibri"/>
-          <w:color w:val="333333"/>
-          <w:sz w:val="22"/>
-          <w:szCs w:val="22"/>
-        </w:rPr>
-        <w:t>1. Introdução e Contexto Geral do Negócio</w:t>
-      </w:r>
-    </w:p>
-    <w:p>
-      <w:pPr>
-        <w:pStyle w:val="PargrafodaLista"/>
-        <w:numPr>
-          <w:ilvl w:val="0"/>
-          <w:numId w:val="1"/>
-        </w:numPr>
-        <w:spacing w:before="60" w:after="60"/>
-      </w:pPr>
-      <w:r>
-        <w:rPr>
-          <w:rFonts w:ascii="Calibri" w:eastAsia="Calibri" w:hAnsi="Calibri" w:cs="Calibri"/>
-          <w:b/>
-          <w:bCs/>
-          <w:color w:val="333333"/>
-          <w:sz w:val="22"/>
-          <w:szCs w:val="22"/>
-        </w:rPr>
-        <w:t xml:space="preserve">Seção 2: </w:t>
-      </w:r>
-      <w:r>
-        <w:rPr>
-          <w:rFonts w:ascii="Calibri" w:eastAsia="Calibri" w:hAnsi="Calibri" w:cs="Calibri"/>
-          <w:color w:val="333333"/>
-          <w:sz w:val="22"/>
-          <w:szCs w:val="22"/>
-        </w:rPr>
-        <w:t>2. Arquitetura do Software e Infraestrutura</w:t>
-      </w:r>
-    </w:p>
-    <w:p>
-      <w:pPr>
-        <w:pStyle w:val="PargrafodaLista"/>
-        <w:numPr>
-          <w:ilvl w:val="0"/>
-          <w:numId w:val="1"/>
-        </w:numPr>
-        <w:spacing w:before="60" w:after="60"/>
-      </w:pPr>
-      <w:r>
-        <w:rPr>
-          <w:rFonts w:ascii="Calibri" w:eastAsia="Calibri" w:hAnsi="Calibri" w:cs="Calibri"/>
-          <w:b/>
-          <w:bCs/>
-          <w:color w:val="333333"/>
-          <w:sz w:val="22"/>
-          <w:szCs w:val="22"/>
-        </w:rPr>
-        <w:t xml:space="preserve">Seção 3: </w:t>
-      </w:r>
-      <w:r>
-        <w:rPr>
-          <w:rFonts w:ascii="Calibri" w:eastAsia="Calibri" w:hAnsi="Calibri" w:cs="Calibri"/>
-          <w:color w:val="333333"/>
-          <w:sz w:val="22"/>
-          <w:szCs w:val="22"/>
-        </w:rPr>
-        <w:t>3. Backend (Banco de Dados, Servidor, APIs e Rotas)</w:t>
-      </w:r>
-    </w:p>
-    <w:p>
-      <w:pPr>
-        <w:pStyle w:val="PargrafodaLista"/>
-        <w:numPr>
-          <w:ilvl w:val="0"/>
-          <w:numId w:val="1"/>
-        </w:numPr>
-        <w:spacing w:before="60" w:after="60"/>
-      </w:pPr>
-      <w:r>
-        <w:rPr>
-          <w:rFonts w:ascii="Calibri" w:eastAsia="Calibri" w:hAnsi="Calibri" w:cs="Calibri"/>
-          <w:b/>
-          <w:bCs/>
-          <w:color w:val="333333"/>
-          <w:sz w:val="22"/>
-          <w:szCs w:val="22"/>
-        </w:rPr>
-        <w:t xml:space="preserve">Seção 4: </w:t>
-      </w:r>
-      <w:r>
-        <w:rPr>
-          <w:rFonts w:ascii="Calibri" w:eastAsia="Calibri" w:hAnsi="Calibri" w:cs="Calibri"/>
-          <w:color w:val="333333"/>
-          <w:sz w:val="22"/>
-          <w:szCs w:val="22"/>
-        </w:rPr>
-        <w:t>4. Frontend (Arquitetura de Componentes, Estado e Páginas)</w:t>
-      </w:r>
-    </w:p>
-    <w:p>
-      <w:pPr>
-        <w:pStyle w:val="PargrafodaLista"/>
-        <w:numPr>
-          <w:ilvl w:val="0"/>
-          <w:numId w:val="1"/>
-        </w:numPr>
-        <w:spacing w:before="60" w:after="60"/>
-      </w:pPr>
-      <w:r>
-        <w:rPr>
-          <w:rFonts w:ascii="Calibri" w:eastAsia="Calibri" w:hAnsi="Calibri" w:cs="Calibri"/>
-          <w:b/>
-          <w:bCs/>
-          <w:color w:val="333333"/>
-          <w:sz w:val="22"/>
-          <w:szCs w:val="22"/>
-        </w:rPr>
-        <w:t xml:space="preserve">Seção 5: </w:t>
-      </w:r>
-      <w:r>
-        <w:rPr>
-          <w:rFonts w:ascii="Calibri" w:eastAsia="Calibri" w:hAnsi="Calibri" w:cs="Calibri"/>
-          <w:color w:val="333333"/>
-          <w:sz w:val="22"/>
-          <w:szCs w:val="22"/>
-        </w:rPr>
-        <w:t>5. Regras de Negócio e Base de Conhecimento Corporativa</w:t>
-      </w:r>
-    </w:p>
-    <w:p>
-      <w:pPr>
-        <w:pStyle w:val="PargrafodaLista"/>
-        <w:numPr>
-          <w:ilvl w:val="0"/>
-          <w:numId w:val="1"/>
-        </w:numPr>
-        <w:spacing w:before="60" w:after="60"/>
-      </w:pPr>
-      <w:r>
-        <w:rPr>
-          <w:rFonts w:ascii="Calibri" w:eastAsia="Calibri" w:hAnsi="Calibri" w:cs="Calibri"/>
-          <w:b/>
-          <w:bCs/>
-          <w:color w:val="333333"/>
-          <w:sz w:val="22"/>
-          <w:szCs w:val="22"/>
-        </w:rPr>
-        <w:t xml:space="preserve">Seção 6: </w:t>
-      </w:r>
-      <w:r>
-        <w:rPr>
-          <w:rFonts w:ascii="Calibri" w:eastAsia="Calibri" w:hAnsi="Calibri" w:cs="Calibri"/>
-          <w:color w:val="333333"/>
-          <w:sz w:val="22"/>
-          <w:szCs w:val="22"/>
-        </w:rPr>
-        <w:t>6. Guia de Instalação, Migração e Implantação Local</w:t>
+        <w:rPr>
+          <w:rFonts w:ascii="Calibri" w:eastAsia="Calibri" w:hAnsi="Calibri" w:cs="Calibri"/>
+          <w:color w:val="333333"/>
+          <w:sz w:val="22"/>
+          <w:szCs w:val="22"/>
+        </w:rPr>
+      </w:pPr>
+      <w:r>
+        <w:rPr>
+          <w:rFonts w:ascii="Calibri" w:eastAsia="Calibri" w:hAnsi="Calibri" w:cs="Calibri"/>
+          <w:color w:val="333333"/>
+          <w:sz w:val="22"/>
+          <w:szCs w:val="22"/>
+        </w:rPr>
+        <w:t xml:space="preserve">Este documento detalha a arquitetura de software, a infraestrutura do </w:t>
+      </w:r>
+      <w:proofErr w:type="spellStart"/>
+      <w:r>
+        <w:rPr>
+          <w:rFonts w:ascii="Calibri" w:eastAsia="Calibri" w:hAnsi="Calibri" w:cs="Calibri"/>
+          <w:color w:val="333333"/>
+          <w:sz w:val="22"/>
+          <w:szCs w:val="22"/>
+        </w:rPr>
+        <w:t>backend</w:t>
+      </w:r>
+      <w:proofErr w:type="spellEnd"/>
+      <w:r>
+        <w:rPr>
+          <w:rFonts w:ascii="Calibri" w:eastAsia="Calibri" w:hAnsi="Calibri" w:cs="Calibri"/>
+          <w:color w:val="333333"/>
+          <w:sz w:val="22"/>
+          <w:szCs w:val="22"/>
+        </w:rPr>
+        <w:t xml:space="preserve"> e a interface do </w:t>
+      </w:r>
+      <w:proofErr w:type="spellStart"/>
+      <w:r>
+        <w:rPr>
+          <w:rFonts w:ascii="Calibri" w:eastAsia="Calibri" w:hAnsi="Calibri" w:cs="Calibri"/>
+          <w:color w:val="333333"/>
+          <w:sz w:val="22"/>
+          <w:szCs w:val="22"/>
+        </w:rPr>
+        <w:t>frontend</w:t>
+      </w:r>
+      <w:proofErr w:type="spellEnd"/>
+      <w:r>
+        <w:rPr>
+          <w:rFonts w:ascii="Calibri" w:eastAsia="Calibri" w:hAnsi="Calibri" w:cs="Calibri"/>
+          <w:color w:val="333333"/>
+          <w:sz w:val="22"/>
+          <w:szCs w:val="22"/>
+        </w:rPr>
+        <w:t xml:space="preserve"> do sistema Jobs IA, uma plataforma desenvolvida sob medida para a Dataprev. O sistema tem como foco a automação e simplificação na geração de checklists e comandos para execução de </w:t>
+      </w:r>
+      <w:proofErr w:type="spellStart"/>
+      <w:r>
+        <w:rPr>
+          <w:rFonts w:ascii="Calibri" w:eastAsia="Calibri" w:hAnsi="Calibri" w:cs="Calibri"/>
+          <w:color w:val="333333"/>
+          <w:sz w:val="22"/>
+          <w:szCs w:val="22"/>
+        </w:rPr>
+        <w:t>workloads</w:t>
+      </w:r>
+      <w:proofErr w:type="spellEnd"/>
+      <w:r>
+        <w:rPr>
+          <w:rFonts w:ascii="Calibri" w:eastAsia="Calibri" w:hAnsi="Calibri" w:cs="Calibri"/>
+          <w:color w:val="333333"/>
+          <w:sz w:val="22"/>
+          <w:szCs w:val="22"/>
+        </w:rPr>
+        <w:t xml:space="preserve"> (</w:t>
+      </w:r>
+      <w:proofErr w:type="spellStart"/>
+      <w:r>
+        <w:rPr>
+          <w:rFonts w:ascii="Calibri" w:eastAsia="Calibri" w:hAnsi="Calibri" w:cs="Calibri"/>
+          <w:color w:val="333333"/>
+          <w:sz w:val="22"/>
+          <w:szCs w:val="22"/>
+        </w:rPr>
+        <w:t>jobs</w:t>
+      </w:r>
+      <w:proofErr w:type="spellEnd"/>
+      <w:r>
+        <w:rPr>
+          <w:rFonts w:ascii="Calibri" w:eastAsia="Calibri" w:hAnsi="Calibri" w:cs="Calibri"/>
+          <w:color w:val="333333"/>
+          <w:sz w:val="22"/>
+          <w:szCs w:val="22"/>
+        </w:rPr>
+        <w:t>) de lote, utilizando inteligência artificial generativa baseada em processamento de linguagem natural.</w:t>
       </w:r>
     </w:p>
     <w:p>
@@ -2354,7 +2277,7 @@
         <w:keepNext/>
         <w:spacing w:before="240" w:after="120"/>
       </w:pPr>
-      <w:bookmarkStart w:id="3" w:name="_Toc233183121"/>
+      <w:bookmarkStart w:id="2" w:name="_Toc233183121"/>
       <w:r>
         <w:rPr>
           <w:rFonts w:ascii="Calibri" w:eastAsia="Calibri" w:hAnsi="Calibri" w:cs="Calibri"/>
@@ -2367,7 +2290,7 @@
         <w:lastRenderedPageBreak/>
         <w:t>1. Introdução e Contexto Geral do Negócio</w:t>
       </w:r>
-      <w:bookmarkEnd w:id="3"/>
+      <w:bookmarkEnd w:id="2"/>
     </w:p>
     <w:p>
       <w:pPr>
@@ -2381,7 +2304,47 @@
           <w:sz w:val="22"/>
           <w:szCs w:val="22"/>
         </w:rPr>
-        <w:t>O Jobs IA nasceu da necessidade de modernizar e mitigar erros humanos no processo manual de configuração de workloads (jobs) no ecossistema de processamento em lote da Dataprev. Tradicionalmente, analistas precisavam consultar longas normas técnicas e dicionários de dados específicos para preencher parâmetros detalhados de scripts complexos. Qualquer desvio nas regras de nomenclatura (como a Norma N/PD/004/02) ou a ausência de parâmetros obrigatórios resultava em falhas catastróficas na execução noturna dos lotes.</w:t>
+        <w:t xml:space="preserve">O Jobs IA nasceu da necessidade de modernizar e mitigar erros humanos no processo manual de configuração de </w:t>
+      </w:r>
+      <w:proofErr w:type="spellStart"/>
+      <w:r>
+        <w:rPr>
+          <w:rFonts w:ascii="Calibri" w:eastAsia="Calibri" w:hAnsi="Calibri" w:cs="Calibri"/>
+          <w:color w:val="333333"/>
+          <w:sz w:val="22"/>
+          <w:szCs w:val="22"/>
+        </w:rPr>
+        <w:t>workloads</w:t>
+      </w:r>
+      <w:proofErr w:type="spellEnd"/>
+      <w:r>
+        <w:rPr>
+          <w:rFonts w:ascii="Calibri" w:eastAsia="Calibri" w:hAnsi="Calibri" w:cs="Calibri"/>
+          <w:color w:val="333333"/>
+          <w:sz w:val="22"/>
+          <w:szCs w:val="22"/>
+        </w:rPr>
+        <w:t xml:space="preserve"> (</w:t>
+      </w:r>
+      <w:proofErr w:type="spellStart"/>
+      <w:r>
+        <w:rPr>
+          <w:rFonts w:ascii="Calibri" w:eastAsia="Calibri" w:hAnsi="Calibri" w:cs="Calibri"/>
+          <w:color w:val="333333"/>
+          <w:sz w:val="22"/>
+          <w:szCs w:val="22"/>
+        </w:rPr>
+        <w:t>jobs</w:t>
+      </w:r>
+      <w:proofErr w:type="spellEnd"/>
+      <w:r>
+        <w:rPr>
+          <w:rFonts w:ascii="Calibri" w:eastAsia="Calibri" w:hAnsi="Calibri" w:cs="Calibri"/>
+          <w:color w:val="333333"/>
+          <w:sz w:val="22"/>
+          <w:szCs w:val="22"/>
+        </w:rPr>
+        <w:t>) no ecossistema de processamento em lote da Dataprev. Tradicionalmente, analistas precisavam consultar longas normas técnicas e dicionários de dados específicos para preencher parâmetros detalhados de scripts complexos. Qualquer desvio nas regras de nomenclatura (como a Norma N/PD/004/02) ou a ausência de parâmetros obrigatórios resultava em falhas catastróficas na execução noturna dos lotes.</w:t>
       </w:r>
     </w:p>
     <w:p>
@@ -2396,7 +2359,27 @@
           <w:sz w:val="22"/>
           <w:szCs w:val="22"/>
         </w:rPr>
-        <w:t>Para solucionar este problema, o Jobs IA oferece uma interface conversacional inteligente. Por meio de um chat fluido conduzido por um agente cognitivo de IA, o usuário descreve suas necessidades de execução. O agente identifica o tipo de job adequado, faz perguntas sucessivas para coletar os parâmetros requeridos e opcionais, e no final compõe a linha de comando exata de execução técnica. Paralelamente, o sistema gera de forma automática um checklist homologável em formato PDF.</w:t>
+        <w:t xml:space="preserve">Para solucionar este problema, o Jobs IA oferece uma interface conversacional inteligente. Por meio de um chat fluido conduzido por um agente cognitivo de IA, o usuário descreve suas necessidades de execução. O agente identifica o tipo de </w:t>
+      </w:r>
+      <w:proofErr w:type="spellStart"/>
+      <w:r>
+        <w:rPr>
+          <w:rFonts w:ascii="Calibri" w:eastAsia="Calibri" w:hAnsi="Calibri" w:cs="Calibri"/>
+          <w:color w:val="333333"/>
+          <w:sz w:val="22"/>
+          <w:szCs w:val="22"/>
+        </w:rPr>
+        <w:t>job</w:t>
+      </w:r>
+      <w:proofErr w:type="spellEnd"/>
+      <w:r>
+        <w:rPr>
+          <w:rFonts w:ascii="Calibri" w:eastAsia="Calibri" w:hAnsi="Calibri" w:cs="Calibri"/>
+          <w:color w:val="333333"/>
+          <w:sz w:val="22"/>
+          <w:szCs w:val="22"/>
+        </w:rPr>
+        <w:t xml:space="preserve"> adequado, faz perguntas sucessivas para coletar os parâmetros requeridos e opcionais, e no final compõe a linha de comando exata de execução técnica. Paralelamente, o sistema gera de forma automática um checklist homologável em formato PDF.</w:t>
       </w:r>
     </w:p>
     <w:tbl>
@@ -2450,7 +2433,23 @@
                 <w:rFonts w:ascii="Calibri" w:eastAsia="Calibri" w:hAnsi="Calibri" w:cs="Calibri"/>
                 <w:color w:val="333333"/>
               </w:rPr>
-              <w:t>Reduzir o tempo médio de criação de comandos de workloads de horas para apenas alguns minutos, mantendo a conformidade total com as normas organizacionais de nomenclatura e taxonomia de dados.</w:t>
+              <w:t xml:space="preserve">Reduzir o tempo médio de criação de comandos de </w:t>
+            </w:r>
+            <w:proofErr w:type="spellStart"/>
+            <w:r>
+              <w:rPr>
+                <w:rFonts w:ascii="Calibri" w:eastAsia="Calibri" w:hAnsi="Calibri" w:cs="Calibri"/>
+                <w:color w:val="333333"/>
+              </w:rPr>
+              <w:t>workloads</w:t>
+            </w:r>
+            <w:proofErr w:type="spellEnd"/>
+            <w:r>
+              <w:rPr>
+                <w:rFonts w:ascii="Calibri" w:eastAsia="Calibri" w:hAnsi="Calibri" w:cs="Calibri"/>
+                <w:color w:val="333333"/>
+              </w:rPr>
+              <w:t xml:space="preserve"> de horas para apenas alguns minutos, mantendo a conformidade total com as normas organizacionais de nomenclatura e taxonomia de dados.</w:t>
             </w:r>
           </w:p>
         </w:tc>
@@ -2462,7 +2461,7 @@
         <w:keepNext/>
         <w:spacing w:before="240" w:after="120"/>
       </w:pPr>
-      <w:bookmarkStart w:id="4" w:name="_Toc233183122"/>
+      <w:bookmarkStart w:id="3" w:name="_Toc233183122"/>
       <w:r>
         <w:rPr>
           <w:rFonts w:ascii="Calibri" w:eastAsia="Calibri" w:hAnsi="Calibri" w:cs="Calibri"/>
@@ -2474,7 +2473,7 @@
         </w:rPr>
         <w:t>2. Arquitetura do Software e Infraestrutura</w:t>
       </w:r>
-      <w:bookmarkEnd w:id="4"/>
+      <w:bookmarkEnd w:id="3"/>
     </w:p>
     <w:p>
       <w:pPr>
@@ -2488,7 +2487,83 @@
           <w:sz w:val="22"/>
           <w:szCs w:val="22"/>
         </w:rPr>
-        <w:t>O Jobs IA adota uma arquitetura clássica baseada em cliente-servidor (SPA + API), focando na independência de camadas, facilidade de implantação local e desacoplamento de serviços externos. O sistema evoluiu de uma arquitetura legada baseada no ecossistema Supabase para uma stack self-hosted baseada em banco de dados relacional clássico e autenticação local própria.</w:t>
+        <w:t xml:space="preserve">O Jobs IA adota uma arquitetura clássica baseada em cliente-servidor (SPA + API), focando na independência de camadas, facilidade de implantação local e desacoplamento de serviços externos. O sistema </w:t>
+      </w:r>
+      <w:r>
+        <w:rPr>
+          <w:rFonts w:ascii="Calibri" w:eastAsia="Calibri" w:hAnsi="Calibri" w:cs="Calibri"/>
+          <w:color w:val="333333"/>
+          <w:sz w:val="22"/>
+          <w:szCs w:val="22"/>
+        </w:rPr>
+        <w:t>é baseado em</w:t>
+      </w:r>
+      <w:r>
+        <w:rPr>
+          <w:rFonts w:ascii="Calibri" w:eastAsia="Calibri" w:hAnsi="Calibri" w:cs="Calibri"/>
+          <w:color w:val="333333"/>
+          <w:sz w:val="22"/>
+          <w:szCs w:val="22"/>
+        </w:rPr>
+        <w:t xml:space="preserve"> uma </w:t>
+      </w:r>
+      <w:proofErr w:type="spellStart"/>
+      <w:r>
+        <w:rPr>
+          <w:rFonts w:ascii="Calibri" w:eastAsia="Calibri" w:hAnsi="Calibri" w:cs="Calibri"/>
+          <w:color w:val="333333"/>
+          <w:sz w:val="22"/>
+          <w:szCs w:val="22"/>
+        </w:rPr>
+        <w:t>stack</w:t>
+      </w:r>
+      <w:proofErr w:type="spellEnd"/>
+      <w:r>
+        <w:rPr>
+          <w:rFonts w:ascii="Calibri" w:eastAsia="Calibri" w:hAnsi="Calibri" w:cs="Calibri"/>
+          <w:color w:val="333333"/>
+          <w:sz w:val="22"/>
+          <w:szCs w:val="22"/>
+        </w:rPr>
+        <w:t xml:space="preserve"> self-</w:t>
+      </w:r>
+      <w:proofErr w:type="spellStart"/>
+      <w:r>
+        <w:rPr>
+          <w:rFonts w:ascii="Calibri" w:eastAsia="Calibri" w:hAnsi="Calibri" w:cs="Calibri"/>
+          <w:color w:val="333333"/>
+          <w:sz w:val="22"/>
+          <w:szCs w:val="22"/>
+        </w:rPr>
+        <w:t>hosted</w:t>
+      </w:r>
+      <w:proofErr w:type="spellEnd"/>
+      <w:r>
+        <w:rPr>
+          <w:rFonts w:ascii="Calibri" w:eastAsia="Calibri" w:hAnsi="Calibri" w:cs="Calibri"/>
+          <w:color w:val="333333"/>
+          <w:sz w:val="22"/>
+          <w:szCs w:val="22"/>
+        </w:rPr>
+        <w:t xml:space="preserve"> </w:t>
+      </w:r>
+      <w:r>
+        <w:rPr>
+          <w:rFonts w:ascii="Calibri" w:eastAsia="Calibri" w:hAnsi="Calibri" w:cs="Calibri"/>
+          <w:color w:val="333333"/>
+          <w:sz w:val="22"/>
+          <w:szCs w:val="22"/>
+        </w:rPr>
+        <w:t>co</w:t>
+      </w:r>
+      <w:r>
+        <w:rPr>
+          <w:rFonts w:ascii="Calibri" w:eastAsia="Calibri" w:hAnsi="Calibri" w:cs="Calibri"/>
+          <w:color w:val="333333"/>
+          <w:sz w:val="22"/>
+          <w:szCs w:val="22"/>
+        </w:rPr>
+        <w:t>m banco de dados relacional clássico e autenticação local própria.</w:t>
       </w:r>
     </w:p>
     <w:p>
@@ -2497,7 +2572,7 @@
         <w:keepNext/>
         <w:spacing w:before="240" w:after="120"/>
       </w:pPr>
-      <w:bookmarkStart w:id="5" w:name="_Toc233183123"/>
+      <w:bookmarkStart w:id="4" w:name="_Toc233183123"/>
       <w:r>
         <w:rPr>
           <w:rFonts w:ascii="Calibri" w:eastAsia="Calibri" w:hAnsi="Calibri" w:cs="Calibri"/>
@@ -2509,7 +2584,7 @@
         </w:rPr>
         <w:t>Fluxo de Dados e Comunicação das Camadas</w:t>
       </w:r>
-      <w:bookmarkEnd w:id="5"/>
+      <w:bookmarkEnd w:id="4"/>
     </w:p>
     <w:p>
       <w:pPr>
@@ -2542,7 +2617,47 @@
           <w:sz w:val="22"/>
           <w:szCs w:val="22"/>
         </w:rPr>
-        <w:t>O usuário interage com a interface SPA (React/Vite) enviando uma descrição de job ou configurando tabelas de conhecimento.</w:t>
+        <w:t>O usuário interage com a interface SPA (</w:t>
+      </w:r>
+      <w:proofErr w:type="spellStart"/>
+      <w:r>
+        <w:rPr>
+          <w:rFonts w:ascii="Calibri" w:eastAsia="Calibri" w:hAnsi="Calibri" w:cs="Calibri"/>
+          <w:color w:val="333333"/>
+          <w:sz w:val="22"/>
+          <w:szCs w:val="22"/>
+        </w:rPr>
+        <w:t>React</w:t>
+      </w:r>
+      <w:proofErr w:type="spellEnd"/>
+      <w:r>
+        <w:rPr>
+          <w:rFonts w:ascii="Calibri" w:eastAsia="Calibri" w:hAnsi="Calibri" w:cs="Calibri"/>
+          <w:color w:val="333333"/>
+          <w:sz w:val="22"/>
+          <w:szCs w:val="22"/>
+        </w:rPr>
+        <w:t xml:space="preserve">/Vite) enviando uma descrição de </w:t>
+      </w:r>
+      <w:proofErr w:type="spellStart"/>
+      <w:r>
+        <w:rPr>
+          <w:rFonts w:ascii="Calibri" w:eastAsia="Calibri" w:hAnsi="Calibri" w:cs="Calibri"/>
+          <w:color w:val="333333"/>
+          <w:sz w:val="22"/>
+          <w:szCs w:val="22"/>
+        </w:rPr>
+        <w:t>job</w:t>
+      </w:r>
+      <w:proofErr w:type="spellEnd"/>
+      <w:r>
+        <w:rPr>
+          <w:rFonts w:ascii="Calibri" w:eastAsia="Calibri" w:hAnsi="Calibri" w:cs="Calibri"/>
+          <w:color w:val="333333"/>
+          <w:sz w:val="22"/>
+          <w:szCs w:val="22"/>
+        </w:rPr>
+        <w:t xml:space="preserve"> ou configurando tabelas de conhecimento.</w:t>
       </w:r>
     </w:p>
     <w:p>
@@ -2561,7 +2676,67 @@
           <w:sz w:val="22"/>
           <w:szCs w:val="22"/>
         </w:rPr>
-        <w:t>O frontend se comunica exclusivamente com o servidor backend via requisições HTTP RESTful protegidas por tokens de autenticação (JWT).</w:t>
+        <w:t xml:space="preserve">O </w:t>
+      </w:r>
+      <w:proofErr w:type="spellStart"/>
+      <w:r>
+        <w:rPr>
+          <w:rFonts w:ascii="Calibri" w:eastAsia="Calibri" w:hAnsi="Calibri" w:cs="Calibri"/>
+          <w:color w:val="333333"/>
+          <w:sz w:val="22"/>
+          <w:szCs w:val="22"/>
+        </w:rPr>
+        <w:t>frontend</w:t>
+      </w:r>
+      <w:proofErr w:type="spellEnd"/>
+      <w:r>
+        <w:rPr>
+          <w:rFonts w:ascii="Calibri" w:eastAsia="Calibri" w:hAnsi="Calibri" w:cs="Calibri"/>
+          <w:color w:val="333333"/>
+          <w:sz w:val="22"/>
+          <w:szCs w:val="22"/>
+        </w:rPr>
+        <w:t xml:space="preserve"> se comunica exclusivamente com o servidor </w:t>
+      </w:r>
+      <w:proofErr w:type="spellStart"/>
+      <w:r>
+        <w:rPr>
+          <w:rFonts w:ascii="Calibri" w:eastAsia="Calibri" w:hAnsi="Calibri" w:cs="Calibri"/>
+          <w:color w:val="333333"/>
+          <w:sz w:val="22"/>
+          <w:szCs w:val="22"/>
+        </w:rPr>
+        <w:t>backend</w:t>
+      </w:r>
+      <w:proofErr w:type="spellEnd"/>
+      <w:r>
+        <w:rPr>
+          <w:rFonts w:ascii="Calibri" w:eastAsia="Calibri" w:hAnsi="Calibri" w:cs="Calibri"/>
+          <w:color w:val="333333"/>
+          <w:sz w:val="22"/>
+          <w:szCs w:val="22"/>
+        </w:rPr>
+        <w:t xml:space="preserve"> via requisições HTTP </w:t>
+      </w:r>
+      <w:proofErr w:type="spellStart"/>
+      <w:r>
+        <w:rPr>
+          <w:rFonts w:ascii="Calibri" w:eastAsia="Calibri" w:hAnsi="Calibri" w:cs="Calibri"/>
+          <w:color w:val="333333"/>
+          <w:sz w:val="22"/>
+          <w:szCs w:val="22"/>
+        </w:rPr>
+        <w:t>RESTful</w:t>
+      </w:r>
+      <w:proofErr w:type="spellEnd"/>
+      <w:r>
+        <w:rPr>
+          <w:rFonts w:ascii="Calibri" w:eastAsia="Calibri" w:hAnsi="Calibri" w:cs="Calibri"/>
+          <w:color w:val="333333"/>
+          <w:sz w:val="22"/>
+          <w:szCs w:val="22"/>
+        </w:rPr>
+        <w:t xml:space="preserve"> protegidas por tokens de autenticação (JWT).</w:t>
       </w:r>
     </w:p>
     <w:p>
@@ -2580,7 +2755,27 @@
           <w:sz w:val="22"/>
           <w:szCs w:val="22"/>
         </w:rPr>
-        <w:t>O servidor de backend gerencia a sessão, faz a persistência no banco de dados PostgreSQL e atua como um intermediário seguro para a LIA API (motor de Inteligência Artificial generativa).</w:t>
+        <w:t xml:space="preserve">O servidor de </w:t>
+      </w:r>
+      <w:proofErr w:type="spellStart"/>
+      <w:r>
+        <w:rPr>
+          <w:rFonts w:ascii="Calibri" w:eastAsia="Calibri" w:hAnsi="Calibri" w:cs="Calibri"/>
+          <w:color w:val="333333"/>
+          <w:sz w:val="22"/>
+          <w:szCs w:val="22"/>
+        </w:rPr>
+        <w:t>backend</w:t>
+      </w:r>
+      <w:proofErr w:type="spellEnd"/>
+      <w:r>
+        <w:rPr>
+          <w:rFonts w:ascii="Calibri" w:eastAsia="Calibri" w:hAnsi="Calibri" w:cs="Calibri"/>
+          <w:color w:val="333333"/>
+          <w:sz w:val="22"/>
+          <w:szCs w:val="22"/>
+        </w:rPr>
+        <w:t xml:space="preserve"> gerencia a sessão, faz a persistência no banco de dados PostgreSQL e atua como um intermediário seguro para a LIA API (motor de Inteligência Artificial generativa).</w:t>
       </w:r>
     </w:p>
     <w:p>
@@ -2599,7 +2794,47 @@
           <w:sz w:val="22"/>
           <w:szCs w:val="22"/>
         </w:rPr>
-        <w:t>O backend adiciona de forma transparente o contexto ativo do banco de dados (prompts customizados, termos de dicionário e normas válidas) e encapsula no payload enviado à LIA API.</w:t>
+        <w:t xml:space="preserve">O </w:t>
+      </w:r>
+      <w:proofErr w:type="spellStart"/>
+      <w:r>
+        <w:rPr>
+          <w:rFonts w:ascii="Calibri" w:eastAsia="Calibri" w:hAnsi="Calibri" w:cs="Calibri"/>
+          <w:color w:val="333333"/>
+          <w:sz w:val="22"/>
+          <w:szCs w:val="22"/>
+        </w:rPr>
+        <w:t>backend</w:t>
+      </w:r>
+      <w:proofErr w:type="spellEnd"/>
+      <w:r>
+        <w:rPr>
+          <w:rFonts w:ascii="Calibri" w:eastAsia="Calibri" w:hAnsi="Calibri" w:cs="Calibri"/>
+          <w:color w:val="333333"/>
+          <w:sz w:val="22"/>
+          <w:szCs w:val="22"/>
+        </w:rPr>
+        <w:t xml:space="preserve"> adiciona de forma transparente o contexto ativo do banco de dados (prompts customizados, termos de dicionário e normas válidas) e encapsula no </w:t>
+      </w:r>
+      <w:proofErr w:type="spellStart"/>
+      <w:r>
+        <w:rPr>
+          <w:rFonts w:ascii="Calibri" w:eastAsia="Calibri" w:hAnsi="Calibri" w:cs="Calibri"/>
+          <w:color w:val="333333"/>
+          <w:sz w:val="22"/>
+          <w:szCs w:val="22"/>
+        </w:rPr>
+        <w:t>payload</w:t>
+      </w:r>
+      <w:proofErr w:type="spellEnd"/>
+      <w:r>
+        <w:rPr>
+          <w:rFonts w:ascii="Calibri" w:eastAsia="Calibri" w:hAnsi="Calibri" w:cs="Calibri"/>
+          <w:color w:val="333333"/>
+          <w:sz w:val="22"/>
+          <w:szCs w:val="22"/>
+        </w:rPr>
+        <w:t xml:space="preserve"> enviado à LIA API.</w:t>
       </w:r>
     </w:p>
     <w:p>
@@ -2618,7 +2853,67 @@
           <w:sz w:val="22"/>
           <w:szCs w:val="22"/>
         </w:rPr>
-        <w:t>A LIA API responde usando Function Calling ('generate_checklist'), que por sua vez é detectada pelo frontend e aciona a geração automatizada de scripts e relatórios em PDF locais.</w:t>
+        <w:t xml:space="preserve">A LIA API responde usando </w:t>
+      </w:r>
+      <w:proofErr w:type="spellStart"/>
+      <w:r>
+        <w:rPr>
+          <w:rFonts w:ascii="Calibri" w:eastAsia="Calibri" w:hAnsi="Calibri" w:cs="Calibri"/>
+          <w:color w:val="333333"/>
+          <w:sz w:val="22"/>
+          <w:szCs w:val="22"/>
+        </w:rPr>
+        <w:t>Function</w:t>
+      </w:r>
+      <w:proofErr w:type="spellEnd"/>
+      <w:r>
+        <w:rPr>
+          <w:rFonts w:ascii="Calibri" w:eastAsia="Calibri" w:hAnsi="Calibri" w:cs="Calibri"/>
+          <w:color w:val="333333"/>
+          <w:sz w:val="22"/>
+          <w:szCs w:val="22"/>
+        </w:rPr>
+        <w:t xml:space="preserve"> Calling ('</w:t>
+      </w:r>
+      <w:proofErr w:type="spellStart"/>
+      <w:r>
+        <w:rPr>
+          <w:rFonts w:ascii="Calibri" w:eastAsia="Calibri" w:hAnsi="Calibri" w:cs="Calibri"/>
+          <w:color w:val="333333"/>
+          <w:sz w:val="22"/>
+          <w:szCs w:val="22"/>
+        </w:rPr>
+        <w:t>generate_checklist</w:t>
+      </w:r>
+      <w:proofErr w:type="spellEnd"/>
+      <w:r>
+        <w:rPr>
+          <w:rFonts w:ascii="Calibri" w:eastAsia="Calibri" w:hAnsi="Calibri" w:cs="Calibri"/>
+          <w:color w:val="333333"/>
+          <w:sz w:val="22"/>
+          <w:szCs w:val="22"/>
+        </w:rPr>
+        <w:t xml:space="preserve">'), que por sua vez é detectada pelo </w:t>
+      </w:r>
+      <w:proofErr w:type="spellStart"/>
+      <w:r>
+        <w:rPr>
+          <w:rFonts w:ascii="Calibri" w:eastAsia="Calibri" w:hAnsi="Calibri" w:cs="Calibri"/>
+          <w:color w:val="333333"/>
+          <w:sz w:val="22"/>
+          <w:szCs w:val="22"/>
+        </w:rPr>
+        <w:t>frontend</w:t>
+      </w:r>
+      <w:proofErr w:type="spellEnd"/>
+      <w:r>
+        <w:rPr>
+          <w:rFonts w:ascii="Calibri" w:eastAsia="Calibri" w:hAnsi="Calibri" w:cs="Calibri"/>
+          <w:color w:val="333333"/>
+          <w:sz w:val="22"/>
+          <w:szCs w:val="22"/>
+        </w:rPr>
+        <w:t xml:space="preserve"> e aciona a geração automatizada de scripts e relatórios em PDF locais.</w:t>
       </w:r>
     </w:p>
     <w:p>
@@ -2627,7 +2922,7 @@
         <w:keepNext/>
         <w:spacing w:before="240" w:after="120"/>
       </w:pPr>
-      <w:bookmarkStart w:id="6" w:name="_Toc233183124"/>
+      <w:bookmarkStart w:id="5" w:name="_Toc233183124"/>
       <w:r>
         <w:rPr>
           <w:rFonts w:ascii="Calibri" w:eastAsia="Calibri" w:hAnsi="Calibri" w:cs="Calibri"/>
@@ -2639,7 +2934,7 @@
         </w:rPr>
         <w:t>Modelo de Segurança e Controle de Acesso</w:t>
       </w:r>
-      <w:bookmarkEnd w:id="6"/>
+      <w:bookmarkEnd w:id="5"/>
     </w:p>
     <w:p>
       <w:pPr>
@@ -2653,7 +2948,54 @@
           <w:sz w:val="22"/>
           <w:szCs w:val="22"/>
         </w:rPr>
-        <w:t>Originalmente o sistema dependia do Supabase RLS (Row Level Security) e do Supabase Auth. Na versão atual (JobsIA 2.0), toda a segurança foi movida para o servidor de backend:</w:t>
+        <w:t>T</w:t>
+      </w:r>
+      <w:r>
+        <w:rPr>
+          <w:rFonts w:ascii="Calibri" w:eastAsia="Calibri" w:hAnsi="Calibri" w:cs="Calibri"/>
+          <w:color w:val="333333"/>
+          <w:sz w:val="22"/>
+          <w:szCs w:val="22"/>
+        </w:rPr>
+        <w:t xml:space="preserve">oda a segurança </w:t>
+      </w:r>
+      <w:r>
+        <w:rPr>
+          <w:rFonts w:ascii="Calibri" w:eastAsia="Calibri" w:hAnsi="Calibri" w:cs="Calibri"/>
+          <w:color w:val="333333"/>
+          <w:sz w:val="22"/>
+          <w:szCs w:val="22"/>
+        </w:rPr>
+        <w:t>da aplicação é gerenciada pel</w:t>
+      </w:r>
+      <w:r>
+        <w:rPr>
+          <w:rFonts w:ascii="Calibri" w:eastAsia="Calibri" w:hAnsi="Calibri" w:cs="Calibri"/>
+          <w:color w:val="333333"/>
+          <w:sz w:val="22"/>
+          <w:szCs w:val="22"/>
+        </w:rPr>
+        <w:t xml:space="preserve">o servidor de </w:t>
+      </w:r>
+      <w:proofErr w:type="spellStart"/>
+      <w:r>
+        <w:rPr>
+          <w:rFonts w:ascii="Calibri" w:eastAsia="Calibri" w:hAnsi="Calibri" w:cs="Calibri"/>
+          <w:color w:val="333333"/>
+          <w:sz w:val="22"/>
+          <w:szCs w:val="22"/>
+        </w:rPr>
+        <w:t>backend</w:t>
+      </w:r>
+      <w:proofErr w:type="spellEnd"/>
+      <w:r>
+        <w:rPr>
+          <w:rFonts w:ascii="Calibri" w:eastAsia="Calibri" w:hAnsi="Calibri" w:cs="Calibri"/>
+          <w:color w:val="333333"/>
+          <w:sz w:val="22"/>
+          <w:szCs w:val="22"/>
+        </w:rPr>
+        <w:t>:</w:t>
       </w:r>
     </w:p>
     <w:p>
@@ -2672,8 +3014,27 @@
           <w:sz w:val="22"/>
           <w:szCs w:val="22"/>
         </w:rPr>
-        <w:lastRenderedPageBreak/>
-        <w:t>Autenticação local utilizando senhas criptografadas através do algoritmo bcryptjs.</w:t>
+        <w:t xml:space="preserve">Autenticação local utilizando senhas criptografadas através do algoritmo </w:t>
+      </w:r>
+      <w:proofErr w:type="spellStart"/>
+      <w:r>
+        <w:rPr>
+          <w:rFonts w:ascii="Calibri" w:eastAsia="Calibri" w:hAnsi="Calibri" w:cs="Calibri"/>
+          <w:color w:val="333333"/>
+          <w:sz w:val="22"/>
+          <w:szCs w:val="22"/>
+        </w:rPr>
+        <w:t>bcryptjs</w:t>
+      </w:r>
+      <w:proofErr w:type="spellEnd"/>
+      <w:r>
+        <w:rPr>
+          <w:rFonts w:ascii="Calibri" w:eastAsia="Calibri" w:hAnsi="Calibri" w:cs="Calibri"/>
+          <w:color w:val="333333"/>
+          <w:sz w:val="22"/>
+          <w:szCs w:val="22"/>
+        </w:rPr>
+        <w:t>.</w:t>
       </w:r>
     </w:p>
     <w:p>
@@ -2692,7 +3053,28 @@
           <w:sz w:val="22"/>
           <w:szCs w:val="22"/>
         </w:rPr>
-        <w:t>Sessões controladas por JSON Web Tokens (JWT) trafegados no cabeçalho Authorization das requisições REST.</w:t>
+        <w:lastRenderedPageBreak/>
+        <w:t xml:space="preserve">Sessões controladas por JSON Web Tokens (JWT) trafegados no cabeçalho </w:t>
+      </w:r>
+      <w:proofErr w:type="spellStart"/>
+      <w:r>
+        <w:rPr>
+          <w:rFonts w:ascii="Calibri" w:eastAsia="Calibri" w:hAnsi="Calibri" w:cs="Calibri"/>
+          <w:color w:val="333333"/>
+          <w:sz w:val="22"/>
+          <w:szCs w:val="22"/>
+        </w:rPr>
+        <w:t>Authorization</w:t>
+      </w:r>
+      <w:proofErr w:type="spellEnd"/>
+      <w:r>
+        <w:rPr>
+          <w:rFonts w:ascii="Calibri" w:eastAsia="Calibri" w:hAnsi="Calibri" w:cs="Calibri"/>
+          <w:color w:val="333333"/>
+          <w:sz w:val="22"/>
+          <w:szCs w:val="22"/>
+        </w:rPr>
+        <w:t xml:space="preserve"> das requisições REST.</w:t>
       </w:r>
     </w:p>
     <w:p>
@@ -2711,7 +3093,34 @@
           <w:sz w:val="22"/>
           <w:szCs w:val="22"/>
         </w:rPr>
-        <w:t>O RLS do banco de dados PostgreSQL foi desabilitado, e a validação de escopo e propriedade dos dados (como checklists específicos de usuários) passou a ser validada nas rotas do Express via middleware.</w:t>
+        <w:t>A</w:t>
+      </w:r>
+      <w:r>
+        <w:rPr>
+          <w:rFonts w:ascii="Calibri" w:eastAsia="Calibri" w:hAnsi="Calibri" w:cs="Calibri"/>
+          <w:color w:val="333333"/>
+          <w:sz w:val="22"/>
+          <w:szCs w:val="22"/>
+        </w:rPr>
+        <w:t xml:space="preserve"> validação de escopo e propriedade dos dados (como checklists específicos de usuários) </w:t>
+      </w:r>
+      <w:r>
+        <w:rPr>
+          <w:rFonts w:ascii="Calibri" w:eastAsia="Calibri" w:hAnsi="Calibri" w:cs="Calibri"/>
+          <w:color w:val="333333"/>
+          <w:sz w:val="22"/>
+          <w:szCs w:val="22"/>
+        </w:rPr>
+        <w:t>é realiz</w:t>
+      </w:r>
+      <w:r>
+        <w:rPr>
+          <w:rFonts w:ascii="Calibri" w:eastAsia="Calibri" w:hAnsi="Calibri" w:cs="Calibri"/>
+          <w:color w:val="333333"/>
+          <w:sz w:val="22"/>
+          <w:szCs w:val="22"/>
+        </w:rPr>
+        <w:t>ada nas rotas do Express via middleware.</w:t>
       </w:r>
     </w:p>
     <w:p>
@@ -2725,7 +3134,7 @@
         <w:keepNext/>
         <w:spacing w:before="240" w:after="120"/>
       </w:pPr>
-      <w:bookmarkStart w:id="7" w:name="_Toc233183125"/>
+      <w:bookmarkStart w:id="6" w:name="_Toc233183125"/>
       <w:r>
         <w:rPr>
           <w:rFonts w:ascii="Calibri" w:eastAsia="Calibri" w:hAnsi="Calibri" w:cs="Calibri"/>
@@ -2736,9 +3145,57 @@
           <w:szCs w:val="36"/>
         </w:rPr>
         <w:lastRenderedPageBreak/>
-        <w:t>3. Backend (Express, TypeScript e PostgreSQL)</w:t>
-      </w:r>
-      <w:bookmarkEnd w:id="7"/>
+        <w:t xml:space="preserve">3. </w:t>
+      </w:r>
+      <w:proofErr w:type="spellStart"/>
+      <w:r>
+        <w:rPr>
+          <w:rFonts w:ascii="Calibri" w:eastAsia="Calibri" w:hAnsi="Calibri" w:cs="Calibri"/>
+          <w:b/>
+          <w:bCs/>
+          <w:color w:val="1B365D"/>
+          <w:sz w:val="36"/>
+          <w:szCs w:val="36"/>
+        </w:rPr>
+        <w:t>Backend</w:t>
+      </w:r>
+      <w:proofErr w:type="spellEnd"/>
+      <w:r>
+        <w:rPr>
+          <w:rFonts w:ascii="Calibri" w:eastAsia="Calibri" w:hAnsi="Calibri" w:cs="Calibri"/>
+          <w:b/>
+          <w:bCs/>
+          <w:color w:val="1B365D"/>
+          <w:sz w:val="36"/>
+          <w:szCs w:val="36"/>
+        </w:rPr>
+        <w:t xml:space="preserve"> (Express, </w:t>
+      </w:r>
+      <w:proofErr w:type="spellStart"/>
+      <w:r>
+        <w:rPr>
+          <w:rFonts w:ascii="Calibri" w:eastAsia="Calibri" w:hAnsi="Calibri" w:cs="Calibri"/>
+          <w:b/>
+          <w:bCs/>
+          <w:color w:val="1B365D"/>
+          <w:sz w:val="36"/>
+          <w:szCs w:val="36"/>
+        </w:rPr>
+        <w:t>TypeScript</w:t>
+      </w:r>
+      <w:proofErr w:type="spellEnd"/>
+      <w:r>
+        <w:rPr>
+          <w:rFonts w:ascii="Calibri" w:eastAsia="Calibri" w:hAnsi="Calibri" w:cs="Calibri"/>
+          <w:b/>
+          <w:bCs/>
+          <w:color w:val="1B365D"/>
+          <w:sz w:val="36"/>
+          <w:szCs w:val="36"/>
+        </w:rPr>
+        <w:t xml:space="preserve"> e PostgreSQL)</w:t>
+      </w:r>
+      <w:bookmarkEnd w:id="6"/>
     </w:p>
     <w:p>
       <w:pPr>
@@ -2752,7 +3209,47 @@
           <w:sz w:val="22"/>
           <w:szCs w:val="22"/>
         </w:rPr>
-        <w:t>O servidor backend está estruturado em Node.js com TypeScript e Express. Ele centraliza o processamento das rotas, conexão com o banco de dados e proxy de comunicação com o serviço de LLM (LIA API).</w:t>
+        <w:t xml:space="preserve">O servidor </w:t>
+      </w:r>
+      <w:proofErr w:type="spellStart"/>
+      <w:r>
+        <w:rPr>
+          <w:rFonts w:ascii="Calibri" w:eastAsia="Calibri" w:hAnsi="Calibri" w:cs="Calibri"/>
+          <w:color w:val="333333"/>
+          <w:sz w:val="22"/>
+          <w:szCs w:val="22"/>
+        </w:rPr>
+        <w:t>backend</w:t>
+      </w:r>
+      <w:proofErr w:type="spellEnd"/>
+      <w:r>
+        <w:rPr>
+          <w:rFonts w:ascii="Calibri" w:eastAsia="Calibri" w:hAnsi="Calibri" w:cs="Calibri"/>
+          <w:color w:val="333333"/>
+          <w:sz w:val="22"/>
+          <w:szCs w:val="22"/>
+        </w:rPr>
+        <w:t xml:space="preserve"> está estruturado em Node.js com </w:t>
+      </w:r>
+      <w:proofErr w:type="spellStart"/>
+      <w:r>
+        <w:rPr>
+          <w:rFonts w:ascii="Calibri" w:eastAsia="Calibri" w:hAnsi="Calibri" w:cs="Calibri"/>
+          <w:color w:val="333333"/>
+          <w:sz w:val="22"/>
+          <w:szCs w:val="22"/>
+        </w:rPr>
+        <w:t>TypeScript</w:t>
+      </w:r>
+      <w:proofErr w:type="spellEnd"/>
+      <w:r>
+        <w:rPr>
+          <w:rFonts w:ascii="Calibri" w:eastAsia="Calibri" w:hAnsi="Calibri" w:cs="Calibri"/>
+          <w:color w:val="333333"/>
+          <w:sz w:val="22"/>
+          <w:szCs w:val="22"/>
+        </w:rPr>
+        <w:t xml:space="preserve"> e Express. Ele centraliza o processamento das rotas, conexão com o banco de dados e proxy de comunicação com o serviço de LLM (LIA API).</w:t>
       </w:r>
     </w:p>
     <w:p>
@@ -2761,7 +3258,7 @@
         <w:keepNext/>
         <w:spacing w:before="240" w:after="120"/>
       </w:pPr>
-      <w:bookmarkStart w:id="8" w:name="_Toc233183126"/>
+      <w:bookmarkStart w:id="7" w:name="_Toc233183126"/>
       <w:r>
         <w:rPr>
           <w:rFonts w:ascii="Calibri" w:eastAsia="Calibri" w:hAnsi="Calibri" w:cs="Calibri"/>
@@ -2771,9 +3268,22 @@
           <w:sz w:val="28"/>
           <w:szCs w:val="28"/>
         </w:rPr>
-        <w:t>Arquitetura de Diretórios - Backend</w:t>
-      </w:r>
-      <w:bookmarkEnd w:id="8"/>
+        <w:t xml:space="preserve">Arquitetura de Diretórios - </w:t>
+      </w:r>
+      <w:proofErr w:type="spellStart"/>
+      <w:r>
+        <w:rPr>
+          <w:rFonts w:ascii="Calibri" w:eastAsia="Calibri" w:hAnsi="Calibri" w:cs="Calibri"/>
+          <w:b/>
+          <w:bCs/>
+          <w:color w:val="1B365D"/>
+          <w:sz w:val="28"/>
+          <w:szCs w:val="28"/>
+        </w:rPr>
+        <w:t>Backend</w:t>
+      </w:r>
+      <w:bookmarkEnd w:id="7"/>
+      <w:proofErr w:type="spellEnd"/>
     </w:p>
     <w:p>
       <w:pPr>
@@ -2787,7 +3297,27 @@
           <w:sz w:val="22"/>
           <w:szCs w:val="22"/>
         </w:rPr>
-        <w:t>As fontes do servidor estão organizadas sob a pasta /server do projeto, contendo a seguinte estrutura de arquivos:</w:t>
+        <w:t>As fontes do servidor estão organizadas sob a pasta /</w:t>
+      </w:r>
+      <w:proofErr w:type="gramStart"/>
+      <w:r>
+        <w:rPr>
+          <w:rFonts w:ascii="Calibri" w:eastAsia="Calibri" w:hAnsi="Calibri" w:cs="Calibri"/>
+          <w:color w:val="333333"/>
+          <w:sz w:val="22"/>
+          <w:szCs w:val="22"/>
+        </w:rPr>
+        <w:t>server</w:t>
+      </w:r>
+      <w:proofErr w:type="gramEnd"/>
+      <w:r>
+        <w:rPr>
+          <w:rFonts w:ascii="Calibri" w:eastAsia="Calibri" w:hAnsi="Calibri" w:cs="Calibri"/>
+          <w:color w:val="333333"/>
+          <w:sz w:val="22"/>
+          <w:szCs w:val="22"/>
+        </w:rPr>
+        <w:t xml:space="preserve"> do projeto, contendo a seguinte estrutura de arquivos:</w:t>
       </w:r>
     </w:p>
     <w:tbl>
@@ -2888,13 +3418,31 @@
             <w:pPr>
               <w:spacing w:before="40" w:after="40"/>
             </w:pPr>
+            <w:proofErr w:type="gramStart"/>
             <w:r>
               <w:rPr>
                 <w:rFonts w:ascii="Calibri" w:eastAsia="Calibri" w:hAnsi="Calibri" w:cs="Calibri"/>
                 <w:color w:val="333333"/>
               </w:rPr>
-              <w:t>server/index.ts</w:t>
+              <w:t>server</w:t>
             </w:r>
+            <w:proofErr w:type="gramEnd"/>
+            <w:r>
+              <w:rPr>
+                <w:rFonts w:ascii="Calibri" w:eastAsia="Calibri" w:hAnsi="Calibri" w:cs="Calibri"/>
+                <w:color w:val="333333"/>
+              </w:rPr>
+              <w:t>/</w:t>
+            </w:r>
+            <w:proofErr w:type="spellStart"/>
+            <w:r>
+              <w:rPr>
+                <w:rFonts w:ascii="Calibri" w:eastAsia="Calibri" w:hAnsi="Calibri" w:cs="Calibri"/>
+                <w:color w:val="333333"/>
+              </w:rPr>
+              <w:t>index.ts</w:t>
+            </w:r>
+            <w:proofErr w:type="spellEnd"/>
           </w:p>
         </w:tc>
         <w:tc>
@@ -2923,7 +3471,23 @@
                 <w:rFonts w:ascii="Calibri" w:eastAsia="Calibri" w:hAnsi="Calibri" w:cs="Calibri"/>
                 <w:color w:val="333333"/>
               </w:rPr>
-              <w:t>Ponto de entrada do backend. Inicializa o Express, CORS, middlewares globais e registra as rotas da API.</w:t>
+              <w:t xml:space="preserve">Ponto de entrada do </w:t>
+            </w:r>
+            <w:proofErr w:type="spellStart"/>
+            <w:r>
+              <w:rPr>
+                <w:rFonts w:ascii="Calibri" w:eastAsia="Calibri" w:hAnsi="Calibri" w:cs="Calibri"/>
+                <w:color w:val="333333"/>
+              </w:rPr>
+              <w:t>backend</w:t>
+            </w:r>
+            <w:proofErr w:type="spellEnd"/>
+            <w:r>
+              <w:rPr>
+                <w:rFonts w:ascii="Calibri" w:eastAsia="Calibri" w:hAnsi="Calibri" w:cs="Calibri"/>
+                <w:color w:val="333333"/>
+              </w:rPr>
+              <w:t>. Inicializa o Express, CORS, middlewares globais e registra as rotas da API.</w:t>
             </w:r>
           </w:p>
         </w:tc>
@@ -2953,13 +3517,31 @@
             <w:pPr>
               <w:spacing w:before="40" w:after="40"/>
             </w:pPr>
+            <w:proofErr w:type="gramStart"/>
             <w:r>
               <w:rPr>
                 <w:rFonts w:ascii="Calibri" w:eastAsia="Calibri" w:hAnsi="Calibri" w:cs="Calibri"/>
                 <w:color w:val="333333"/>
               </w:rPr>
-              <w:t>server/db.ts</w:t>
+              <w:t>server</w:t>
             </w:r>
+            <w:proofErr w:type="gramEnd"/>
+            <w:r>
+              <w:rPr>
+                <w:rFonts w:ascii="Calibri" w:eastAsia="Calibri" w:hAnsi="Calibri" w:cs="Calibri"/>
+                <w:color w:val="333333"/>
+              </w:rPr>
+              <w:t>/</w:t>
+            </w:r>
+            <w:proofErr w:type="spellStart"/>
+            <w:r>
+              <w:rPr>
+                <w:rFonts w:ascii="Calibri" w:eastAsia="Calibri" w:hAnsi="Calibri" w:cs="Calibri"/>
+                <w:color w:val="333333"/>
+              </w:rPr>
+              <w:t>db.ts</w:t>
+            </w:r>
+            <w:proofErr w:type="spellEnd"/>
           </w:p>
         </w:tc>
         <w:tc>
@@ -3018,13 +3600,31 @@
             <w:pPr>
               <w:spacing w:before="40" w:after="40"/>
             </w:pPr>
+            <w:proofErr w:type="gramStart"/>
             <w:r>
               <w:rPr>
                 <w:rFonts w:ascii="Calibri" w:eastAsia="Calibri" w:hAnsi="Calibri" w:cs="Calibri"/>
                 <w:color w:val="333333"/>
               </w:rPr>
-              <w:t>server/middleware/auth.ts</w:t>
+              <w:t>server</w:t>
             </w:r>
+            <w:proofErr w:type="gramEnd"/>
+            <w:r>
+              <w:rPr>
+                <w:rFonts w:ascii="Calibri" w:eastAsia="Calibri" w:hAnsi="Calibri" w:cs="Calibri"/>
+                <w:color w:val="333333"/>
+              </w:rPr>
+              <w:t>/middleware/</w:t>
+            </w:r>
+            <w:proofErr w:type="spellStart"/>
+            <w:r>
+              <w:rPr>
+                <w:rFonts w:ascii="Calibri" w:eastAsia="Calibri" w:hAnsi="Calibri" w:cs="Calibri"/>
+                <w:color w:val="333333"/>
+              </w:rPr>
+              <w:t>auth.ts</w:t>
+            </w:r>
+            <w:proofErr w:type="spellEnd"/>
           </w:p>
         </w:tc>
         <w:tc>
@@ -3053,7 +3653,23 @@
                 <w:rFonts w:ascii="Calibri" w:eastAsia="Calibri" w:hAnsi="Calibri" w:cs="Calibri"/>
                 <w:color w:val="333333"/>
               </w:rPr>
-              <w:t>Middleware requireAuth responsável por decodificar os tokens JWT e proteger as rotas restritas.</w:t>
+              <w:t xml:space="preserve">Middleware </w:t>
+            </w:r>
+            <w:proofErr w:type="spellStart"/>
+            <w:r>
+              <w:rPr>
+                <w:rFonts w:ascii="Calibri" w:eastAsia="Calibri" w:hAnsi="Calibri" w:cs="Calibri"/>
+                <w:color w:val="333333"/>
+              </w:rPr>
+              <w:t>requireAuth</w:t>
+            </w:r>
+            <w:proofErr w:type="spellEnd"/>
+            <w:r>
+              <w:rPr>
+                <w:rFonts w:ascii="Calibri" w:eastAsia="Calibri" w:hAnsi="Calibri" w:cs="Calibri"/>
+                <w:color w:val="333333"/>
+              </w:rPr>
+              <w:t xml:space="preserve"> responsável por decodificar os tokens JWT e proteger as rotas restritas.</w:t>
             </w:r>
           </w:p>
         </w:tc>
@@ -3083,13 +3699,47 @@
             <w:pPr>
               <w:spacing w:before="40" w:after="40"/>
             </w:pPr>
+            <w:proofErr w:type="gramStart"/>
             <w:r>
               <w:rPr>
                 <w:rFonts w:ascii="Calibri" w:eastAsia="Calibri" w:hAnsi="Calibri" w:cs="Calibri"/>
                 <w:color w:val="333333"/>
               </w:rPr>
-              <w:t>server/routes/auth.ts</w:t>
+              <w:t>server</w:t>
             </w:r>
+            <w:proofErr w:type="gramEnd"/>
+            <w:r>
+              <w:rPr>
+                <w:rFonts w:ascii="Calibri" w:eastAsia="Calibri" w:hAnsi="Calibri" w:cs="Calibri"/>
+                <w:color w:val="333333"/>
+              </w:rPr>
+              <w:t>/</w:t>
+            </w:r>
+            <w:proofErr w:type="spellStart"/>
+            <w:r>
+              <w:rPr>
+                <w:rFonts w:ascii="Calibri" w:eastAsia="Calibri" w:hAnsi="Calibri" w:cs="Calibri"/>
+                <w:color w:val="333333"/>
+              </w:rPr>
+              <w:t>routes</w:t>
+            </w:r>
+            <w:proofErr w:type="spellEnd"/>
+            <w:r>
+              <w:rPr>
+                <w:rFonts w:ascii="Calibri" w:eastAsia="Calibri" w:hAnsi="Calibri" w:cs="Calibri"/>
+                <w:color w:val="333333"/>
+              </w:rPr>
+              <w:t>/</w:t>
+            </w:r>
+            <w:proofErr w:type="spellStart"/>
+            <w:r>
+              <w:rPr>
+                <w:rFonts w:ascii="Calibri" w:eastAsia="Calibri" w:hAnsi="Calibri" w:cs="Calibri"/>
+                <w:color w:val="333333"/>
+              </w:rPr>
+              <w:t>auth.ts</w:t>
+            </w:r>
+            <w:proofErr w:type="spellEnd"/>
           </w:p>
         </w:tc>
         <w:tc>
@@ -3118,7 +3768,23 @@
                 <w:rFonts w:ascii="Calibri" w:eastAsia="Calibri" w:hAnsi="Calibri" w:cs="Calibri"/>
                 <w:color w:val="333333"/>
               </w:rPr>
-              <w:t>Implementa as rotas de cadastro de novos usuários (/signup) e validação de login (/login).</w:t>
+              <w:t>Implementa as rotas de cadastro de novos usuários (/</w:t>
+            </w:r>
+            <w:proofErr w:type="spellStart"/>
+            <w:r>
+              <w:rPr>
+                <w:rFonts w:ascii="Calibri" w:eastAsia="Calibri" w:hAnsi="Calibri" w:cs="Calibri"/>
+                <w:color w:val="333333"/>
+              </w:rPr>
+              <w:t>signup</w:t>
+            </w:r>
+            <w:proofErr w:type="spellEnd"/>
+            <w:r>
+              <w:rPr>
+                <w:rFonts w:ascii="Calibri" w:eastAsia="Calibri" w:hAnsi="Calibri" w:cs="Calibri"/>
+                <w:color w:val="333333"/>
+              </w:rPr>
+              <w:t>) e validação de login (/login).</w:t>
             </w:r>
           </w:p>
         </w:tc>
@@ -3148,13 +3814,47 @@
             <w:pPr>
               <w:spacing w:before="40" w:after="40"/>
             </w:pPr>
+            <w:proofErr w:type="gramStart"/>
             <w:r>
               <w:rPr>
                 <w:rFonts w:ascii="Calibri" w:eastAsia="Calibri" w:hAnsi="Calibri" w:cs="Calibri"/>
                 <w:color w:val="333333"/>
               </w:rPr>
-              <w:t>server/routes/users.ts</w:t>
+              <w:t>server</w:t>
             </w:r>
+            <w:proofErr w:type="gramEnd"/>
+            <w:r>
+              <w:rPr>
+                <w:rFonts w:ascii="Calibri" w:eastAsia="Calibri" w:hAnsi="Calibri" w:cs="Calibri"/>
+                <w:color w:val="333333"/>
+              </w:rPr>
+              <w:t>/</w:t>
+            </w:r>
+            <w:proofErr w:type="spellStart"/>
+            <w:r>
+              <w:rPr>
+                <w:rFonts w:ascii="Calibri" w:eastAsia="Calibri" w:hAnsi="Calibri" w:cs="Calibri"/>
+                <w:color w:val="333333"/>
+              </w:rPr>
+              <w:t>routes</w:t>
+            </w:r>
+            <w:proofErr w:type="spellEnd"/>
+            <w:r>
+              <w:rPr>
+                <w:rFonts w:ascii="Calibri" w:eastAsia="Calibri" w:hAnsi="Calibri" w:cs="Calibri"/>
+                <w:color w:val="333333"/>
+              </w:rPr>
+              <w:t>/</w:t>
+            </w:r>
+            <w:proofErr w:type="spellStart"/>
+            <w:r>
+              <w:rPr>
+                <w:rFonts w:ascii="Calibri" w:eastAsia="Calibri" w:hAnsi="Calibri" w:cs="Calibri"/>
+                <w:color w:val="333333"/>
+              </w:rPr>
+              <w:t>users.ts</w:t>
+            </w:r>
+            <w:proofErr w:type="spellEnd"/>
           </w:p>
         </w:tc>
         <w:tc>
@@ -3213,13 +3913,47 @@
             <w:pPr>
               <w:spacing w:before="40" w:after="40"/>
             </w:pPr>
+            <w:proofErr w:type="gramStart"/>
             <w:r>
               <w:rPr>
                 <w:rFonts w:ascii="Calibri" w:eastAsia="Calibri" w:hAnsi="Calibri" w:cs="Calibri"/>
                 <w:color w:val="333333"/>
               </w:rPr>
-              <w:t>server/routes/jobs.ts</w:t>
+              <w:t>server</w:t>
             </w:r>
+            <w:proofErr w:type="gramEnd"/>
+            <w:r>
+              <w:rPr>
+                <w:rFonts w:ascii="Calibri" w:eastAsia="Calibri" w:hAnsi="Calibri" w:cs="Calibri"/>
+                <w:color w:val="333333"/>
+              </w:rPr>
+              <w:t>/</w:t>
+            </w:r>
+            <w:proofErr w:type="spellStart"/>
+            <w:r>
+              <w:rPr>
+                <w:rFonts w:ascii="Calibri" w:eastAsia="Calibri" w:hAnsi="Calibri" w:cs="Calibri"/>
+                <w:color w:val="333333"/>
+              </w:rPr>
+              <w:t>routes</w:t>
+            </w:r>
+            <w:proofErr w:type="spellEnd"/>
+            <w:r>
+              <w:rPr>
+                <w:rFonts w:ascii="Calibri" w:eastAsia="Calibri" w:hAnsi="Calibri" w:cs="Calibri"/>
+                <w:color w:val="333333"/>
+              </w:rPr>
+              <w:t>/</w:t>
+            </w:r>
+            <w:proofErr w:type="spellStart"/>
+            <w:r>
+              <w:rPr>
+                <w:rFonts w:ascii="Calibri" w:eastAsia="Calibri" w:hAnsi="Calibri" w:cs="Calibri"/>
+                <w:color w:val="333333"/>
+              </w:rPr>
+              <w:t>jobs.ts</w:t>
+            </w:r>
+            <w:proofErr w:type="spellEnd"/>
           </w:p>
         </w:tc>
         <w:tc>
@@ -3278,13 +4012,47 @@
             <w:pPr>
               <w:spacing w:before="40" w:after="40"/>
             </w:pPr>
+            <w:proofErr w:type="gramStart"/>
             <w:r>
               <w:rPr>
                 <w:rFonts w:ascii="Calibri" w:eastAsia="Calibri" w:hAnsi="Calibri" w:cs="Calibri"/>
                 <w:color w:val="333333"/>
               </w:rPr>
-              <w:t>server/routes/checklists.ts</w:t>
+              <w:t>server</w:t>
             </w:r>
+            <w:proofErr w:type="gramEnd"/>
+            <w:r>
+              <w:rPr>
+                <w:rFonts w:ascii="Calibri" w:eastAsia="Calibri" w:hAnsi="Calibri" w:cs="Calibri"/>
+                <w:color w:val="333333"/>
+              </w:rPr>
+              <w:t>/</w:t>
+            </w:r>
+            <w:proofErr w:type="spellStart"/>
+            <w:r>
+              <w:rPr>
+                <w:rFonts w:ascii="Calibri" w:eastAsia="Calibri" w:hAnsi="Calibri" w:cs="Calibri"/>
+                <w:color w:val="333333"/>
+              </w:rPr>
+              <w:t>routes</w:t>
+            </w:r>
+            <w:proofErr w:type="spellEnd"/>
+            <w:r>
+              <w:rPr>
+                <w:rFonts w:ascii="Calibri" w:eastAsia="Calibri" w:hAnsi="Calibri" w:cs="Calibri"/>
+                <w:color w:val="333333"/>
+              </w:rPr>
+              <w:t>/</w:t>
+            </w:r>
+            <w:proofErr w:type="spellStart"/>
+            <w:r>
+              <w:rPr>
+                <w:rFonts w:ascii="Calibri" w:eastAsia="Calibri" w:hAnsi="Calibri" w:cs="Calibri"/>
+                <w:color w:val="333333"/>
+              </w:rPr>
+              <w:t>checklists.ts</w:t>
+            </w:r>
+            <w:proofErr w:type="spellEnd"/>
           </w:p>
         </w:tc>
         <w:tc>
@@ -3343,13 +4111,47 @@
             <w:pPr>
               <w:spacing w:before="40" w:after="40"/>
             </w:pPr>
+            <w:proofErr w:type="gramStart"/>
             <w:r>
               <w:rPr>
                 <w:rFonts w:ascii="Calibri" w:eastAsia="Calibri" w:hAnsi="Calibri" w:cs="Calibri"/>
                 <w:color w:val="333333"/>
               </w:rPr>
-              <w:t>server/routes/norms.ts</w:t>
+              <w:t>server</w:t>
             </w:r>
+            <w:proofErr w:type="gramEnd"/>
+            <w:r>
+              <w:rPr>
+                <w:rFonts w:ascii="Calibri" w:eastAsia="Calibri" w:hAnsi="Calibri" w:cs="Calibri"/>
+                <w:color w:val="333333"/>
+              </w:rPr>
+              <w:t>/</w:t>
+            </w:r>
+            <w:proofErr w:type="spellStart"/>
+            <w:r>
+              <w:rPr>
+                <w:rFonts w:ascii="Calibri" w:eastAsia="Calibri" w:hAnsi="Calibri" w:cs="Calibri"/>
+                <w:color w:val="333333"/>
+              </w:rPr>
+              <w:t>routes</w:t>
+            </w:r>
+            <w:proofErr w:type="spellEnd"/>
+            <w:r>
+              <w:rPr>
+                <w:rFonts w:ascii="Calibri" w:eastAsia="Calibri" w:hAnsi="Calibri" w:cs="Calibri"/>
+                <w:color w:val="333333"/>
+              </w:rPr>
+              <w:t>/</w:t>
+            </w:r>
+            <w:proofErr w:type="spellStart"/>
+            <w:r>
+              <w:rPr>
+                <w:rFonts w:ascii="Calibri" w:eastAsia="Calibri" w:hAnsi="Calibri" w:cs="Calibri"/>
+                <w:color w:val="333333"/>
+              </w:rPr>
+              <w:t>norms.ts</w:t>
+            </w:r>
+            <w:proofErr w:type="spellEnd"/>
           </w:p>
         </w:tc>
         <w:tc>
@@ -3408,13 +4210,47 @@
             <w:pPr>
               <w:spacing w:before="40" w:after="40"/>
             </w:pPr>
+            <w:proofErr w:type="gramStart"/>
             <w:r>
               <w:rPr>
                 <w:rFonts w:ascii="Calibri" w:eastAsia="Calibri" w:hAnsi="Calibri" w:cs="Calibri"/>
                 <w:color w:val="333333"/>
               </w:rPr>
-              <w:t>server/routes/dictionary.ts</w:t>
+              <w:t>server</w:t>
             </w:r>
+            <w:proofErr w:type="gramEnd"/>
+            <w:r>
+              <w:rPr>
+                <w:rFonts w:ascii="Calibri" w:eastAsia="Calibri" w:hAnsi="Calibri" w:cs="Calibri"/>
+                <w:color w:val="333333"/>
+              </w:rPr>
+              <w:t>/</w:t>
+            </w:r>
+            <w:proofErr w:type="spellStart"/>
+            <w:r>
+              <w:rPr>
+                <w:rFonts w:ascii="Calibri" w:eastAsia="Calibri" w:hAnsi="Calibri" w:cs="Calibri"/>
+                <w:color w:val="333333"/>
+              </w:rPr>
+              <w:t>routes</w:t>
+            </w:r>
+            <w:proofErr w:type="spellEnd"/>
+            <w:r>
+              <w:rPr>
+                <w:rFonts w:ascii="Calibri" w:eastAsia="Calibri" w:hAnsi="Calibri" w:cs="Calibri"/>
+                <w:color w:val="333333"/>
+              </w:rPr>
+              <w:t>/</w:t>
+            </w:r>
+            <w:proofErr w:type="spellStart"/>
+            <w:r>
+              <w:rPr>
+                <w:rFonts w:ascii="Calibri" w:eastAsia="Calibri" w:hAnsi="Calibri" w:cs="Calibri"/>
+                <w:color w:val="333333"/>
+              </w:rPr>
+              <w:t>dictionary.ts</w:t>
+            </w:r>
+            <w:proofErr w:type="spellEnd"/>
           </w:p>
         </w:tc>
         <w:tc>
@@ -3473,13 +4309,47 @@
             <w:pPr>
               <w:spacing w:before="40" w:after="40"/>
             </w:pPr>
+            <w:proofErr w:type="gramStart"/>
             <w:r>
               <w:rPr>
                 <w:rFonts w:ascii="Calibri" w:eastAsia="Calibri" w:hAnsi="Calibri" w:cs="Calibri"/>
                 <w:color w:val="333333"/>
               </w:rPr>
-              <w:t>server/routes/systemPrompts.ts</w:t>
+              <w:t>server</w:t>
             </w:r>
+            <w:proofErr w:type="gramEnd"/>
+            <w:r>
+              <w:rPr>
+                <w:rFonts w:ascii="Calibri" w:eastAsia="Calibri" w:hAnsi="Calibri" w:cs="Calibri"/>
+                <w:color w:val="333333"/>
+              </w:rPr>
+              <w:t>/</w:t>
+            </w:r>
+            <w:proofErr w:type="spellStart"/>
+            <w:r>
+              <w:rPr>
+                <w:rFonts w:ascii="Calibri" w:eastAsia="Calibri" w:hAnsi="Calibri" w:cs="Calibri"/>
+                <w:color w:val="333333"/>
+              </w:rPr>
+              <w:t>routes</w:t>
+            </w:r>
+            <w:proofErr w:type="spellEnd"/>
+            <w:r>
+              <w:rPr>
+                <w:rFonts w:ascii="Calibri" w:eastAsia="Calibri" w:hAnsi="Calibri" w:cs="Calibri"/>
+                <w:color w:val="333333"/>
+              </w:rPr>
+              <w:t>/</w:t>
+            </w:r>
+            <w:proofErr w:type="spellStart"/>
+            <w:r>
+              <w:rPr>
+                <w:rFonts w:ascii="Calibri" w:eastAsia="Calibri" w:hAnsi="Calibri" w:cs="Calibri"/>
+                <w:color w:val="333333"/>
+              </w:rPr>
+              <w:t>systemPrompts.ts</w:t>
+            </w:r>
+            <w:proofErr w:type="spellEnd"/>
           </w:p>
         </w:tc>
         <w:tc>
@@ -3538,13 +4408,56 @@
             <w:pPr>
               <w:spacing w:before="40" w:after="40"/>
             </w:pPr>
+            <w:proofErr w:type="gramStart"/>
             <w:r>
               <w:rPr>
                 <w:rFonts w:ascii="Calibri" w:eastAsia="Calibri" w:hAnsi="Calibri" w:cs="Calibri"/>
                 <w:color w:val="333333"/>
               </w:rPr>
-              <w:t>server/routes/ai.ts</w:t>
+              <w:t>server</w:t>
             </w:r>
+            <w:proofErr w:type="gramEnd"/>
+            <w:r>
+              <w:rPr>
+                <w:rFonts w:ascii="Calibri" w:eastAsia="Calibri" w:hAnsi="Calibri" w:cs="Calibri"/>
+                <w:color w:val="333333"/>
+              </w:rPr>
+              <w:t>/</w:t>
+            </w:r>
+            <w:proofErr w:type="spellStart"/>
+            <w:r>
+              <w:rPr>
+                <w:rFonts w:ascii="Calibri" w:eastAsia="Calibri" w:hAnsi="Calibri" w:cs="Calibri"/>
+                <w:color w:val="333333"/>
+              </w:rPr>
+              <w:t>routes</w:t>
+            </w:r>
+            <w:proofErr w:type="spellEnd"/>
+            <w:r>
+              <w:rPr>
+                <w:rFonts w:ascii="Calibri" w:eastAsia="Calibri" w:hAnsi="Calibri" w:cs="Calibri"/>
+                <w:color w:val="333333"/>
+              </w:rPr>
+              <w:t>/</w:t>
+            </w:r>
+            <w:proofErr w:type="spellStart"/>
+            <w:proofErr w:type="gramStart"/>
+            <w:r>
+              <w:rPr>
+                <w:rFonts w:ascii="Calibri" w:eastAsia="Calibri" w:hAnsi="Calibri" w:cs="Calibri"/>
+                <w:color w:val="333333"/>
+              </w:rPr>
+              <w:t>ai</w:t>
+            </w:r>
+            <w:proofErr w:type="gramEnd"/>
+            <w:r>
+              <w:rPr>
+                <w:rFonts w:ascii="Calibri" w:eastAsia="Calibri" w:hAnsi="Calibri" w:cs="Calibri"/>
+                <w:color w:val="333333"/>
+              </w:rPr>
+              <w:t>.ts</w:t>
+            </w:r>
+            <w:proofErr w:type="spellEnd"/>
           </w:p>
         </w:tc>
         <w:tc>
@@ -3585,7 +4498,7 @@
         <w:keepNext/>
         <w:spacing w:before="240" w:after="120"/>
       </w:pPr>
-      <w:bookmarkStart w:id="9" w:name="_Toc233183127"/>
+      <w:bookmarkStart w:id="8" w:name="_Toc233183127"/>
       <w:r>
         <w:rPr>
           <w:rFonts w:ascii="Calibri" w:eastAsia="Calibri" w:hAnsi="Calibri" w:cs="Calibri"/>
@@ -3597,7 +4510,7 @@
         </w:rPr>
         <w:t>Modelagem de Dados e Esquema Físico (PostgreSQL)</w:t>
       </w:r>
-      <w:bookmarkEnd w:id="9"/>
+      <w:bookmarkEnd w:id="8"/>
     </w:p>
     <w:p>
       <w:pPr>
@@ -3611,7 +4524,27 @@
           <w:sz w:val="22"/>
           <w:szCs w:val="22"/>
         </w:rPr>
-        <w:t>A estrutura física do banco de dados é gerida por scripts SQL locais de migração (/migrations). A seguir, estão listadas as tabelas e suas respectivas modelagens:</w:t>
+        <w:t>A estrutura física do banco de dados é gerida por scripts SQL locais de migração (/</w:t>
+      </w:r>
+      <w:proofErr w:type="spellStart"/>
+      <w:r>
+        <w:rPr>
+          <w:rFonts w:ascii="Calibri" w:eastAsia="Calibri" w:hAnsi="Calibri" w:cs="Calibri"/>
+          <w:color w:val="333333"/>
+          <w:sz w:val="22"/>
+          <w:szCs w:val="22"/>
+        </w:rPr>
+        <w:t>migrations</w:t>
+      </w:r>
+      <w:proofErr w:type="spellEnd"/>
+      <w:r>
+        <w:rPr>
+          <w:rFonts w:ascii="Calibri" w:eastAsia="Calibri" w:hAnsi="Calibri" w:cs="Calibri"/>
+          <w:color w:val="333333"/>
+          <w:sz w:val="22"/>
+          <w:szCs w:val="22"/>
+        </w:rPr>
+        <w:t>). A seguir, estão listadas as tabelas e suas respectivas modelagens:</w:t>
       </w:r>
     </w:p>
     <w:p>
@@ -3623,14 +4556,65 @@
         </w:numPr>
         <w:spacing w:before="60" w:after="60"/>
       </w:pPr>
-      <w:r>
-        <w:rPr>
-          <w:rFonts w:ascii="Calibri" w:eastAsia="Calibri" w:hAnsi="Calibri" w:cs="Calibri"/>
-          <w:color w:val="333333"/>
-          <w:sz w:val="22"/>
-          <w:szCs w:val="22"/>
-        </w:rPr>
-        <w:t>users: ID (UUID), Email (TEXT, único), Password Hash (TEXT) e Data de Criação.</w:t>
+      <w:proofErr w:type="spellStart"/>
+      <w:r>
+        <w:rPr>
+          <w:rFonts w:ascii="Calibri" w:eastAsia="Calibri" w:hAnsi="Calibri" w:cs="Calibri"/>
+          <w:color w:val="333333"/>
+          <w:sz w:val="22"/>
+          <w:szCs w:val="22"/>
+        </w:rPr>
+        <w:t>users</w:t>
+      </w:r>
+      <w:proofErr w:type="spellEnd"/>
+      <w:r>
+        <w:rPr>
+          <w:rFonts w:ascii="Calibri" w:eastAsia="Calibri" w:hAnsi="Calibri" w:cs="Calibri"/>
+          <w:color w:val="333333"/>
+          <w:sz w:val="22"/>
+          <w:szCs w:val="22"/>
+        </w:rPr>
+        <w:t xml:space="preserve">: ID (UUID), Email (TEXT, único), </w:t>
+      </w:r>
+      <w:proofErr w:type="spellStart"/>
+      <w:r>
+        <w:rPr>
+          <w:rFonts w:ascii="Calibri" w:eastAsia="Calibri" w:hAnsi="Calibri" w:cs="Calibri"/>
+          <w:color w:val="333333"/>
+          <w:sz w:val="22"/>
+          <w:szCs w:val="22"/>
+        </w:rPr>
+        <w:t>Password</w:t>
+      </w:r>
+      <w:proofErr w:type="spellEnd"/>
+      <w:r>
+        <w:rPr>
+          <w:rFonts w:ascii="Calibri" w:eastAsia="Calibri" w:hAnsi="Calibri" w:cs="Calibri"/>
+          <w:color w:val="333333"/>
+          <w:sz w:val="22"/>
+          <w:szCs w:val="22"/>
+        </w:rPr>
+        <w:t xml:space="preserve"> </w:t>
+      </w:r>
+      <w:proofErr w:type="spellStart"/>
+      <w:r>
+        <w:rPr>
+          <w:rFonts w:ascii="Calibri" w:eastAsia="Calibri" w:hAnsi="Calibri" w:cs="Calibri"/>
+          <w:color w:val="333333"/>
+          <w:sz w:val="22"/>
+          <w:szCs w:val="22"/>
+        </w:rPr>
+        <w:t>Hash</w:t>
+      </w:r>
+      <w:proofErr w:type="spellEnd"/>
+      <w:r>
+        <w:rPr>
+          <w:rFonts w:ascii="Calibri" w:eastAsia="Calibri" w:hAnsi="Calibri" w:cs="Calibri"/>
+          <w:color w:val="333333"/>
+          <w:sz w:val="22"/>
+          <w:szCs w:val="22"/>
+        </w:rPr>
+        <w:t xml:space="preserve"> (TEXT) e Data de Criação.</w:t>
       </w:r>
     </w:p>
     <w:p>
@@ -3642,6 +4626,7 @@
         </w:numPr>
         <w:spacing w:before="60" w:after="60"/>
       </w:pPr>
+      <w:proofErr w:type="spellStart"/>
       <w:r>
         <w:rPr>
           <w:rFonts w:ascii="Calibri" w:eastAsia="Calibri" w:hAnsi="Calibri" w:cs="Calibri"/>
@@ -3650,7 +4635,77 @@
           <w:szCs w:val="22"/>
         </w:rPr>
         <w:lastRenderedPageBreak/>
-        <w:t>JobsIA_profiles: ID (UUID), User ID (UUID, chave estrangeira de users), Name (TEXT), Email (TEXT).</w:t>
+        <w:t>JobsIA_profiles</w:t>
+      </w:r>
+      <w:proofErr w:type="spellEnd"/>
+      <w:r>
+        <w:rPr>
+          <w:rFonts w:ascii="Calibri" w:eastAsia="Calibri" w:hAnsi="Calibri" w:cs="Calibri"/>
+          <w:color w:val="333333"/>
+          <w:sz w:val="22"/>
+          <w:szCs w:val="22"/>
+        </w:rPr>
+        <w:t xml:space="preserve">: ID (UUID), </w:t>
+      </w:r>
+      <w:proofErr w:type="spellStart"/>
+      <w:r>
+        <w:rPr>
+          <w:rFonts w:ascii="Calibri" w:eastAsia="Calibri" w:hAnsi="Calibri" w:cs="Calibri"/>
+          <w:color w:val="333333"/>
+          <w:sz w:val="22"/>
+          <w:szCs w:val="22"/>
+        </w:rPr>
+        <w:t>User</w:t>
+      </w:r>
+      <w:proofErr w:type="spellEnd"/>
+      <w:r>
+        <w:rPr>
+          <w:rFonts w:ascii="Calibri" w:eastAsia="Calibri" w:hAnsi="Calibri" w:cs="Calibri"/>
+          <w:color w:val="333333"/>
+          <w:sz w:val="22"/>
+          <w:szCs w:val="22"/>
+        </w:rPr>
+        <w:t xml:space="preserve"> ID (UUID, chave estrangeira de </w:t>
+      </w:r>
+      <w:proofErr w:type="spellStart"/>
+      <w:r>
+        <w:rPr>
+          <w:rFonts w:ascii="Calibri" w:eastAsia="Calibri" w:hAnsi="Calibri" w:cs="Calibri"/>
+          <w:color w:val="333333"/>
+          <w:sz w:val="22"/>
+          <w:szCs w:val="22"/>
+        </w:rPr>
+        <w:t>users</w:t>
+      </w:r>
+      <w:proofErr w:type="spellEnd"/>
+      <w:r>
+        <w:rPr>
+          <w:rFonts w:ascii="Calibri" w:eastAsia="Calibri" w:hAnsi="Calibri" w:cs="Calibri"/>
+          <w:color w:val="333333"/>
+          <w:sz w:val="22"/>
+          <w:szCs w:val="22"/>
+        </w:rPr>
+        <w:t xml:space="preserve">), </w:t>
+      </w:r>
+      <w:proofErr w:type="spellStart"/>
+      <w:r>
+        <w:rPr>
+          <w:rFonts w:ascii="Calibri" w:eastAsia="Calibri" w:hAnsi="Calibri" w:cs="Calibri"/>
+          <w:color w:val="333333"/>
+          <w:sz w:val="22"/>
+          <w:szCs w:val="22"/>
+        </w:rPr>
+        <w:t>Name</w:t>
+      </w:r>
+      <w:proofErr w:type="spellEnd"/>
+      <w:r>
+        <w:rPr>
+          <w:rFonts w:ascii="Calibri" w:eastAsia="Calibri" w:hAnsi="Calibri" w:cs="Calibri"/>
+          <w:color w:val="333333"/>
+          <w:sz w:val="22"/>
+          <w:szCs w:val="22"/>
+        </w:rPr>
+        <w:t xml:space="preserve"> (TEXT), Email (TEXT).</w:t>
       </w:r>
     </w:p>
     <w:p>
@@ -3662,14 +4717,85 @@
         </w:numPr>
         <w:spacing w:before="60" w:after="60"/>
       </w:pPr>
-      <w:r>
-        <w:rPr>
-          <w:rFonts w:ascii="Calibri" w:eastAsia="Calibri" w:hAnsi="Calibri" w:cs="Calibri"/>
-          <w:color w:val="333333"/>
-          <w:sz w:val="22"/>
-          <w:szCs w:val="22"/>
-        </w:rPr>
-        <w:t>JobsIA_types: ID (INTEGER, identificador do tipo), Name (TEXT, nome descritivo), Script (TEXT, caminho do binário/shell), Description (TEXT).</w:t>
+      <w:proofErr w:type="spellStart"/>
+      <w:r>
+        <w:rPr>
+          <w:rFonts w:ascii="Calibri" w:eastAsia="Calibri" w:hAnsi="Calibri" w:cs="Calibri"/>
+          <w:color w:val="333333"/>
+          <w:sz w:val="22"/>
+          <w:szCs w:val="22"/>
+        </w:rPr>
+        <w:t>JobsIA_types</w:t>
+      </w:r>
+      <w:proofErr w:type="spellEnd"/>
+      <w:r>
+        <w:rPr>
+          <w:rFonts w:ascii="Calibri" w:eastAsia="Calibri" w:hAnsi="Calibri" w:cs="Calibri"/>
+          <w:color w:val="333333"/>
+          <w:sz w:val="22"/>
+          <w:szCs w:val="22"/>
+        </w:rPr>
+        <w:t xml:space="preserve">: ID (INTEGER, identificador do tipo), </w:t>
+      </w:r>
+      <w:proofErr w:type="spellStart"/>
+      <w:r>
+        <w:rPr>
+          <w:rFonts w:ascii="Calibri" w:eastAsia="Calibri" w:hAnsi="Calibri" w:cs="Calibri"/>
+          <w:color w:val="333333"/>
+          <w:sz w:val="22"/>
+          <w:szCs w:val="22"/>
+        </w:rPr>
+        <w:t>Name</w:t>
+      </w:r>
+      <w:proofErr w:type="spellEnd"/>
+      <w:r>
+        <w:rPr>
+          <w:rFonts w:ascii="Calibri" w:eastAsia="Calibri" w:hAnsi="Calibri" w:cs="Calibri"/>
+          <w:color w:val="333333"/>
+          <w:sz w:val="22"/>
+          <w:szCs w:val="22"/>
+        </w:rPr>
+        <w:t xml:space="preserve"> (TEXT, nome descritivo), Script (TEXT, caminho do binário/</w:t>
+      </w:r>
+      <w:proofErr w:type="spellStart"/>
+      <w:r>
+        <w:rPr>
+          <w:rFonts w:ascii="Calibri" w:eastAsia="Calibri" w:hAnsi="Calibri" w:cs="Calibri"/>
+          <w:color w:val="333333"/>
+          <w:sz w:val="22"/>
+          <w:szCs w:val="22"/>
+        </w:rPr>
+        <w:t>shell</w:t>
+      </w:r>
+      <w:proofErr w:type="spellEnd"/>
+      <w:r>
+        <w:rPr>
+          <w:rFonts w:ascii="Calibri" w:eastAsia="Calibri" w:hAnsi="Calibri" w:cs="Calibri"/>
+          <w:color w:val="333333"/>
+          <w:sz w:val="22"/>
+          <w:szCs w:val="22"/>
+        </w:rPr>
+        <w:t xml:space="preserve">), </w:t>
+      </w:r>
+      <w:proofErr w:type="spellStart"/>
+      <w:r>
+        <w:rPr>
+          <w:rFonts w:ascii="Calibri" w:eastAsia="Calibri" w:hAnsi="Calibri" w:cs="Calibri"/>
+          <w:color w:val="333333"/>
+          <w:sz w:val="22"/>
+          <w:szCs w:val="22"/>
+        </w:rPr>
+        <w:t>Description</w:t>
+      </w:r>
+      <w:proofErr w:type="spellEnd"/>
+      <w:r>
+        <w:rPr>
+          <w:rFonts w:ascii="Calibri" w:eastAsia="Calibri" w:hAnsi="Calibri" w:cs="Calibri"/>
+          <w:color w:val="333333"/>
+          <w:sz w:val="22"/>
+          <w:szCs w:val="22"/>
+        </w:rPr>
+        <w:t xml:space="preserve"> (TEXT).</w:t>
       </w:r>
     </w:p>
     <w:p>
@@ -3681,14 +4807,305 @@
         </w:numPr>
         <w:spacing w:before="60" w:after="60"/>
       </w:pPr>
-      <w:r>
-        <w:rPr>
-          <w:rFonts w:ascii="Calibri" w:eastAsia="Calibri" w:hAnsi="Calibri" w:cs="Calibri"/>
-          <w:color w:val="333333"/>
-          <w:sz w:val="22"/>
-          <w:szCs w:val="22"/>
-        </w:rPr>
-        <w:t>JobsIA_parameters: ID (SERIAL), Job Type ID (INTEGER, FK para JobsIA_types), Name (TEXT), Data Type (TEXT, ex: date, string, number), Required (BOOLEAN), Default Value (TEXT), Example Value (TEXT), Order Index (INTEGER), Description (TEXT).</w:t>
+      <w:proofErr w:type="spellStart"/>
+      <w:r>
+        <w:rPr>
+          <w:rFonts w:ascii="Calibri" w:eastAsia="Calibri" w:hAnsi="Calibri" w:cs="Calibri"/>
+          <w:color w:val="333333"/>
+          <w:sz w:val="22"/>
+          <w:szCs w:val="22"/>
+        </w:rPr>
+        <w:t>JobsIA_parameters</w:t>
+      </w:r>
+      <w:proofErr w:type="spellEnd"/>
+      <w:r>
+        <w:rPr>
+          <w:rFonts w:ascii="Calibri" w:eastAsia="Calibri" w:hAnsi="Calibri" w:cs="Calibri"/>
+          <w:color w:val="333333"/>
+          <w:sz w:val="22"/>
+          <w:szCs w:val="22"/>
+        </w:rPr>
+        <w:t xml:space="preserve">: ID (SERIAL), </w:t>
+      </w:r>
+      <w:proofErr w:type="spellStart"/>
+      <w:r>
+        <w:rPr>
+          <w:rFonts w:ascii="Calibri" w:eastAsia="Calibri" w:hAnsi="Calibri" w:cs="Calibri"/>
+          <w:color w:val="333333"/>
+          <w:sz w:val="22"/>
+          <w:szCs w:val="22"/>
+        </w:rPr>
+        <w:t>Job</w:t>
+      </w:r>
+      <w:proofErr w:type="spellEnd"/>
+      <w:r>
+        <w:rPr>
+          <w:rFonts w:ascii="Calibri" w:eastAsia="Calibri" w:hAnsi="Calibri" w:cs="Calibri"/>
+          <w:color w:val="333333"/>
+          <w:sz w:val="22"/>
+          <w:szCs w:val="22"/>
+        </w:rPr>
+        <w:t xml:space="preserve"> </w:t>
+      </w:r>
+      <w:proofErr w:type="spellStart"/>
+      <w:r>
+        <w:rPr>
+          <w:rFonts w:ascii="Calibri" w:eastAsia="Calibri" w:hAnsi="Calibri" w:cs="Calibri"/>
+          <w:color w:val="333333"/>
+          <w:sz w:val="22"/>
+          <w:szCs w:val="22"/>
+        </w:rPr>
+        <w:t>Type</w:t>
+      </w:r>
+      <w:proofErr w:type="spellEnd"/>
+      <w:r>
+        <w:rPr>
+          <w:rFonts w:ascii="Calibri" w:eastAsia="Calibri" w:hAnsi="Calibri" w:cs="Calibri"/>
+          <w:color w:val="333333"/>
+          <w:sz w:val="22"/>
+          <w:szCs w:val="22"/>
+        </w:rPr>
+        <w:t xml:space="preserve"> ID (INTEGER, FK para </w:t>
+      </w:r>
+      <w:proofErr w:type="spellStart"/>
+      <w:r>
+        <w:rPr>
+          <w:rFonts w:ascii="Calibri" w:eastAsia="Calibri" w:hAnsi="Calibri" w:cs="Calibri"/>
+          <w:color w:val="333333"/>
+          <w:sz w:val="22"/>
+          <w:szCs w:val="22"/>
+        </w:rPr>
+        <w:t>JobsIA_types</w:t>
+      </w:r>
+      <w:proofErr w:type="spellEnd"/>
+      <w:r>
+        <w:rPr>
+          <w:rFonts w:ascii="Calibri" w:eastAsia="Calibri" w:hAnsi="Calibri" w:cs="Calibri"/>
+          <w:color w:val="333333"/>
+          <w:sz w:val="22"/>
+          <w:szCs w:val="22"/>
+        </w:rPr>
+        <w:t xml:space="preserve">), </w:t>
+      </w:r>
+      <w:proofErr w:type="spellStart"/>
+      <w:r>
+        <w:rPr>
+          <w:rFonts w:ascii="Calibri" w:eastAsia="Calibri" w:hAnsi="Calibri" w:cs="Calibri"/>
+          <w:color w:val="333333"/>
+          <w:sz w:val="22"/>
+          <w:szCs w:val="22"/>
+        </w:rPr>
+        <w:t>Name</w:t>
+      </w:r>
+      <w:proofErr w:type="spellEnd"/>
+      <w:r>
+        <w:rPr>
+          <w:rFonts w:ascii="Calibri" w:eastAsia="Calibri" w:hAnsi="Calibri" w:cs="Calibri"/>
+          <w:color w:val="333333"/>
+          <w:sz w:val="22"/>
+          <w:szCs w:val="22"/>
+        </w:rPr>
+        <w:t xml:space="preserve"> (TEXT), Data </w:t>
+      </w:r>
+      <w:proofErr w:type="spellStart"/>
+      <w:r>
+        <w:rPr>
+          <w:rFonts w:ascii="Calibri" w:eastAsia="Calibri" w:hAnsi="Calibri" w:cs="Calibri"/>
+          <w:color w:val="333333"/>
+          <w:sz w:val="22"/>
+          <w:szCs w:val="22"/>
+        </w:rPr>
+        <w:t>Type</w:t>
+      </w:r>
+      <w:proofErr w:type="spellEnd"/>
+      <w:r>
+        <w:rPr>
+          <w:rFonts w:ascii="Calibri" w:eastAsia="Calibri" w:hAnsi="Calibri" w:cs="Calibri"/>
+          <w:color w:val="333333"/>
+          <w:sz w:val="22"/>
+          <w:szCs w:val="22"/>
+        </w:rPr>
+        <w:t xml:space="preserve"> (TEXT, </w:t>
+      </w:r>
+      <w:proofErr w:type="spellStart"/>
+      <w:r>
+        <w:rPr>
+          <w:rFonts w:ascii="Calibri" w:eastAsia="Calibri" w:hAnsi="Calibri" w:cs="Calibri"/>
+          <w:color w:val="333333"/>
+          <w:sz w:val="22"/>
+          <w:szCs w:val="22"/>
+        </w:rPr>
+        <w:t>ex</w:t>
+      </w:r>
+      <w:proofErr w:type="spellEnd"/>
+      <w:r>
+        <w:rPr>
+          <w:rFonts w:ascii="Calibri" w:eastAsia="Calibri" w:hAnsi="Calibri" w:cs="Calibri"/>
+          <w:color w:val="333333"/>
+          <w:sz w:val="22"/>
+          <w:szCs w:val="22"/>
+        </w:rPr>
+        <w:t xml:space="preserve">: date, </w:t>
+      </w:r>
+      <w:proofErr w:type="spellStart"/>
+      <w:r>
+        <w:rPr>
+          <w:rFonts w:ascii="Calibri" w:eastAsia="Calibri" w:hAnsi="Calibri" w:cs="Calibri"/>
+          <w:color w:val="333333"/>
+          <w:sz w:val="22"/>
+          <w:szCs w:val="22"/>
+        </w:rPr>
+        <w:t>string</w:t>
+      </w:r>
+      <w:proofErr w:type="spellEnd"/>
+      <w:r>
+        <w:rPr>
+          <w:rFonts w:ascii="Calibri" w:eastAsia="Calibri" w:hAnsi="Calibri" w:cs="Calibri"/>
+          <w:color w:val="333333"/>
+          <w:sz w:val="22"/>
+          <w:szCs w:val="22"/>
+        </w:rPr>
+        <w:t xml:space="preserve">, </w:t>
+      </w:r>
+      <w:proofErr w:type="spellStart"/>
+      <w:r>
+        <w:rPr>
+          <w:rFonts w:ascii="Calibri" w:eastAsia="Calibri" w:hAnsi="Calibri" w:cs="Calibri"/>
+          <w:color w:val="333333"/>
+          <w:sz w:val="22"/>
+          <w:szCs w:val="22"/>
+        </w:rPr>
+        <w:t>number</w:t>
+      </w:r>
+      <w:proofErr w:type="spellEnd"/>
+      <w:r>
+        <w:rPr>
+          <w:rFonts w:ascii="Calibri" w:eastAsia="Calibri" w:hAnsi="Calibri" w:cs="Calibri"/>
+          <w:color w:val="333333"/>
+          <w:sz w:val="22"/>
+          <w:szCs w:val="22"/>
+        </w:rPr>
+        <w:t xml:space="preserve">), </w:t>
+      </w:r>
+      <w:proofErr w:type="spellStart"/>
+      <w:r>
+        <w:rPr>
+          <w:rFonts w:ascii="Calibri" w:eastAsia="Calibri" w:hAnsi="Calibri" w:cs="Calibri"/>
+          <w:color w:val="333333"/>
+          <w:sz w:val="22"/>
+          <w:szCs w:val="22"/>
+        </w:rPr>
+        <w:t>Required</w:t>
+      </w:r>
+      <w:proofErr w:type="spellEnd"/>
+      <w:r>
+        <w:rPr>
+          <w:rFonts w:ascii="Calibri" w:eastAsia="Calibri" w:hAnsi="Calibri" w:cs="Calibri"/>
+          <w:color w:val="333333"/>
+          <w:sz w:val="22"/>
+          <w:szCs w:val="22"/>
+        </w:rPr>
+        <w:t xml:space="preserve"> (BOOLEAN), Default </w:t>
+      </w:r>
+      <w:proofErr w:type="spellStart"/>
+      <w:r>
+        <w:rPr>
+          <w:rFonts w:ascii="Calibri" w:eastAsia="Calibri" w:hAnsi="Calibri" w:cs="Calibri"/>
+          <w:color w:val="333333"/>
+          <w:sz w:val="22"/>
+          <w:szCs w:val="22"/>
+        </w:rPr>
+        <w:t>Value</w:t>
+      </w:r>
+      <w:proofErr w:type="spellEnd"/>
+      <w:r>
+        <w:rPr>
+          <w:rFonts w:ascii="Calibri" w:eastAsia="Calibri" w:hAnsi="Calibri" w:cs="Calibri"/>
+          <w:color w:val="333333"/>
+          <w:sz w:val="22"/>
+          <w:szCs w:val="22"/>
+        </w:rPr>
+        <w:t xml:space="preserve"> (TEXT), </w:t>
+      </w:r>
+      <w:proofErr w:type="spellStart"/>
+      <w:r>
+        <w:rPr>
+          <w:rFonts w:ascii="Calibri" w:eastAsia="Calibri" w:hAnsi="Calibri" w:cs="Calibri"/>
+          <w:color w:val="333333"/>
+          <w:sz w:val="22"/>
+          <w:szCs w:val="22"/>
+        </w:rPr>
+        <w:t>Example</w:t>
+      </w:r>
+      <w:proofErr w:type="spellEnd"/>
+      <w:r>
+        <w:rPr>
+          <w:rFonts w:ascii="Calibri" w:eastAsia="Calibri" w:hAnsi="Calibri" w:cs="Calibri"/>
+          <w:color w:val="333333"/>
+          <w:sz w:val="22"/>
+          <w:szCs w:val="22"/>
+        </w:rPr>
+        <w:t xml:space="preserve"> </w:t>
+      </w:r>
+      <w:proofErr w:type="spellStart"/>
+      <w:r>
+        <w:rPr>
+          <w:rFonts w:ascii="Calibri" w:eastAsia="Calibri" w:hAnsi="Calibri" w:cs="Calibri"/>
+          <w:color w:val="333333"/>
+          <w:sz w:val="22"/>
+          <w:szCs w:val="22"/>
+        </w:rPr>
+        <w:t>Value</w:t>
+      </w:r>
+      <w:proofErr w:type="spellEnd"/>
+      <w:r>
+        <w:rPr>
+          <w:rFonts w:ascii="Calibri" w:eastAsia="Calibri" w:hAnsi="Calibri" w:cs="Calibri"/>
+          <w:color w:val="333333"/>
+          <w:sz w:val="22"/>
+          <w:szCs w:val="22"/>
+        </w:rPr>
+        <w:t xml:space="preserve"> (TEXT), </w:t>
+      </w:r>
+      <w:proofErr w:type="spellStart"/>
+      <w:r>
+        <w:rPr>
+          <w:rFonts w:ascii="Calibri" w:eastAsia="Calibri" w:hAnsi="Calibri" w:cs="Calibri"/>
+          <w:color w:val="333333"/>
+          <w:sz w:val="22"/>
+          <w:szCs w:val="22"/>
+        </w:rPr>
+        <w:t>Order</w:t>
+      </w:r>
+      <w:proofErr w:type="spellEnd"/>
+      <w:r>
+        <w:rPr>
+          <w:rFonts w:ascii="Calibri" w:eastAsia="Calibri" w:hAnsi="Calibri" w:cs="Calibri"/>
+          <w:color w:val="333333"/>
+          <w:sz w:val="22"/>
+          <w:szCs w:val="22"/>
+        </w:rPr>
+        <w:t xml:space="preserve"> Index (INTEGER), </w:t>
+      </w:r>
+      <w:proofErr w:type="spellStart"/>
+      <w:r>
+        <w:rPr>
+          <w:rFonts w:ascii="Calibri" w:eastAsia="Calibri" w:hAnsi="Calibri" w:cs="Calibri"/>
+          <w:color w:val="333333"/>
+          <w:sz w:val="22"/>
+          <w:szCs w:val="22"/>
+        </w:rPr>
+        <w:t>Description</w:t>
+      </w:r>
+      <w:proofErr w:type="spellEnd"/>
+      <w:r>
+        <w:rPr>
+          <w:rFonts w:ascii="Calibri" w:eastAsia="Calibri" w:hAnsi="Calibri" w:cs="Calibri"/>
+          <w:color w:val="333333"/>
+          <w:sz w:val="22"/>
+          <w:szCs w:val="22"/>
+        </w:rPr>
+        <w:t xml:space="preserve"> (TEXT).</w:t>
       </w:r>
     </w:p>
     <w:p>
@@ -3700,14 +5117,145 @@
         </w:numPr>
         <w:spacing w:before="60" w:after="60"/>
       </w:pPr>
-      <w:r>
-        <w:rPr>
-          <w:rFonts w:ascii="Calibri" w:eastAsia="Calibri" w:hAnsi="Calibri" w:cs="Calibri"/>
-          <w:color w:val="333333"/>
-          <w:sz w:val="22"/>
-          <w:szCs w:val="22"/>
-        </w:rPr>
-        <w:t>JobsIA_checklists: ID (SERIAL), Conversation ID (UUID), Type (TEXT), Data (JSONB com os dados do job), Status (TEXT), User ID (UUID), File Name (TEXT), Created At (TIMESTAMPTZ).</w:t>
+      <w:proofErr w:type="spellStart"/>
+      <w:r>
+        <w:rPr>
+          <w:rFonts w:ascii="Calibri" w:eastAsia="Calibri" w:hAnsi="Calibri" w:cs="Calibri"/>
+          <w:color w:val="333333"/>
+          <w:sz w:val="22"/>
+          <w:szCs w:val="22"/>
+        </w:rPr>
+        <w:t>JobsIA_checklists</w:t>
+      </w:r>
+      <w:proofErr w:type="spellEnd"/>
+      <w:r>
+        <w:rPr>
+          <w:rFonts w:ascii="Calibri" w:eastAsia="Calibri" w:hAnsi="Calibri" w:cs="Calibri"/>
+          <w:color w:val="333333"/>
+          <w:sz w:val="22"/>
+          <w:szCs w:val="22"/>
+        </w:rPr>
+        <w:t xml:space="preserve">: ID (SERIAL), </w:t>
+      </w:r>
+      <w:proofErr w:type="spellStart"/>
+      <w:r>
+        <w:rPr>
+          <w:rFonts w:ascii="Calibri" w:eastAsia="Calibri" w:hAnsi="Calibri" w:cs="Calibri"/>
+          <w:color w:val="333333"/>
+          <w:sz w:val="22"/>
+          <w:szCs w:val="22"/>
+        </w:rPr>
+        <w:t>Conversation</w:t>
+      </w:r>
+      <w:proofErr w:type="spellEnd"/>
+      <w:r>
+        <w:rPr>
+          <w:rFonts w:ascii="Calibri" w:eastAsia="Calibri" w:hAnsi="Calibri" w:cs="Calibri"/>
+          <w:color w:val="333333"/>
+          <w:sz w:val="22"/>
+          <w:szCs w:val="22"/>
+        </w:rPr>
+        <w:t xml:space="preserve"> ID (UUID), </w:t>
+      </w:r>
+      <w:proofErr w:type="spellStart"/>
+      <w:r>
+        <w:rPr>
+          <w:rFonts w:ascii="Calibri" w:eastAsia="Calibri" w:hAnsi="Calibri" w:cs="Calibri"/>
+          <w:color w:val="333333"/>
+          <w:sz w:val="22"/>
+          <w:szCs w:val="22"/>
+        </w:rPr>
+        <w:t>Type</w:t>
+      </w:r>
+      <w:proofErr w:type="spellEnd"/>
+      <w:r>
+        <w:rPr>
+          <w:rFonts w:ascii="Calibri" w:eastAsia="Calibri" w:hAnsi="Calibri" w:cs="Calibri"/>
+          <w:color w:val="333333"/>
+          <w:sz w:val="22"/>
+          <w:szCs w:val="22"/>
+        </w:rPr>
+        <w:t xml:space="preserve"> (TEXT), Data (JSONB com os dados do </w:t>
+      </w:r>
+      <w:proofErr w:type="spellStart"/>
+      <w:r>
+        <w:rPr>
+          <w:rFonts w:ascii="Calibri" w:eastAsia="Calibri" w:hAnsi="Calibri" w:cs="Calibri"/>
+          <w:color w:val="333333"/>
+          <w:sz w:val="22"/>
+          <w:szCs w:val="22"/>
+        </w:rPr>
+        <w:t>job</w:t>
+      </w:r>
+      <w:proofErr w:type="spellEnd"/>
+      <w:r>
+        <w:rPr>
+          <w:rFonts w:ascii="Calibri" w:eastAsia="Calibri" w:hAnsi="Calibri" w:cs="Calibri"/>
+          <w:color w:val="333333"/>
+          <w:sz w:val="22"/>
+          <w:szCs w:val="22"/>
+        </w:rPr>
+        <w:t xml:space="preserve">), Status (TEXT), </w:t>
+      </w:r>
+      <w:proofErr w:type="spellStart"/>
+      <w:r>
+        <w:rPr>
+          <w:rFonts w:ascii="Calibri" w:eastAsia="Calibri" w:hAnsi="Calibri" w:cs="Calibri"/>
+          <w:color w:val="333333"/>
+          <w:sz w:val="22"/>
+          <w:szCs w:val="22"/>
+        </w:rPr>
+        <w:t>User</w:t>
+      </w:r>
+      <w:proofErr w:type="spellEnd"/>
+      <w:r>
+        <w:rPr>
+          <w:rFonts w:ascii="Calibri" w:eastAsia="Calibri" w:hAnsi="Calibri" w:cs="Calibri"/>
+          <w:color w:val="333333"/>
+          <w:sz w:val="22"/>
+          <w:szCs w:val="22"/>
+        </w:rPr>
+        <w:t xml:space="preserve"> ID (UUID), File </w:t>
+      </w:r>
+      <w:proofErr w:type="spellStart"/>
+      <w:r>
+        <w:rPr>
+          <w:rFonts w:ascii="Calibri" w:eastAsia="Calibri" w:hAnsi="Calibri" w:cs="Calibri"/>
+          <w:color w:val="333333"/>
+          <w:sz w:val="22"/>
+          <w:szCs w:val="22"/>
+        </w:rPr>
+        <w:t>Name</w:t>
+      </w:r>
+      <w:proofErr w:type="spellEnd"/>
+      <w:r>
+        <w:rPr>
+          <w:rFonts w:ascii="Calibri" w:eastAsia="Calibri" w:hAnsi="Calibri" w:cs="Calibri"/>
+          <w:color w:val="333333"/>
+          <w:sz w:val="22"/>
+          <w:szCs w:val="22"/>
+        </w:rPr>
+        <w:t xml:space="preserve"> (TEXT), </w:t>
+      </w:r>
+      <w:proofErr w:type="spellStart"/>
+      <w:r>
+        <w:rPr>
+          <w:rFonts w:ascii="Calibri" w:eastAsia="Calibri" w:hAnsi="Calibri" w:cs="Calibri"/>
+          <w:color w:val="333333"/>
+          <w:sz w:val="22"/>
+          <w:szCs w:val="22"/>
+        </w:rPr>
+        <w:t>Created</w:t>
+      </w:r>
+      <w:proofErr w:type="spellEnd"/>
+      <w:r>
+        <w:rPr>
+          <w:rFonts w:ascii="Calibri" w:eastAsia="Calibri" w:hAnsi="Calibri" w:cs="Calibri"/>
+          <w:color w:val="333333"/>
+          <w:sz w:val="22"/>
+          <w:szCs w:val="22"/>
+        </w:rPr>
+        <w:t xml:space="preserve"> At (TIMESTAMPTZ).</w:t>
       </w:r>
     </w:p>
     <w:p>
@@ -3719,14 +5267,85 @@
         </w:numPr>
         <w:spacing w:before="60" w:after="60"/>
       </w:pPr>
-      <w:r>
-        <w:rPr>
-          <w:rFonts w:ascii="Calibri" w:eastAsia="Calibri" w:hAnsi="Calibri" w:cs="Calibri"/>
-          <w:color w:val="333333"/>
-          <w:sz w:val="22"/>
-          <w:szCs w:val="22"/>
-        </w:rPr>
-        <w:t>JobsIA_dictionary_terms: ID (SERIAL), Term (TEXT, chave do glossário), Definition (TEXT), Category (TEXT).</w:t>
+      <w:proofErr w:type="spellStart"/>
+      <w:r>
+        <w:rPr>
+          <w:rFonts w:ascii="Calibri" w:eastAsia="Calibri" w:hAnsi="Calibri" w:cs="Calibri"/>
+          <w:color w:val="333333"/>
+          <w:sz w:val="22"/>
+          <w:szCs w:val="22"/>
+        </w:rPr>
+        <w:t>JobsIA_dictionary_terms</w:t>
+      </w:r>
+      <w:proofErr w:type="spellEnd"/>
+      <w:r>
+        <w:rPr>
+          <w:rFonts w:ascii="Calibri" w:eastAsia="Calibri" w:hAnsi="Calibri" w:cs="Calibri"/>
+          <w:color w:val="333333"/>
+          <w:sz w:val="22"/>
+          <w:szCs w:val="22"/>
+        </w:rPr>
+        <w:t xml:space="preserve">: ID (SERIAL), </w:t>
+      </w:r>
+      <w:proofErr w:type="spellStart"/>
+      <w:r>
+        <w:rPr>
+          <w:rFonts w:ascii="Calibri" w:eastAsia="Calibri" w:hAnsi="Calibri" w:cs="Calibri"/>
+          <w:color w:val="333333"/>
+          <w:sz w:val="22"/>
+          <w:szCs w:val="22"/>
+        </w:rPr>
+        <w:t>Term</w:t>
+      </w:r>
+      <w:proofErr w:type="spellEnd"/>
+      <w:r>
+        <w:rPr>
+          <w:rFonts w:ascii="Calibri" w:eastAsia="Calibri" w:hAnsi="Calibri" w:cs="Calibri"/>
+          <w:color w:val="333333"/>
+          <w:sz w:val="22"/>
+          <w:szCs w:val="22"/>
+        </w:rPr>
+        <w:t xml:space="preserve"> (TEXT, chave do glossário), </w:t>
+      </w:r>
+      <w:proofErr w:type="spellStart"/>
+      <w:r>
+        <w:rPr>
+          <w:rFonts w:ascii="Calibri" w:eastAsia="Calibri" w:hAnsi="Calibri" w:cs="Calibri"/>
+          <w:color w:val="333333"/>
+          <w:sz w:val="22"/>
+          <w:szCs w:val="22"/>
+        </w:rPr>
+        <w:t>Definition</w:t>
+      </w:r>
+      <w:proofErr w:type="spellEnd"/>
+      <w:r>
+        <w:rPr>
+          <w:rFonts w:ascii="Calibri" w:eastAsia="Calibri" w:hAnsi="Calibri" w:cs="Calibri"/>
+          <w:color w:val="333333"/>
+          <w:sz w:val="22"/>
+          <w:szCs w:val="22"/>
+        </w:rPr>
+        <w:t xml:space="preserve"> (TEXT), </w:t>
+      </w:r>
+      <w:proofErr w:type="spellStart"/>
+      <w:r>
+        <w:rPr>
+          <w:rFonts w:ascii="Calibri" w:eastAsia="Calibri" w:hAnsi="Calibri" w:cs="Calibri"/>
+          <w:color w:val="333333"/>
+          <w:sz w:val="22"/>
+          <w:szCs w:val="22"/>
+        </w:rPr>
+        <w:t>Category</w:t>
+      </w:r>
+      <w:proofErr w:type="spellEnd"/>
+      <w:r>
+        <w:rPr>
+          <w:rFonts w:ascii="Calibri" w:eastAsia="Calibri" w:hAnsi="Calibri" w:cs="Calibri"/>
+          <w:color w:val="333333"/>
+          <w:sz w:val="22"/>
+          <w:szCs w:val="22"/>
+        </w:rPr>
+        <w:t xml:space="preserve"> (TEXT).</w:t>
       </w:r>
     </w:p>
     <w:p>
@@ -3738,14 +5357,45 @@
         </w:numPr>
         <w:spacing w:before="60" w:after="60"/>
       </w:pPr>
-      <w:r>
-        <w:rPr>
-          <w:rFonts w:ascii="Calibri" w:eastAsia="Calibri" w:hAnsi="Calibri" w:cs="Calibri"/>
-          <w:color w:val="333333"/>
-          <w:sz w:val="22"/>
-          <w:szCs w:val="22"/>
-        </w:rPr>
-        <w:t>JobsIA_norm_rules: ID (SERIAL), Environment (TEXT, Windows/Linux), Rule (TEXT).</w:t>
+      <w:proofErr w:type="spellStart"/>
+      <w:r>
+        <w:rPr>
+          <w:rFonts w:ascii="Calibri" w:eastAsia="Calibri" w:hAnsi="Calibri" w:cs="Calibri"/>
+          <w:color w:val="333333"/>
+          <w:sz w:val="22"/>
+          <w:szCs w:val="22"/>
+        </w:rPr>
+        <w:t>JobsIA_norm_rules</w:t>
+      </w:r>
+      <w:proofErr w:type="spellEnd"/>
+      <w:r>
+        <w:rPr>
+          <w:rFonts w:ascii="Calibri" w:eastAsia="Calibri" w:hAnsi="Calibri" w:cs="Calibri"/>
+          <w:color w:val="333333"/>
+          <w:sz w:val="22"/>
+          <w:szCs w:val="22"/>
+        </w:rPr>
+        <w:t xml:space="preserve">: ID (SERIAL), </w:t>
+      </w:r>
+      <w:proofErr w:type="spellStart"/>
+      <w:r>
+        <w:rPr>
+          <w:rFonts w:ascii="Calibri" w:eastAsia="Calibri" w:hAnsi="Calibri" w:cs="Calibri"/>
+          <w:color w:val="333333"/>
+          <w:sz w:val="22"/>
+          <w:szCs w:val="22"/>
+        </w:rPr>
+        <w:t>Environment</w:t>
+      </w:r>
+      <w:proofErr w:type="spellEnd"/>
+      <w:r>
+        <w:rPr>
+          <w:rFonts w:ascii="Calibri" w:eastAsia="Calibri" w:hAnsi="Calibri" w:cs="Calibri"/>
+          <w:color w:val="333333"/>
+          <w:sz w:val="22"/>
+          <w:szCs w:val="22"/>
+        </w:rPr>
+        <w:t xml:space="preserve"> (TEXT, Windows/Linux), Rule (TEXT).</w:t>
       </w:r>
     </w:p>
     <w:p>
@@ -3757,14 +5407,85 @@
         </w:numPr>
         <w:spacing w:before="60" w:after="60"/>
       </w:pPr>
-      <w:r>
-        <w:rPr>
-          <w:rFonts w:ascii="Calibri" w:eastAsia="Calibri" w:hAnsi="Calibri" w:cs="Calibri"/>
-          <w:color w:val="333333"/>
-          <w:sz w:val="22"/>
-          <w:szCs w:val="22"/>
-        </w:rPr>
-        <w:t>JobsIA_system_prompts: ID (SERIAL), Content (TEXT, instruções detalhadas do prompt), Is Active (BOOLEAN), Created At (TIMESTAMPTZ).</w:t>
+      <w:proofErr w:type="spellStart"/>
+      <w:r>
+        <w:rPr>
+          <w:rFonts w:ascii="Calibri" w:eastAsia="Calibri" w:hAnsi="Calibri" w:cs="Calibri"/>
+          <w:color w:val="333333"/>
+          <w:sz w:val="22"/>
+          <w:szCs w:val="22"/>
+        </w:rPr>
+        <w:t>JobsIA_system_prompts</w:t>
+      </w:r>
+      <w:proofErr w:type="spellEnd"/>
+      <w:r>
+        <w:rPr>
+          <w:rFonts w:ascii="Calibri" w:eastAsia="Calibri" w:hAnsi="Calibri" w:cs="Calibri"/>
+          <w:color w:val="333333"/>
+          <w:sz w:val="22"/>
+          <w:szCs w:val="22"/>
+        </w:rPr>
+        <w:t xml:space="preserve">: ID (SERIAL), </w:t>
+      </w:r>
+      <w:proofErr w:type="spellStart"/>
+      <w:r>
+        <w:rPr>
+          <w:rFonts w:ascii="Calibri" w:eastAsia="Calibri" w:hAnsi="Calibri" w:cs="Calibri"/>
+          <w:color w:val="333333"/>
+          <w:sz w:val="22"/>
+          <w:szCs w:val="22"/>
+        </w:rPr>
+        <w:t>Content</w:t>
+      </w:r>
+      <w:proofErr w:type="spellEnd"/>
+      <w:r>
+        <w:rPr>
+          <w:rFonts w:ascii="Calibri" w:eastAsia="Calibri" w:hAnsi="Calibri" w:cs="Calibri"/>
+          <w:color w:val="333333"/>
+          <w:sz w:val="22"/>
+          <w:szCs w:val="22"/>
+        </w:rPr>
+        <w:t xml:space="preserve"> (TEXT, instruções detalhadas do prompt), </w:t>
+      </w:r>
+      <w:proofErr w:type="spellStart"/>
+      <w:r>
+        <w:rPr>
+          <w:rFonts w:ascii="Calibri" w:eastAsia="Calibri" w:hAnsi="Calibri" w:cs="Calibri"/>
+          <w:color w:val="333333"/>
+          <w:sz w:val="22"/>
+          <w:szCs w:val="22"/>
+        </w:rPr>
+        <w:t>Is</w:t>
+      </w:r>
+      <w:proofErr w:type="spellEnd"/>
+      <w:r>
+        <w:rPr>
+          <w:rFonts w:ascii="Calibri" w:eastAsia="Calibri" w:hAnsi="Calibri" w:cs="Calibri"/>
+          <w:color w:val="333333"/>
+          <w:sz w:val="22"/>
+          <w:szCs w:val="22"/>
+        </w:rPr>
+        <w:t xml:space="preserve"> Active (BOOLEAN), </w:t>
+      </w:r>
+      <w:proofErr w:type="spellStart"/>
+      <w:r>
+        <w:rPr>
+          <w:rFonts w:ascii="Calibri" w:eastAsia="Calibri" w:hAnsi="Calibri" w:cs="Calibri"/>
+          <w:color w:val="333333"/>
+          <w:sz w:val="22"/>
+          <w:szCs w:val="22"/>
+        </w:rPr>
+        <w:t>Created</w:t>
+      </w:r>
+      <w:proofErr w:type="spellEnd"/>
+      <w:r>
+        <w:rPr>
+          <w:rFonts w:ascii="Calibri" w:eastAsia="Calibri" w:hAnsi="Calibri" w:cs="Calibri"/>
+          <w:color w:val="333333"/>
+          <w:sz w:val="22"/>
+          <w:szCs w:val="22"/>
+        </w:rPr>
+        <w:t xml:space="preserve"> At (TIMESTAMPTZ).</w:t>
       </w:r>
     </w:p>
     <w:tbl>
@@ -3818,7 +5539,71 @@
                 <w:rFonts w:ascii="Calibri" w:eastAsia="Calibri" w:hAnsi="Calibri" w:cs="Calibri"/>
                 <w:color w:val="333333"/>
               </w:rPr>
-              <w:t>Todos os relacionamentos de chave estrangeira importantes (como JobsIA_parameters -&gt; JobsIA_types e JobsIA_profiles -&gt; users) possuem a instrução ON DELETE CASCADE ativa, garantindo a consistência referencial total durante a remoção de itens.</w:t>
+              <w:t xml:space="preserve">Todos os relacionamentos de chave estrangeira importantes (como </w:t>
+            </w:r>
+            <w:proofErr w:type="spellStart"/>
+            <w:r>
+              <w:rPr>
+                <w:rFonts w:ascii="Calibri" w:eastAsia="Calibri" w:hAnsi="Calibri" w:cs="Calibri"/>
+                <w:color w:val="333333"/>
+              </w:rPr>
+              <w:t>JobsIA_parameters</w:t>
+            </w:r>
+            <w:proofErr w:type="spellEnd"/>
+            <w:r>
+              <w:rPr>
+                <w:rFonts w:ascii="Calibri" w:eastAsia="Calibri" w:hAnsi="Calibri" w:cs="Calibri"/>
+                <w:color w:val="333333"/>
+              </w:rPr>
+              <w:t xml:space="preserve"> -&gt; </w:t>
+            </w:r>
+            <w:proofErr w:type="spellStart"/>
+            <w:r>
+              <w:rPr>
+                <w:rFonts w:ascii="Calibri" w:eastAsia="Calibri" w:hAnsi="Calibri" w:cs="Calibri"/>
+                <w:color w:val="333333"/>
+              </w:rPr>
+              <w:t>JobsIA_types</w:t>
+            </w:r>
+            <w:proofErr w:type="spellEnd"/>
+            <w:r>
+              <w:rPr>
+                <w:rFonts w:ascii="Calibri" w:eastAsia="Calibri" w:hAnsi="Calibri" w:cs="Calibri"/>
+                <w:color w:val="333333"/>
+              </w:rPr>
+              <w:t xml:space="preserve"> e </w:t>
+            </w:r>
+            <w:proofErr w:type="spellStart"/>
+            <w:r>
+              <w:rPr>
+                <w:rFonts w:ascii="Calibri" w:eastAsia="Calibri" w:hAnsi="Calibri" w:cs="Calibri"/>
+                <w:color w:val="333333"/>
+              </w:rPr>
+              <w:t>JobsIA_profiles</w:t>
+            </w:r>
+            <w:proofErr w:type="spellEnd"/>
+            <w:r>
+              <w:rPr>
+                <w:rFonts w:ascii="Calibri" w:eastAsia="Calibri" w:hAnsi="Calibri" w:cs="Calibri"/>
+                <w:color w:val="333333"/>
+              </w:rPr>
+              <w:t xml:space="preserve"> -&gt; </w:t>
+            </w:r>
+            <w:proofErr w:type="spellStart"/>
+            <w:r>
+              <w:rPr>
+                <w:rFonts w:ascii="Calibri" w:eastAsia="Calibri" w:hAnsi="Calibri" w:cs="Calibri"/>
+                <w:color w:val="333333"/>
+              </w:rPr>
+              <w:t>users</w:t>
+            </w:r>
+            <w:proofErr w:type="spellEnd"/>
+            <w:r>
+              <w:rPr>
+                <w:rFonts w:ascii="Calibri" w:eastAsia="Calibri" w:hAnsi="Calibri" w:cs="Calibri"/>
+                <w:color w:val="333333"/>
+              </w:rPr>
+              <w:t>) possuem a instrução ON DELETE CASCADE ativa, garantindo a consistência referencial total durante a remoção de itens.</w:t>
             </w:r>
           </w:p>
         </w:tc>
@@ -3835,7 +5620,7 @@
         <w:keepNext/>
         <w:spacing w:before="240" w:after="120"/>
       </w:pPr>
-      <w:bookmarkStart w:id="10" w:name="_Toc233183128"/>
+      <w:bookmarkStart w:id="9" w:name="_Toc233183128"/>
       <w:r>
         <w:rPr>
           <w:rFonts w:ascii="Calibri" w:eastAsia="Calibri" w:hAnsi="Calibri" w:cs="Calibri"/>
@@ -3846,9 +5631,81 @@
           <w:szCs w:val="36"/>
         </w:rPr>
         <w:lastRenderedPageBreak/>
-        <w:t>4. Frontend (React 19, Vite e Tailwind)</w:t>
-      </w:r>
-      <w:bookmarkEnd w:id="10"/>
+        <w:t xml:space="preserve">4. </w:t>
+      </w:r>
+      <w:proofErr w:type="spellStart"/>
+      <w:r>
+        <w:rPr>
+          <w:rFonts w:ascii="Calibri" w:eastAsia="Calibri" w:hAnsi="Calibri" w:cs="Calibri"/>
+          <w:b/>
+          <w:bCs/>
+          <w:color w:val="1B365D"/>
+          <w:sz w:val="36"/>
+          <w:szCs w:val="36"/>
+        </w:rPr>
+        <w:t>Frontend</w:t>
+      </w:r>
+      <w:proofErr w:type="spellEnd"/>
+      <w:r>
+        <w:rPr>
+          <w:rFonts w:ascii="Calibri" w:eastAsia="Calibri" w:hAnsi="Calibri" w:cs="Calibri"/>
+          <w:b/>
+          <w:bCs/>
+          <w:color w:val="1B365D"/>
+          <w:sz w:val="36"/>
+          <w:szCs w:val="36"/>
+        </w:rPr>
+        <w:t xml:space="preserve"> (</w:t>
+      </w:r>
+      <w:proofErr w:type="spellStart"/>
+      <w:r>
+        <w:rPr>
+          <w:rFonts w:ascii="Calibri" w:eastAsia="Calibri" w:hAnsi="Calibri" w:cs="Calibri"/>
+          <w:b/>
+          <w:bCs/>
+          <w:color w:val="1B365D"/>
+          <w:sz w:val="36"/>
+          <w:szCs w:val="36"/>
+        </w:rPr>
+        <w:t>React</w:t>
+      </w:r>
+      <w:proofErr w:type="spellEnd"/>
+      <w:r>
+        <w:rPr>
+          <w:rFonts w:ascii="Calibri" w:eastAsia="Calibri" w:hAnsi="Calibri" w:cs="Calibri"/>
+          <w:b/>
+          <w:bCs/>
+          <w:color w:val="1B365D"/>
+          <w:sz w:val="36"/>
+          <w:szCs w:val="36"/>
+        </w:rPr>
+        <w:t xml:space="preserve"> 19, Vite e </w:t>
+      </w:r>
+      <w:proofErr w:type="spellStart"/>
+      <w:r>
+        <w:rPr>
+          <w:rFonts w:ascii="Calibri" w:eastAsia="Calibri" w:hAnsi="Calibri" w:cs="Calibri"/>
+          <w:b/>
+          <w:bCs/>
+          <w:color w:val="1B365D"/>
+          <w:sz w:val="36"/>
+          <w:szCs w:val="36"/>
+        </w:rPr>
+        <w:t>Tailwind</w:t>
+      </w:r>
+      <w:proofErr w:type="spellEnd"/>
+      <w:r>
+        <w:rPr>
+          <w:rFonts w:ascii="Calibri" w:eastAsia="Calibri" w:hAnsi="Calibri" w:cs="Calibri"/>
+          <w:b/>
+          <w:bCs/>
+          <w:color w:val="1B365D"/>
+          <w:sz w:val="36"/>
+          <w:szCs w:val="36"/>
+        </w:rPr>
+        <w:t>)</w:t>
+      </w:r>
+      <w:bookmarkEnd w:id="9"/>
     </w:p>
     <w:p>
       <w:pPr>
@@ -3862,7 +5719,87 @@
           <w:sz w:val="22"/>
           <w:szCs w:val="22"/>
         </w:rPr>
-        <w:t>A interface do usuário do Jobs IA é desenvolvida como uma Single Page Application (SPA) moderna, utilizando o React 19 em conjunto com o bundler super-rápido Vite. A estilização visual é feita por meio do TailwindCSS v4, com animações dinâmicas fornecidas pela biblioteca Motion.</w:t>
+        <w:t xml:space="preserve">A interface do usuário do Jobs IA é desenvolvida como uma Single Page </w:t>
+      </w:r>
+      <w:proofErr w:type="spellStart"/>
+      <w:r>
+        <w:rPr>
+          <w:rFonts w:ascii="Calibri" w:eastAsia="Calibri" w:hAnsi="Calibri" w:cs="Calibri"/>
+          <w:color w:val="333333"/>
+          <w:sz w:val="22"/>
+          <w:szCs w:val="22"/>
+        </w:rPr>
+        <w:t>Application</w:t>
+      </w:r>
+      <w:proofErr w:type="spellEnd"/>
+      <w:r>
+        <w:rPr>
+          <w:rFonts w:ascii="Calibri" w:eastAsia="Calibri" w:hAnsi="Calibri" w:cs="Calibri"/>
+          <w:color w:val="333333"/>
+          <w:sz w:val="22"/>
+          <w:szCs w:val="22"/>
+        </w:rPr>
+        <w:t xml:space="preserve"> (SPA) moderna, utilizando o </w:t>
+      </w:r>
+      <w:proofErr w:type="spellStart"/>
+      <w:r>
+        <w:rPr>
+          <w:rFonts w:ascii="Calibri" w:eastAsia="Calibri" w:hAnsi="Calibri" w:cs="Calibri"/>
+          <w:color w:val="333333"/>
+          <w:sz w:val="22"/>
+          <w:szCs w:val="22"/>
+        </w:rPr>
+        <w:t>React</w:t>
+      </w:r>
+      <w:proofErr w:type="spellEnd"/>
+      <w:r>
+        <w:rPr>
+          <w:rFonts w:ascii="Calibri" w:eastAsia="Calibri" w:hAnsi="Calibri" w:cs="Calibri"/>
+          <w:color w:val="333333"/>
+          <w:sz w:val="22"/>
+          <w:szCs w:val="22"/>
+        </w:rPr>
+        <w:t xml:space="preserve"> 19 em conjunto com o </w:t>
+      </w:r>
+      <w:proofErr w:type="spellStart"/>
+      <w:r>
+        <w:rPr>
+          <w:rFonts w:ascii="Calibri" w:eastAsia="Calibri" w:hAnsi="Calibri" w:cs="Calibri"/>
+          <w:color w:val="333333"/>
+          <w:sz w:val="22"/>
+          <w:szCs w:val="22"/>
+        </w:rPr>
+        <w:t>bundler</w:t>
+      </w:r>
+      <w:proofErr w:type="spellEnd"/>
+      <w:r>
+        <w:rPr>
+          <w:rFonts w:ascii="Calibri" w:eastAsia="Calibri" w:hAnsi="Calibri" w:cs="Calibri"/>
+          <w:color w:val="333333"/>
+          <w:sz w:val="22"/>
+          <w:szCs w:val="22"/>
+        </w:rPr>
+        <w:t xml:space="preserve"> super-rápido Vite. A estilização visual é feita por meio do </w:t>
+      </w:r>
+      <w:proofErr w:type="spellStart"/>
+      <w:r>
+        <w:rPr>
+          <w:rFonts w:ascii="Calibri" w:eastAsia="Calibri" w:hAnsi="Calibri" w:cs="Calibri"/>
+          <w:color w:val="333333"/>
+          <w:sz w:val="22"/>
+          <w:szCs w:val="22"/>
+        </w:rPr>
+        <w:t>TailwindCSS</w:t>
+      </w:r>
+      <w:proofErr w:type="spellEnd"/>
+      <w:r>
+        <w:rPr>
+          <w:rFonts w:ascii="Calibri" w:eastAsia="Calibri" w:hAnsi="Calibri" w:cs="Calibri"/>
+          <w:color w:val="333333"/>
+          <w:sz w:val="22"/>
+          <w:szCs w:val="22"/>
+        </w:rPr>
+        <w:t xml:space="preserve"> v4, com animações dinâmicas fornecidas pela biblioteca Motion.</w:t>
       </w:r>
     </w:p>
     <w:p>
@@ -3871,7 +5808,7 @@
         <w:keepNext/>
         <w:spacing w:before="240" w:after="120"/>
       </w:pPr>
-      <w:bookmarkStart w:id="11" w:name="_Toc233183129"/>
+      <w:bookmarkStart w:id="10" w:name="_Toc233183129"/>
       <w:r>
         <w:rPr>
           <w:rFonts w:ascii="Calibri" w:eastAsia="Calibri" w:hAnsi="Calibri" w:cs="Calibri"/>
@@ -3883,7 +5820,7 @@
         </w:rPr>
         <w:t>Estrutura de Componentes e Fluxo da Interface</w:t>
       </w:r>
-      <w:bookmarkEnd w:id="11"/>
+      <w:bookmarkEnd w:id="10"/>
     </w:p>
     <w:p>
       <w:pPr>
@@ -3894,14 +5831,105 @@
         </w:numPr>
         <w:spacing w:before="60" w:after="60"/>
       </w:pPr>
-      <w:r>
-        <w:rPr>
-          <w:rFonts w:ascii="Calibri" w:eastAsia="Calibri" w:hAnsi="Calibri" w:cs="Calibri"/>
-          <w:color w:val="333333"/>
-          <w:sz w:val="22"/>
-          <w:szCs w:val="22"/>
-        </w:rPr>
-        <w:t>App.tsx: Ponto de partida que monta o router SPA (React Router DOM v7) e envelopa as rotas dentro do AuthProvider global. Possui um layout com barra lateral adaptável (responsivo) para telas menores e desktops.</w:t>
+      <w:proofErr w:type="spellStart"/>
+      <w:r>
+        <w:rPr>
+          <w:rFonts w:ascii="Calibri" w:eastAsia="Calibri" w:hAnsi="Calibri" w:cs="Calibri"/>
+          <w:color w:val="333333"/>
+          <w:sz w:val="22"/>
+          <w:szCs w:val="22"/>
+        </w:rPr>
+        <w:t>App.tsx</w:t>
+      </w:r>
+      <w:proofErr w:type="spellEnd"/>
+      <w:r>
+        <w:rPr>
+          <w:rFonts w:ascii="Calibri" w:eastAsia="Calibri" w:hAnsi="Calibri" w:cs="Calibri"/>
+          <w:color w:val="333333"/>
+          <w:sz w:val="22"/>
+          <w:szCs w:val="22"/>
+        </w:rPr>
+        <w:t xml:space="preserve">: Ponto de partida que monta o </w:t>
+      </w:r>
+      <w:proofErr w:type="spellStart"/>
+      <w:r>
+        <w:rPr>
+          <w:rFonts w:ascii="Calibri" w:eastAsia="Calibri" w:hAnsi="Calibri" w:cs="Calibri"/>
+          <w:color w:val="333333"/>
+          <w:sz w:val="22"/>
+          <w:szCs w:val="22"/>
+        </w:rPr>
+        <w:t>router</w:t>
+      </w:r>
+      <w:proofErr w:type="spellEnd"/>
+      <w:r>
+        <w:rPr>
+          <w:rFonts w:ascii="Calibri" w:eastAsia="Calibri" w:hAnsi="Calibri" w:cs="Calibri"/>
+          <w:color w:val="333333"/>
+          <w:sz w:val="22"/>
+          <w:szCs w:val="22"/>
+        </w:rPr>
+        <w:t xml:space="preserve"> SPA (</w:t>
+      </w:r>
+      <w:proofErr w:type="spellStart"/>
+      <w:r>
+        <w:rPr>
+          <w:rFonts w:ascii="Calibri" w:eastAsia="Calibri" w:hAnsi="Calibri" w:cs="Calibri"/>
+          <w:color w:val="333333"/>
+          <w:sz w:val="22"/>
+          <w:szCs w:val="22"/>
+        </w:rPr>
+        <w:t>React</w:t>
+      </w:r>
+      <w:proofErr w:type="spellEnd"/>
+      <w:r>
+        <w:rPr>
+          <w:rFonts w:ascii="Calibri" w:eastAsia="Calibri" w:hAnsi="Calibri" w:cs="Calibri"/>
+          <w:color w:val="333333"/>
+          <w:sz w:val="22"/>
+          <w:szCs w:val="22"/>
+        </w:rPr>
+        <w:t xml:space="preserve"> </w:t>
+      </w:r>
+      <w:proofErr w:type="spellStart"/>
+      <w:r>
+        <w:rPr>
+          <w:rFonts w:ascii="Calibri" w:eastAsia="Calibri" w:hAnsi="Calibri" w:cs="Calibri"/>
+          <w:color w:val="333333"/>
+          <w:sz w:val="22"/>
+          <w:szCs w:val="22"/>
+        </w:rPr>
+        <w:t>Router</w:t>
+      </w:r>
+      <w:proofErr w:type="spellEnd"/>
+      <w:r>
+        <w:rPr>
+          <w:rFonts w:ascii="Calibri" w:eastAsia="Calibri" w:hAnsi="Calibri" w:cs="Calibri"/>
+          <w:color w:val="333333"/>
+          <w:sz w:val="22"/>
+          <w:szCs w:val="22"/>
+        </w:rPr>
+        <w:t xml:space="preserve"> DOM v7) e envelopa as rotas dentro do </w:t>
+      </w:r>
+      <w:proofErr w:type="spellStart"/>
+      <w:r>
+        <w:rPr>
+          <w:rFonts w:ascii="Calibri" w:eastAsia="Calibri" w:hAnsi="Calibri" w:cs="Calibri"/>
+          <w:color w:val="333333"/>
+          <w:sz w:val="22"/>
+          <w:szCs w:val="22"/>
+        </w:rPr>
+        <w:t>AuthProvider</w:t>
+      </w:r>
+      <w:proofErr w:type="spellEnd"/>
+      <w:r>
+        <w:rPr>
+          <w:rFonts w:ascii="Calibri" w:eastAsia="Calibri" w:hAnsi="Calibri" w:cs="Calibri"/>
+          <w:color w:val="333333"/>
+          <w:sz w:val="22"/>
+          <w:szCs w:val="22"/>
+        </w:rPr>
+        <w:t xml:space="preserve"> global. Possui um layout com barra lateral adaptável (responsivo) para telas menores e desktops.</w:t>
       </w:r>
     </w:p>
     <w:p>
@@ -3913,14 +5941,45 @@
         </w:numPr>
         <w:spacing w:before="60" w:after="60"/>
       </w:pPr>
-      <w:r>
-        <w:rPr>
-          <w:rFonts w:ascii="Calibri" w:eastAsia="Calibri" w:hAnsi="Calibri" w:cs="Calibri"/>
-          <w:color w:val="333333"/>
-          <w:sz w:val="22"/>
-          <w:szCs w:val="22"/>
-        </w:rPr>
-        <w:t>LoginPage.tsx / SignupPage.tsx: Interfaces modernas de login e cadastro contendo validação local e tratamento de mensagens de erro.</w:t>
+      <w:proofErr w:type="spellStart"/>
+      <w:r>
+        <w:rPr>
+          <w:rFonts w:ascii="Calibri" w:eastAsia="Calibri" w:hAnsi="Calibri" w:cs="Calibri"/>
+          <w:color w:val="333333"/>
+          <w:sz w:val="22"/>
+          <w:szCs w:val="22"/>
+        </w:rPr>
+        <w:t>LoginPage.tsx</w:t>
+      </w:r>
+      <w:proofErr w:type="spellEnd"/>
+      <w:r>
+        <w:rPr>
+          <w:rFonts w:ascii="Calibri" w:eastAsia="Calibri" w:hAnsi="Calibri" w:cs="Calibri"/>
+          <w:color w:val="333333"/>
+          <w:sz w:val="22"/>
+          <w:szCs w:val="22"/>
+        </w:rPr>
+        <w:t xml:space="preserve"> / </w:t>
+      </w:r>
+      <w:proofErr w:type="spellStart"/>
+      <w:r>
+        <w:rPr>
+          <w:rFonts w:ascii="Calibri" w:eastAsia="Calibri" w:hAnsi="Calibri" w:cs="Calibri"/>
+          <w:color w:val="333333"/>
+          <w:sz w:val="22"/>
+          <w:szCs w:val="22"/>
+        </w:rPr>
+        <w:t>SignupPage.tsx</w:t>
+      </w:r>
+      <w:proofErr w:type="spellEnd"/>
+      <w:r>
+        <w:rPr>
+          <w:rFonts w:ascii="Calibri" w:eastAsia="Calibri" w:hAnsi="Calibri" w:cs="Calibri"/>
+          <w:color w:val="333333"/>
+          <w:sz w:val="22"/>
+          <w:szCs w:val="22"/>
+        </w:rPr>
+        <w:t>: Interfaces modernas de login e cadastro contendo validação local e tratamento de mensagens de erro.</w:t>
       </w:r>
     </w:p>
     <w:p>
@@ -3932,14 +5991,25 @@
         </w:numPr>
         <w:spacing w:before="60" w:after="60"/>
       </w:pPr>
-      <w:r>
-        <w:rPr>
-          <w:rFonts w:ascii="Calibri" w:eastAsia="Calibri" w:hAnsi="Calibri" w:cs="Calibri"/>
-          <w:color w:val="333333"/>
-          <w:sz w:val="22"/>
-          <w:szCs w:val="22"/>
-        </w:rPr>
-        <w:t>AgentView.tsx: Componente principal do sistema. Gerencia o painel de chat, o histórico local de mensagens do agente, e renderiza botões interativos para a exportação de arquivos PDF contendo os checklists compilados.</w:t>
+      <w:proofErr w:type="spellStart"/>
+      <w:r>
+        <w:rPr>
+          <w:rFonts w:ascii="Calibri" w:eastAsia="Calibri" w:hAnsi="Calibri" w:cs="Calibri"/>
+          <w:color w:val="333333"/>
+          <w:sz w:val="22"/>
+          <w:szCs w:val="22"/>
+        </w:rPr>
+        <w:t>AgentView.tsx</w:t>
+      </w:r>
+      <w:proofErr w:type="spellEnd"/>
+      <w:r>
+        <w:rPr>
+          <w:rFonts w:ascii="Calibri" w:eastAsia="Calibri" w:hAnsi="Calibri" w:cs="Calibri"/>
+          <w:color w:val="333333"/>
+          <w:sz w:val="22"/>
+          <w:szCs w:val="22"/>
+        </w:rPr>
+        <w:t>: Componente principal do sistema. Gerencia o painel de chat, o histórico local de mensagens do agente, e renderiza botões interativos para a exportação de arquivos PDF contendo os checklists compilados.</w:t>
       </w:r>
     </w:p>
     <w:p>
@@ -3951,14 +6021,105 @@
         </w:numPr>
         <w:spacing w:before="60" w:after="60"/>
       </w:pPr>
-      <w:r>
-        <w:rPr>
-          <w:rFonts w:ascii="Calibri" w:eastAsia="Calibri" w:hAnsi="Calibri" w:cs="Calibri"/>
-          <w:color w:val="333333"/>
-          <w:sz w:val="22"/>
-          <w:szCs w:val="22"/>
-        </w:rPr>
-        <w:t>KnowledgeViews.tsx: Contém sub-visões modulares para gerenciar dados corporativos sem sair do fluxo principal da aplicação. Agrupa DictionaryView (Dicionário), NormsView (Normas técnicas) e JobsView (Mapeamento de Jobs e Parâmetros).</w:t>
+      <w:proofErr w:type="spellStart"/>
+      <w:r>
+        <w:rPr>
+          <w:rFonts w:ascii="Calibri" w:eastAsia="Calibri" w:hAnsi="Calibri" w:cs="Calibri"/>
+          <w:color w:val="333333"/>
+          <w:sz w:val="22"/>
+          <w:szCs w:val="22"/>
+        </w:rPr>
+        <w:t>KnowledgeViews.tsx</w:t>
+      </w:r>
+      <w:proofErr w:type="spellEnd"/>
+      <w:r>
+        <w:rPr>
+          <w:rFonts w:ascii="Calibri" w:eastAsia="Calibri" w:hAnsi="Calibri" w:cs="Calibri"/>
+          <w:color w:val="333333"/>
+          <w:sz w:val="22"/>
+          <w:szCs w:val="22"/>
+        </w:rPr>
+        <w:t xml:space="preserve">: Contém </w:t>
+      </w:r>
+      <w:proofErr w:type="spellStart"/>
+      <w:r>
+        <w:rPr>
+          <w:rFonts w:ascii="Calibri" w:eastAsia="Calibri" w:hAnsi="Calibri" w:cs="Calibri"/>
+          <w:color w:val="333333"/>
+          <w:sz w:val="22"/>
+          <w:szCs w:val="22"/>
+        </w:rPr>
+        <w:t>sub-visões</w:t>
+      </w:r>
+      <w:proofErr w:type="spellEnd"/>
+      <w:r>
+        <w:rPr>
+          <w:rFonts w:ascii="Calibri" w:eastAsia="Calibri" w:hAnsi="Calibri" w:cs="Calibri"/>
+          <w:color w:val="333333"/>
+          <w:sz w:val="22"/>
+          <w:szCs w:val="22"/>
+        </w:rPr>
+        <w:t xml:space="preserve"> modulares para gerenciar dados corporativos sem sair do fluxo principal da aplicação. Agrupa </w:t>
+      </w:r>
+      <w:proofErr w:type="spellStart"/>
+      <w:r>
+        <w:rPr>
+          <w:rFonts w:ascii="Calibri" w:eastAsia="Calibri" w:hAnsi="Calibri" w:cs="Calibri"/>
+          <w:color w:val="333333"/>
+          <w:sz w:val="22"/>
+          <w:szCs w:val="22"/>
+        </w:rPr>
+        <w:t>DictionaryView</w:t>
+      </w:r>
+      <w:proofErr w:type="spellEnd"/>
+      <w:r>
+        <w:rPr>
+          <w:rFonts w:ascii="Calibri" w:eastAsia="Calibri" w:hAnsi="Calibri" w:cs="Calibri"/>
+          <w:color w:val="333333"/>
+          <w:sz w:val="22"/>
+          <w:szCs w:val="22"/>
+        </w:rPr>
+        <w:t xml:space="preserve"> (Dicionário), </w:t>
+      </w:r>
+      <w:proofErr w:type="spellStart"/>
+      <w:r>
+        <w:rPr>
+          <w:rFonts w:ascii="Calibri" w:eastAsia="Calibri" w:hAnsi="Calibri" w:cs="Calibri"/>
+          <w:color w:val="333333"/>
+          <w:sz w:val="22"/>
+          <w:szCs w:val="22"/>
+        </w:rPr>
+        <w:t>NormsView</w:t>
+      </w:r>
+      <w:proofErr w:type="spellEnd"/>
+      <w:r>
+        <w:rPr>
+          <w:rFonts w:ascii="Calibri" w:eastAsia="Calibri" w:hAnsi="Calibri" w:cs="Calibri"/>
+          <w:color w:val="333333"/>
+          <w:sz w:val="22"/>
+          <w:szCs w:val="22"/>
+        </w:rPr>
+        <w:t xml:space="preserve"> (Normas técnicas) e </w:t>
+      </w:r>
+      <w:proofErr w:type="spellStart"/>
+      <w:r>
+        <w:rPr>
+          <w:rFonts w:ascii="Calibri" w:eastAsia="Calibri" w:hAnsi="Calibri" w:cs="Calibri"/>
+          <w:color w:val="333333"/>
+          <w:sz w:val="22"/>
+          <w:szCs w:val="22"/>
+        </w:rPr>
+        <w:t>JobsView</w:t>
+      </w:r>
+      <w:proofErr w:type="spellEnd"/>
+      <w:r>
+        <w:rPr>
+          <w:rFonts w:ascii="Calibri" w:eastAsia="Calibri" w:hAnsi="Calibri" w:cs="Calibri"/>
+          <w:color w:val="333333"/>
+          <w:sz w:val="22"/>
+          <w:szCs w:val="22"/>
+        </w:rPr>
+        <w:t xml:space="preserve"> (Mapeamento de Jobs e Parâmetros).</w:t>
       </w:r>
     </w:p>
     <w:p>
@@ -3970,14 +6131,25 @@
         </w:numPr>
         <w:spacing w:before="60" w:after="60"/>
       </w:pPr>
-      <w:r>
-        <w:rPr>
-          <w:rFonts w:ascii="Calibri" w:eastAsia="Calibri" w:hAnsi="Calibri" w:cs="Calibri"/>
-          <w:color w:val="333333"/>
-          <w:sz w:val="22"/>
-          <w:szCs w:val="22"/>
-        </w:rPr>
-        <w:t>HistoryView.tsx: Tela de auditoria onde os checklists passados são carregados e podem ser filtrados, permitindo também o download posterior dos comandos gerados.</w:t>
+      <w:proofErr w:type="spellStart"/>
+      <w:r>
+        <w:rPr>
+          <w:rFonts w:ascii="Calibri" w:eastAsia="Calibri" w:hAnsi="Calibri" w:cs="Calibri"/>
+          <w:color w:val="333333"/>
+          <w:sz w:val="22"/>
+          <w:szCs w:val="22"/>
+        </w:rPr>
+        <w:t>HistoryView.tsx</w:t>
+      </w:r>
+      <w:proofErr w:type="spellEnd"/>
+      <w:r>
+        <w:rPr>
+          <w:rFonts w:ascii="Calibri" w:eastAsia="Calibri" w:hAnsi="Calibri" w:cs="Calibri"/>
+          <w:color w:val="333333"/>
+          <w:sz w:val="22"/>
+          <w:szCs w:val="22"/>
+        </w:rPr>
+        <w:t>: Tela de auditoria onde os checklists passados são carregados e podem ser filtrados, permitindo também o download posterior dos comandos gerados.</w:t>
       </w:r>
     </w:p>
     <w:p>
@@ -3989,14 +6161,25 @@
         </w:numPr>
         <w:spacing w:before="60" w:after="60"/>
       </w:pPr>
-      <w:r>
-        <w:rPr>
-          <w:rFonts w:ascii="Calibri" w:eastAsia="Calibri" w:hAnsi="Calibri" w:cs="Calibri"/>
-          <w:color w:val="333333"/>
-          <w:sz w:val="22"/>
-          <w:szCs w:val="22"/>
-        </w:rPr>
-        <w:t>UsersPage.tsx: Tela de gerenciamento onde administradores podem criar, visualizar e editar os privilégios dos usuários da plataforma.</w:t>
+      <w:proofErr w:type="spellStart"/>
+      <w:r>
+        <w:rPr>
+          <w:rFonts w:ascii="Calibri" w:eastAsia="Calibri" w:hAnsi="Calibri" w:cs="Calibri"/>
+          <w:color w:val="333333"/>
+          <w:sz w:val="22"/>
+          <w:szCs w:val="22"/>
+        </w:rPr>
+        <w:t>UsersPage.tsx</w:t>
+      </w:r>
+      <w:proofErr w:type="spellEnd"/>
+      <w:r>
+        <w:rPr>
+          <w:rFonts w:ascii="Calibri" w:eastAsia="Calibri" w:hAnsi="Calibri" w:cs="Calibri"/>
+          <w:color w:val="333333"/>
+          <w:sz w:val="22"/>
+          <w:szCs w:val="22"/>
+        </w:rPr>
+        <w:t>: Tela de gerenciamento onde administradores podem criar, visualizar e editar os privilégios dos usuários da plataforma.</w:t>
       </w:r>
     </w:p>
     <w:p>
@@ -4005,7 +6188,7 @@
         <w:keepNext/>
         <w:spacing w:before="240" w:after="120"/>
       </w:pPr>
-      <w:bookmarkStart w:id="12" w:name="_Toc233183130"/>
+      <w:bookmarkStart w:id="11" w:name="_Toc233183130"/>
       <w:r>
         <w:rPr>
           <w:rFonts w:ascii="Calibri" w:eastAsia="Calibri" w:hAnsi="Calibri" w:cs="Calibri"/>
@@ -4015,9 +6198,22 @@
           <w:sz w:val="28"/>
           <w:szCs w:val="28"/>
         </w:rPr>
-        <w:t>Exportação e Geração de PDF do Workload</w:t>
-      </w:r>
-      <w:bookmarkEnd w:id="12"/>
+        <w:t xml:space="preserve">Exportação e Geração de PDF do </w:t>
+      </w:r>
+      <w:proofErr w:type="spellStart"/>
+      <w:r>
+        <w:rPr>
+          <w:rFonts w:ascii="Calibri" w:eastAsia="Calibri" w:hAnsi="Calibri" w:cs="Calibri"/>
+          <w:b/>
+          <w:bCs/>
+          <w:color w:val="1B365D"/>
+          <w:sz w:val="28"/>
+          <w:szCs w:val="28"/>
+        </w:rPr>
+        <w:t>Workload</w:t>
+      </w:r>
+      <w:bookmarkEnd w:id="11"/>
+      <w:proofErr w:type="spellEnd"/>
     </w:p>
     <w:p>
       <w:pPr>
@@ -4031,7 +6227,127 @@
           <w:sz w:val="22"/>
           <w:szCs w:val="22"/>
         </w:rPr>
-        <w:t>Uma das grandes vantagens da solução é que a geração de PDF ocorre inteiramente do lado do cliente (client-side), sem sobrecarregar o processamento do backend. O módulo src/utils/pdfGenerator.ts faz uso da biblioteca jspdf para construir dinamicamente documentos formatados no padrão corporativo da Dataprev, detalhando cada campo coletado pela IA e anexando o comando compilado no final do documento para cópia rápida.</w:t>
+        <w:t>Uma das grandes vantagens da solução é que a geração de PDF ocorre inteiramente do lado do cliente (</w:t>
+      </w:r>
+      <w:proofErr w:type="spellStart"/>
+      <w:r>
+        <w:rPr>
+          <w:rFonts w:ascii="Calibri" w:eastAsia="Calibri" w:hAnsi="Calibri" w:cs="Calibri"/>
+          <w:color w:val="333333"/>
+          <w:sz w:val="22"/>
+          <w:szCs w:val="22"/>
+        </w:rPr>
+        <w:t>client-side</w:t>
+      </w:r>
+      <w:proofErr w:type="spellEnd"/>
+      <w:r>
+        <w:rPr>
+          <w:rFonts w:ascii="Calibri" w:eastAsia="Calibri" w:hAnsi="Calibri" w:cs="Calibri"/>
+          <w:color w:val="333333"/>
+          <w:sz w:val="22"/>
+          <w:szCs w:val="22"/>
+        </w:rPr>
+        <w:t xml:space="preserve">), sem sobrecarregar o processamento do </w:t>
+      </w:r>
+      <w:proofErr w:type="spellStart"/>
+      <w:r>
+        <w:rPr>
+          <w:rFonts w:ascii="Calibri" w:eastAsia="Calibri" w:hAnsi="Calibri" w:cs="Calibri"/>
+          <w:color w:val="333333"/>
+          <w:sz w:val="22"/>
+          <w:szCs w:val="22"/>
+        </w:rPr>
+        <w:t>backend</w:t>
+      </w:r>
+      <w:proofErr w:type="spellEnd"/>
+      <w:r>
+        <w:rPr>
+          <w:rFonts w:ascii="Calibri" w:eastAsia="Calibri" w:hAnsi="Calibri" w:cs="Calibri"/>
+          <w:color w:val="333333"/>
+          <w:sz w:val="22"/>
+          <w:szCs w:val="22"/>
+        </w:rPr>
+        <w:t xml:space="preserve">. O módulo </w:t>
+      </w:r>
+      <w:proofErr w:type="spellStart"/>
+      <w:r>
+        <w:rPr>
+          <w:rFonts w:ascii="Calibri" w:eastAsia="Calibri" w:hAnsi="Calibri" w:cs="Calibri"/>
+          <w:color w:val="333333"/>
+          <w:sz w:val="22"/>
+          <w:szCs w:val="22"/>
+        </w:rPr>
+        <w:t>src</w:t>
+      </w:r>
+      <w:proofErr w:type="spellEnd"/>
+      <w:r>
+        <w:rPr>
+          <w:rFonts w:ascii="Calibri" w:eastAsia="Calibri" w:hAnsi="Calibri" w:cs="Calibri"/>
+          <w:color w:val="333333"/>
+          <w:sz w:val="22"/>
+          <w:szCs w:val="22"/>
+        </w:rPr>
+        <w:t>/</w:t>
+      </w:r>
+      <w:proofErr w:type="spellStart"/>
+      <w:r>
+        <w:rPr>
+          <w:rFonts w:ascii="Calibri" w:eastAsia="Calibri" w:hAnsi="Calibri" w:cs="Calibri"/>
+          <w:color w:val="333333"/>
+          <w:sz w:val="22"/>
+          <w:szCs w:val="22"/>
+        </w:rPr>
+        <w:t>utils</w:t>
+      </w:r>
+      <w:proofErr w:type="spellEnd"/>
+      <w:r>
+        <w:rPr>
+          <w:rFonts w:ascii="Calibri" w:eastAsia="Calibri" w:hAnsi="Calibri" w:cs="Calibri"/>
+          <w:color w:val="333333"/>
+          <w:sz w:val="22"/>
+          <w:szCs w:val="22"/>
+        </w:rPr>
+        <w:t>/</w:t>
+      </w:r>
+      <w:proofErr w:type="spellStart"/>
+      <w:r>
+        <w:rPr>
+          <w:rFonts w:ascii="Calibri" w:eastAsia="Calibri" w:hAnsi="Calibri" w:cs="Calibri"/>
+          <w:color w:val="333333"/>
+          <w:sz w:val="22"/>
+          <w:szCs w:val="22"/>
+        </w:rPr>
+        <w:t>pdfGenerator.ts</w:t>
+      </w:r>
+      <w:proofErr w:type="spellEnd"/>
+      <w:r>
+        <w:rPr>
+          <w:rFonts w:ascii="Calibri" w:eastAsia="Calibri" w:hAnsi="Calibri" w:cs="Calibri"/>
+          <w:color w:val="333333"/>
+          <w:sz w:val="22"/>
+          <w:szCs w:val="22"/>
+        </w:rPr>
+        <w:t xml:space="preserve"> faz uso da biblioteca </w:t>
+      </w:r>
+      <w:proofErr w:type="spellStart"/>
+      <w:r>
+        <w:rPr>
+          <w:rFonts w:ascii="Calibri" w:eastAsia="Calibri" w:hAnsi="Calibri" w:cs="Calibri"/>
+          <w:color w:val="333333"/>
+          <w:sz w:val="22"/>
+          <w:szCs w:val="22"/>
+        </w:rPr>
+        <w:t>jspdf</w:t>
+      </w:r>
+      <w:proofErr w:type="spellEnd"/>
+      <w:r>
+        <w:rPr>
+          <w:rFonts w:ascii="Calibri" w:eastAsia="Calibri" w:hAnsi="Calibri" w:cs="Calibri"/>
+          <w:color w:val="333333"/>
+          <w:sz w:val="22"/>
+          <w:szCs w:val="22"/>
+        </w:rPr>
+        <w:t xml:space="preserve"> para construir dinamicamente documentos formatados no padrão corporativo da Dataprev, detalhando cada campo coletado pela IA e anexando o comando compilado no final do documento para cópia rápida.</w:t>
       </w:r>
     </w:p>
     <w:p>
@@ -4045,7 +6361,7 @@
         <w:keepNext/>
         <w:spacing w:before="240" w:after="120"/>
       </w:pPr>
-      <w:bookmarkStart w:id="13" w:name="_Toc233183131"/>
+      <w:bookmarkStart w:id="12" w:name="_Toc233183131"/>
       <w:r>
         <w:rPr>
           <w:rFonts w:ascii="Calibri" w:eastAsia="Calibri" w:hAnsi="Calibri" w:cs="Calibri"/>
@@ -4058,7 +6374,7 @@
         <w:lastRenderedPageBreak/>
         <w:t>5. Regras de Negócio e Base de Conhecimento</w:t>
       </w:r>
-      <w:bookmarkEnd w:id="13"/>
+      <w:bookmarkEnd w:id="12"/>
     </w:p>
     <w:p>
       <w:pPr>
@@ -4081,7 +6397,7 @@
         <w:keepNext/>
         <w:spacing w:before="240" w:after="120"/>
       </w:pPr>
-      <w:bookmarkStart w:id="14" w:name="_Toc233183132"/>
+      <w:bookmarkStart w:id="13" w:name="_Toc233183132"/>
       <w:r>
         <w:rPr>
           <w:rFonts w:ascii="Calibri" w:eastAsia="Calibri" w:hAnsi="Calibri" w:cs="Calibri"/>
@@ -4093,7 +6409,7 @@
         </w:rPr>
         <w:t>Validação de Nomenclatura — Norma N/PD/004/02</w:t>
       </w:r>
-      <w:bookmarkEnd w:id="14"/>
+      <w:bookmarkEnd w:id="13"/>
     </w:p>
     <w:p>
       <w:pPr>
@@ -4126,7 +6442,27 @@
           <w:sz w:val="22"/>
           <w:szCs w:val="22"/>
         </w:rPr>
-        <w:t>O prefixo deve possuir exatamente 13 caracteres estruturados (T d SIS d SUB d 999).</w:t>
+        <w:t xml:space="preserve">O prefixo deve possuir exatamente 13 caracteres estruturados (T d SIS </w:t>
+      </w:r>
+      <w:proofErr w:type="gramStart"/>
+      <w:r>
+        <w:rPr>
+          <w:rFonts w:ascii="Calibri" w:eastAsia="Calibri" w:hAnsi="Calibri" w:cs="Calibri"/>
+          <w:color w:val="333333"/>
+          <w:sz w:val="22"/>
+          <w:szCs w:val="22"/>
+        </w:rPr>
+        <w:t>d</w:t>
+      </w:r>
+      <w:proofErr w:type="gramEnd"/>
+      <w:r>
+        <w:rPr>
+          <w:rFonts w:ascii="Calibri" w:eastAsia="Calibri" w:hAnsi="Calibri" w:cs="Calibri"/>
+          <w:color w:val="333333"/>
+          <w:sz w:val="22"/>
+          <w:szCs w:val="22"/>
+        </w:rPr>
+        <w:t xml:space="preserve"> SUB d 999).</w:t>
       </w:r>
     </w:p>
     <w:p>
@@ -4145,7 +6481,27 @@
           <w:sz w:val="22"/>
           <w:szCs w:val="22"/>
         </w:rPr>
-        <w:t>O nome do arquivo/job não pode exceder 36 caracteres e deve estar em letras MAIÚSCULAS.</w:t>
+        <w:t>O nome do arquivo/</w:t>
+      </w:r>
+      <w:proofErr w:type="spellStart"/>
+      <w:r>
+        <w:rPr>
+          <w:rFonts w:ascii="Calibri" w:eastAsia="Calibri" w:hAnsi="Calibri" w:cs="Calibri"/>
+          <w:color w:val="333333"/>
+          <w:sz w:val="22"/>
+          <w:szCs w:val="22"/>
+        </w:rPr>
+        <w:t>job</w:t>
+      </w:r>
+      <w:proofErr w:type="spellEnd"/>
+      <w:r>
+        <w:rPr>
+          <w:rFonts w:ascii="Calibri" w:eastAsia="Calibri" w:hAnsi="Calibri" w:cs="Calibri"/>
+          <w:color w:val="333333"/>
+          <w:sz w:val="22"/>
+          <w:szCs w:val="22"/>
+        </w:rPr>
+        <w:t xml:space="preserve"> não pode exceder 36 caracteres e deve estar em letras MAIÚSCULAS.</w:t>
       </w:r>
     </w:p>
     <w:p>
@@ -4249,7 +6605,7 @@
         <w:keepNext/>
         <w:spacing w:before="240" w:after="120"/>
       </w:pPr>
-      <w:bookmarkStart w:id="15" w:name="_Toc233183133"/>
+      <w:bookmarkStart w:id="14" w:name="_Toc233183133"/>
       <w:r>
         <w:rPr>
           <w:rFonts w:ascii="Calibri" w:eastAsia="Calibri" w:hAnsi="Calibri" w:cs="Calibri"/>
@@ -4261,7 +6617,7 @@
         </w:rPr>
         <w:t>6. Guia de Instalação e Execução Local</w:t>
       </w:r>
-      <w:bookmarkEnd w:id="15"/>
+      <w:bookmarkEnd w:id="14"/>
     </w:p>
     <w:p>
       <w:pPr>
@@ -4284,7 +6640,7 @@
         <w:keepNext/>
         <w:spacing w:before="240" w:after="120"/>
       </w:pPr>
-      <w:bookmarkStart w:id="16" w:name="_Toc233183134"/>
+      <w:bookmarkStart w:id="15" w:name="_Toc233183134"/>
       <w:r>
         <w:rPr>
           <w:rFonts w:ascii="Calibri" w:eastAsia="Calibri" w:hAnsi="Calibri" w:cs="Calibri"/>
@@ -4296,7 +6652,7 @@
         </w:rPr>
         <w:t>Pré-requisitos mínimos</w:t>
       </w:r>
-      <w:bookmarkEnd w:id="16"/>
+      <w:bookmarkEnd w:id="15"/>
     </w:p>
     <w:p>
       <w:pPr>
@@ -4361,7 +6717,7 @@
         <w:keepNext/>
         <w:spacing w:before="240" w:after="120"/>
       </w:pPr>
-      <w:bookmarkStart w:id="17" w:name="_Toc233183135"/>
+      <w:bookmarkStart w:id="16" w:name="_Toc233183135"/>
       <w:r>
         <w:rPr>
           <w:rFonts w:ascii="Calibri" w:eastAsia="Calibri" w:hAnsi="Calibri" w:cs="Calibri"/>
@@ -4373,7 +6729,7 @@
         </w:rPr>
         <w:t>Passo a Passo de Instalação</w:t>
       </w:r>
-      <w:bookmarkEnd w:id="17"/>
+      <w:bookmarkEnd w:id="16"/>
     </w:p>
     <w:p>
       <w:pPr>
@@ -4391,8 +6747,39 @@
           <w:sz w:val="22"/>
           <w:szCs w:val="22"/>
         </w:rPr>
-        <w:t>Instalar dependências na raiz do projeto: npm install</w:t>
-      </w:r>
+        <w:t xml:space="preserve">Instalar dependências na raiz do projeto: </w:t>
+      </w:r>
+      <w:proofErr w:type="spellStart"/>
+      <w:r>
+        <w:rPr>
+          <w:rFonts w:ascii="Calibri" w:eastAsia="Calibri" w:hAnsi="Calibri" w:cs="Calibri"/>
+          <w:color w:val="333333"/>
+          <w:sz w:val="22"/>
+          <w:szCs w:val="22"/>
+        </w:rPr>
+        <w:t>npm</w:t>
+      </w:r>
+      <w:proofErr w:type="spellEnd"/>
+      <w:r>
+        <w:rPr>
+          <w:rFonts w:ascii="Calibri" w:eastAsia="Calibri" w:hAnsi="Calibri" w:cs="Calibri"/>
+          <w:color w:val="333333"/>
+          <w:sz w:val="22"/>
+          <w:szCs w:val="22"/>
+        </w:rPr>
+        <w:t xml:space="preserve"> </w:t>
+      </w:r>
+      <w:proofErr w:type="spellStart"/>
+      <w:r>
+        <w:rPr>
+          <w:rFonts w:ascii="Calibri" w:eastAsia="Calibri" w:hAnsi="Calibri" w:cs="Calibri"/>
+          <w:color w:val="333333"/>
+          <w:sz w:val="22"/>
+          <w:szCs w:val="22"/>
+        </w:rPr>
+        <w:t>install</w:t>
+      </w:r>
+      <w:proofErr w:type="spellEnd"/>
     </w:p>
     <w:p>
       <w:pPr>
@@ -4410,7 +6797,78 @@
           <w:sz w:val="22"/>
           <w:szCs w:val="22"/>
         </w:rPr>
-        <w:t>Renomear o arquivo .env.example para .env e preencher as variáveis DATABASE_URL, LIA_API_KEY, LIA_API_URL, LIA_API_MODEL e JWT_SECRET.</w:t>
+        <w:t xml:space="preserve">Renomear o </w:t>
+      </w:r>
+      <w:proofErr w:type="gramStart"/>
+      <w:r>
+        <w:rPr>
+          <w:rFonts w:ascii="Calibri" w:eastAsia="Calibri" w:hAnsi="Calibri" w:cs="Calibri"/>
+          <w:color w:val="333333"/>
+          <w:sz w:val="22"/>
+          <w:szCs w:val="22"/>
+        </w:rPr>
+        <w:t>arquivo .</w:t>
+      </w:r>
+      <w:proofErr w:type="spellStart"/>
+      <w:r>
+        <w:rPr>
+          <w:rFonts w:ascii="Calibri" w:eastAsia="Calibri" w:hAnsi="Calibri" w:cs="Calibri"/>
+          <w:color w:val="333333"/>
+          <w:sz w:val="22"/>
+          <w:szCs w:val="22"/>
+        </w:rPr>
+        <w:t>env</w:t>
+      </w:r>
+      <w:proofErr w:type="gramEnd"/>
+      <w:r>
+        <w:rPr>
+          <w:rFonts w:ascii="Calibri" w:eastAsia="Calibri" w:hAnsi="Calibri" w:cs="Calibri"/>
+          <w:color w:val="333333"/>
+          <w:sz w:val="22"/>
+          <w:szCs w:val="22"/>
+        </w:rPr>
+        <w:t>.example</w:t>
+      </w:r>
+      <w:proofErr w:type="spellEnd"/>
+      <w:r>
+        <w:rPr>
+          <w:rFonts w:ascii="Calibri" w:eastAsia="Calibri" w:hAnsi="Calibri" w:cs="Calibri"/>
+          <w:color w:val="333333"/>
+          <w:sz w:val="22"/>
+          <w:szCs w:val="22"/>
+        </w:rPr>
+        <w:t xml:space="preserve"> </w:t>
+      </w:r>
+      <w:proofErr w:type="gramStart"/>
+      <w:r>
+        <w:rPr>
+          <w:rFonts w:ascii="Calibri" w:eastAsia="Calibri" w:hAnsi="Calibri" w:cs="Calibri"/>
+          <w:color w:val="333333"/>
+          <w:sz w:val="22"/>
+          <w:szCs w:val="22"/>
+        </w:rPr>
+        <w:t>para .</w:t>
+      </w:r>
+      <w:proofErr w:type="spellStart"/>
+      <w:r>
+        <w:rPr>
+          <w:rFonts w:ascii="Calibri" w:eastAsia="Calibri" w:hAnsi="Calibri" w:cs="Calibri"/>
+          <w:color w:val="333333"/>
+          <w:sz w:val="22"/>
+          <w:szCs w:val="22"/>
+        </w:rPr>
+        <w:t>env</w:t>
+      </w:r>
+      <w:proofErr w:type="spellEnd"/>
+      <w:proofErr w:type="gramEnd"/>
+      <w:r>
+        <w:rPr>
+          <w:rFonts w:ascii="Calibri" w:eastAsia="Calibri" w:hAnsi="Calibri" w:cs="Calibri"/>
+          <w:color w:val="333333"/>
+          <w:sz w:val="22"/>
+          <w:szCs w:val="22"/>
+        </w:rPr>
+        <w:t xml:space="preserve"> e preencher as variáveis DATABASE_URL, LIA_API_KEY, LIA_API_URL, LIA_API_MODEL e JWT_SECRET.</w:t>
       </w:r>
     </w:p>
     <w:p>
@@ -4429,7 +6887,67 @@
           <w:sz w:val="22"/>
           <w:szCs w:val="22"/>
         </w:rPr>
-        <w:t>Executar as migrations no seu banco de dados para criar e estruturar as tabelas necessárias: node migrations/run.js ou executando os scripts SQL do diretório /migrations manualmente na ordem cronológica de criação.</w:t>
+        <w:t xml:space="preserve">Executar as </w:t>
+      </w:r>
+      <w:proofErr w:type="spellStart"/>
+      <w:r>
+        <w:rPr>
+          <w:rFonts w:ascii="Calibri" w:eastAsia="Calibri" w:hAnsi="Calibri" w:cs="Calibri"/>
+          <w:color w:val="333333"/>
+          <w:sz w:val="22"/>
+          <w:szCs w:val="22"/>
+        </w:rPr>
+        <w:t>migrations</w:t>
+      </w:r>
+      <w:proofErr w:type="spellEnd"/>
+      <w:r>
+        <w:rPr>
+          <w:rFonts w:ascii="Calibri" w:eastAsia="Calibri" w:hAnsi="Calibri" w:cs="Calibri"/>
+          <w:color w:val="333333"/>
+          <w:sz w:val="22"/>
+          <w:szCs w:val="22"/>
+        </w:rPr>
+        <w:t xml:space="preserve"> no seu banco de dados para criar e estruturar as tabelas necessárias: node </w:t>
+      </w:r>
+      <w:proofErr w:type="spellStart"/>
+      <w:r>
+        <w:rPr>
+          <w:rFonts w:ascii="Calibri" w:eastAsia="Calibri" w:hAnsi="Calibri" w:cs="Calibri"/>
+          <w:color w:val="333333"/>
+          <w:sz w:val="22"/>
+          <w:szCs w:val="22"/>
+        </w:rPr>
+        <w:t>migrations</w:t>
+      </w:r>
+      <w:proofErr w:type="spellEnd"/>
+      <w:r>
+        <w:rPr>
+          <w:rFonts w:ascii="Calibri" w:eastAsia="Calibri" w:hAnsi="Calibri" w:cs="Calibri"/>
+          <w:color w:val="333333"/>
+          <w:sz w:val="22"/>
+          <w:szCs w:val="22"/>
+        </w:rPr>
+        <w:t>/run.js ou executando os scripts SQL do diretório /</w:t>
+      </w:r>
+      <w:proofErr w:type="spellStart"/>
+      <w:r>
+        <w:rPr>
+          <w:rFonts w:ascii="Calibri" w:eastAsia="Calibri" w:hAnsi="Calibri" w:cs="Calibri"/>
+          <w:color w:val="333333"/>
+          <w:sz w:val="22"/>
+          <w:szCs w:val="22"/>
+        </w:rPr>
+        <w:t>migrations</w:t>
+      </w:r>
+      <w:proofErr w:type="spellEnd"/>
+      <w:r>
+        <w:rPr>
+          <w:rFonts w:ascii="Calibri" w:eastAsia="Calibri" w:hAnsi="Calibri" w:cs="Calibri"/>
+          <w:color w:val="333333"/>
+          <w:sz w:val="22"/>
+          <w:szCs w:val="22"/>
+        </w:rPr>
+        <w:t xml:space="preserve"> manualmente na ordem cronológica de criação.</w:t>
       </w:r>
     </w:p>
     <w:p>
@@ -4448,8 +6966,79 @@
           <w:sz w:val="22"/>
           <w:szCs w:val="22"/>
         </w:rPr>
-        <w:t>Iniciar o servidor backend em segundo plano: npm run server</w:t>
-      </w:r>
+        <w:t xml:space="preserve">Iniciar o servidor </w:t>
+      </w:r>
+      <w:proofErr w:type="spellStart"/>
+      <w:r>
+        <w:rPr>
+          <w:rFonts w:ascii="Calibri" w:eastAsia="Calibri" w:hAnsi="Calibri" w:cs="Calibri"/>
+          <w:color w:val="333333"/>
+          <w:sz w:val="22"/>
+          <w:szCs w:val="22"/>
+        </w:rPr>
+        <w:t>backend</w:t>
+      </w:r>
+      <w:proofErr w:type="spellEnd"/>
+      <w:r>
+        <w:rPr>
+          <w:rFonts w:ascii="Calibri" w:eastAsia="Calibri" w:hAnsi="Calibri" w:cs="Calibri"/>
+          <w:color w:val="333333"/>
+          <w:sz w:val="22"/>
+          <w:szCs w:val="22"/>
+        </w:rPr>
+        <w:t xml:space="preserve"> em segundo plano: </w:t>
+      </w:r>
+      <w:proofErr w:type="spellStart"/>
+      <w:r>
+        <w:rPr>
+          <w:rFonts w:ascii="Calibri" w:eastAsia="Calibri" w:hAnsi="Calibri" w:cs="Calibri"/>
+          <w:color w:val="333333"/>
+          <w:sz w:val="22"/>
+          <w:szCs w:val="22"/>
+        </w:rPr>
+        <w:t>npm</w:t>
+      </w:r>
+      <w:proofErr w:type="spellEnd"/>
+      <w:r>
+        <w:rPr>
+          <w:rFonts w:ascii="Calibri" w:eastAsia="Calibri" w:hAnsi="Calibri" w:cs="Calibri"/>
+          <w:color w:val="333333"/>
+          <w:sz w:val="22"/>
+          <w:szCs w:val="22"/>
+        </w:rPr>
+        <w:t xml:space="preserve"> </w:t>
+      </w:r>
+      <w:proofErr w:type="spellStart"/>
+      <w:r>
+        <w:rPr>
+          <w:rFonts w:ascii="Calibri" w:eastAsia="Calibri" w:hAnsi="Calibri" w:cs="Calibri"/>
+          <w:color w:val="333333"/>
+          <w:sz w:val="22"/>
+          <w:szCs w:val="22"/>
+        </w:rPr>
+        <w:t>run</w:t>
+      </w:r>
+      <w:proofErr w:type="spellEnd"/>
+      <w:r>
+        <w:rPr>
+          <w:rFonts w:ascii="Calibri" w:eastAsia="Calibri" w:hAnsi="Calibri" w:cs="Calibri"/>
+          <w:color w:val="333333"/>
+          <w:sz w:val="22"/>
+          <w:szCs w:val="22"/>
+        </w:rPr>
+        <w:t xml:space="preserve"> </w:t>
+      </w:r>
+      <w:proofErr w:type="gramStart"/>
+      <w:r>
+        <w:rPr>
+          <w:rFonts w:ascii="Calibri" w:eastAsia="Calibri" w:hAnsi="Calibri" w:cs="Calibri"/>
+          <w:color w:val="333333"/>
+          <w:sz w:val="22"/>
+          <w:szCs w:val="22"/>
+        </w:rPr>
+        <w:t>server</w:t>
+      </w:r>
+      <w:proofErr w:type="gramEnd"/>
     </w:p>
     <w:p>
       <w:pPr>
@@ -4467,8 +7056,79 @@
           <w:sz w:val="22"/>
           <w:szCs w:val="22"/>
         </w:rPr>
-        <w:t>Iniciar o servidor frontend para desenvolvimento local: npm run dev</w:t>
-      </w:r>
+        <w:t xml:space="preserve">Iniciar o servidor </w:t>
+      </w:r>
+      <w:proofErr w:type="spellStart"/>
+      <w:r>
+        <w:rPr>
+          <w:rFonts w:ascii="Calibri" w:eastAsia="Calibri" w:hAnsi="Calibri" w:cs="Calibri"/>
+          <w:color w:val="333333"/>
+          <w:sz w:val="22"/>
+          <w:szCs w:val="22"/>
+        </w:rPr>
+        <w:t>frontend</w:t>
+      </w:r>
+      <w:proofErr w:type="spellEnd"/>
+      <w:r>
+        <w:rPr>
+          <w:rFonts w:ascii="Calibri" w:eastAsia="Calibri" w:hAnsi="Calibri" w:cs="Calibri"/>
+          <w:color w:val="333333"/>
+          <w:sz w:val="22"/>
+          <w:szCs w:val="22"/>
+        </w:rPr>
+        <w:t xml:space="preserve"> para desenvolvimento local: </w:t>
+      </w:r>
+      <w:proofErr w:type="spellStart"/>
+      <w:r>
+        <w:rPr>
+          <w:rFonts w:ascii="Calibri" w:eastAsia="Calibri" w:hAnsi="Calibri" w:cs="Calibri"/>
+          <w:color w:val="333333"/>
+          <w:sz w:val="22"/>
+          <w:szCs w:val="22"/>
+        </w:rPr>
+        <w:t>npm</w:t>
+      </w:r>
+      <w:proofErr w:type="spellEnd"/>
+      <w:r>
+        <w:rPr>
+          <w:rFonts w:ascii="Calibri" w:eastAsia="Calibri" w:hAnsi="Calibri" w:cs="Calibri"/>
+          <w:color w:val="333333"/>
+          <w:sz w:val="22"/>
+          <w:szCs w:val="22"/>
+        </w:rPr>
+        <w:t xml:space="preserve"> </w:t>
+      </w:r>
+      <w:proofErr w:type="spellStart"/>
+      <w:r>
+        <w:rPr>
+          <w:rFonts w:ascii="Calibri" w:eastAsia="Calibri" w:hAnsi="Calibri" w:cs="Calibri"/>
+          <w:color w:val="333333"/>
+          <w:sz w:val="22"/>
+          <w:szCs w:val="22"/>
+        </w:rPr>
+        <w:t>run</w:t>
+      </w:r>
+      <w:proofErr w:type="spellEnd"/>
+      <w:r>
+        <w:rPr>
+          <w:rFonts w:ascii="Calibri" w:eastAsia="Calibri" w:hAnsi="Calibri" w:cs="Calibri"/>
+          <w:color w:val="333333"/>
+          <w:sz w:val="22"/>
+          <w:szCs w:val="22"/>
+        </w:rPr>
+        <w:t xml:space="preserve"> </w:t>
+      </w:r>
+      <w:proofErr w:type="spellStart"/>
+      <w:r>
+        <w:rPr>
+          <w:rFonts w:ascii="Calibri" w:eastAsia="Calibri" w:hAnsi="Calibri" w:cs="Calibri"/>
+          <w:color w:val="333333"/>
+          <w:sz w:val="22"/>
+          <w:szCs w:val="22"/>
+        </w:rPr>
+        <w:t>dev</w:t>
+      </w:r>
+      <w:proofErr w:type="spellEnd"/>
     </w:p>
     <w:p>
       <w:pPr>
@@ -4499,7 +7159,7 @@
           <w14:ligatures w14:val="standardContextual"/>
         </w:rPr>
       </w:pPr>
-      <w:bookmarkStart w:id="18" w:name="_Toc233183136"/>
+      <w:bookmarkStart w:id="17" w:name="_Toc233183136"/>
       <w:r>
         <w:rPr>
           <w:rFonts w:ascii="Calibri" w:hAnsi="Calibri" w:cs="Calibri"/>
@@ -4512,7 +7172,7 @@
         <w:lastRenderedPageBreak/>
         <w:t>7. Benefícios Esperados e Valor Institucional</w:t>
       </w:r>
-      <w:bookmarkEnd w:id="18"/>
+      <w:bookmarkEnd w:id="17"/>
     </w:p>
     <w:p>
       <w:pPr>
@@ -4530,7 +7190,27 @@
           <w:sz w:val="22"/>
           <w:szCs w:val="22"/>
         </w:rPr>
-        <w:t>A adoção do Jobs IA representa mais do que uma evolução tecnológica: trata-se de uma mudança concreta na forma como equipes técnicas interagem com normas, parâmetros e rotinas operacionais críticas. Ao transformar um processo historicamente manual, fragmentado e sujeito a interpretações individuais em uma experiência guiada, padronizada e assistida por inteligência artificial, a solução contribui diretamente para a redução de retrabalho, maior previsibilidade operacional e aumento da confiança nos ciclos de execução de workloads.</w:t>
+        <w:t xml:space="preserve">A adoção do Jobs IA representa mais do que uma evolução tecnológica: trata-se de uma mudança concreta na forma como equipes técnicas interagem com normas, parâmetros e rotinas operacionais críticas. Ao transformar um processo historicamente manual, fragmentado e sujeito a interpretações individuais em uma experiência guiada, padronizada e assistida por inteligência artificial, a solução contribui diretamente para a redução de retrabalho, maior previsibilidade operacional e aumento da confiança nos ciclos de execução de </w:t>
+      </w:r>
+      <w:proofErr w:type="spellStart"/>
+      <w:r>
+        <w:rPr>
+          <w:rFonts w:ascii="Calibri" w:hAnsi="Calibri" w:cs="Calibri"/>
+          <w:color w:val="333333"/>
+          <w:sz w:val="22"/>
+          <w:szCs w:val="22"/>
+        </w:rPr>
+        <w:t>workloads</w:t>
+      </w:r>
+      <w:proofErr w:type="spellEnd"/>
+      <w:r>
+        <w:rPr>
+          <w:rFonts w:ascii="Calibri" w:hAnsi="Calibri" w:cs="Calibri"/>
+          <w:color w:val="333333"/>
+          <w:sz w:val="22"/>
+          <w:szCs w:val="22"/>
+        </w:rPr>
+        <w:t>.</w:t>
       </w:r>
     </w:p>
     <w:p>
@@ -4637,7 +7317,7 @@
           <w14:ligatures w14:val="standardContextual"/>
         </w:rPr>
       </w:pPr>
-      <w:bookmarkStart w:id="19" w:name="_Toc233183137"/>
+      <w:bookmarkStart w:id="18" w:name="_Toc233183137"/>
       <w:r>
         <w:rPr>
           <w:rFonts w:ascii="Calibri" w:hAnsi="Calibri" w:cs="Calibri"/>
@@ -4649,7 +7329,7 @@
         </w:rPr>
         <w:t>8. Jornada do Usuário e Experiência Operacional</w:t>
       </w:r>
-      <w:bookmarkEnd w:id="19"/>
+      <w:bookmarkEnd w:id="18"/>
     </w:p>
     <w:p>
       <w:pPr>
@@ -4667,7 +7347,47 @@
           <w:sz w:val="22"/>
           <w:szCs w:val="22"/>
         </w:rPr>
-        <w:t>A experiência proposta pelo Jobs IA foi desenhada para que o usuário não precise conhecer previamente todos os detalhes técnicos de cada workload. Em vez de iniciar o processo a partir de um formulário rígido, o usuário conversa com o agente, informa o objetivo da execução e é conduzido progressivamente até a composição final do comando. Esse modelo reduz a carga cognitiva, aproxima a ferramenta da linguagem natural dos analistas e torna o processo mais acessível sem abrir mão do rigor técnico.</w:t>
+        <w:t xml:space="preserve">A experiência proposta pelo Jobs IA foi desenhada para que o usuário não precise conhecer previamente todos os detalhes técnicos de cada </w:t>
+      </w:r>
+      <w:proofErr w:type="spellStart"/>
+      <w:r>
+        <w:rPr>
+          <w:rFonts w:ascii="Calibri" w:hAnsi="Calibri" w:cs="Calibri"/>
+          <w:color w:val="333333"/>
+          <w:sz w:val="22"/>
+          <w:szCs w:val="22"/>
+        </w:rPr>
+        <w:t>workload</w:t>
+      </w:r>
+      <w:proofErr w:type="spellEnd"/>
+      <w:r>
+        <w:rPr>
+          <w:rFonts w:ascii="Calibri" w:hAnsi="Calibri" w:cs="Calibri"/>
+          <w:color w:val="333333"/>
+          <w:sz w:val="22"/>
+          <w:szCs w:val="22"/>
+        </w:rPr>
+        <w:t xml:space="preserve">. Em vez de iniciar o processo a partir de um formulário rígido, o usuário conversa com o agente, informa o objetivo da execução e é conduzido progressivamente até a composição final do comando. Esse modelo reduz a carga cognitiva, aproxima a ferramenta da linguagem natural dos analistas e torna o processo mais acessível sem </w:t>
+      </w:r>
+      <w:proofErr w:type="gramStart"/>
+      <w:r>
+        <w:rPr>
+          <w:rFonts w:ascii="Calibri" w:hAnsi="Calibri" w:cs="Calibri"/>
+          <w:color w:val="333333"/>
+          <w:sz w:val="22"/>
+          <w:szCs w:val="22"/>
+        </w:rPr>
+        <w:t>abrir mão do</w:t>
+      </w:r>
+      <w:proofErr w:type="gramEnd"/>
+      <w:r>
+        <w:rPr>
+          <w:rFonts w:ascii="Calibri" w:hAnsi="Calibri" w:cs="Calibri"/>
+          <w:color w:val="333333"/>
+          <w:sz w:val="22"/>
+          <w:szCs w:val="22"/>
+        </w:rPr>
+        <w:t xml:space="preserve"> rigor técnico.</w:t>
       </w:r>
     </w:p>
     <w:p>
@@ -4689,7 +7409,27 @@
           <w:sz w:val="22"/>
           <w:szCs w:val="22"/>
         </w:rPr>
-        <w:t>O usuário descreve a necessidade de execução do job em linguagem natural.</w:t>
+        <w:t xml:space="preserve">O usuário descreve a necessidade de execução do </w:t>
+      </w:r>
+      <w:proofErr w:type="spellStart"/>
+      <w:r>
+        <w:rPr>
+          <w:rFonts w:ascii="Calibri" w:hAnsi="Calibri" w:cs="Calibri"/>
+          <w:color w:val="333333"/>
+          <w:sz w:val="22"/>
+          <w:szCs w:val="22"/>
+        </w:rPr>
+        <w:t>job</w:t>
+      </w:r>
+      <w:proofErr w:type="spellEnd"/>
+      <w:r>
+        <w:rPr>
+          <w:rFonts w:ascii="Calibri" w:hAnsi="Calibri" w:cs="Calibri"/>
+          <w:color w:val="333333"/>
+          <w:sz w:val="22"/>
+          <w:szCs w:val="22"/>
+        </w:rPr>
+        <w:t xml:space="preserve"> em linguagem natural.</w:t>
       </w:r>
     </w:p>
     <w:p>
@@ -4707,7 +7447,27 @@
           <w:sz w:val="22"/>
           <w:szCs w:val="22"/>
         </w:rPr>
-        <w:t>O agente identifica o tipo de workload mais compatível com a solicitação.</w:t>
+        <w:t xml:space="preserve">O agente identifica o tipo de </w:t>
+      </w:r>
+      <w:proofErr w:type="spellStart"/>
+      <w:r>
+        <w:rPr>
+          <w:rFonts w:ascii="Calibri" w:hAnsi="Calibri" w:cs="Calibri"/>
+          <w:color w:val="333333"/>
+          <w:sz w:val="22"/>
+          <w:szCs w:val="22"/>
+        </w:rPr>
+        <w:t>workload</w:t>
+      </w:r>
+      <w:proofErr w:type="spellEnd"/>
+      <w:r>
+        <w:rPr>
+          <w:rFonts w:ascii="Calibri" w:hAnsi="Calibri" w:cs="Calibri"/>
+          <w:color w:val="333333"/>
+          <w:sz w:val="22"/>
+          <w:szCs w:val="22"/>
+        </w:rPr>
+        <w:t xml:space="preserve"> mais compatível com a solicitação.</w:t>
       </w:r>
     </w:p>
     <w:p>
@@ -4774,7 +7534,7 @@
           <w14:ligatures w14:val="standardContextual"/>
         </w:rPr>
       </w:pPr>
-      <w:bookmarkStart w:id="20" w:name="_Toc233183138"/>
+      <w:bookmarkStart w:id="19" w:name="_Toc233183138"/>
       <w:r>
         <w:rPr>
           <w:rFonts w:ascii="Calibri" w:hAnsi="Calibri" w:cs="Calibri"/>
@@ -4786,7 +7546,7 @@
         </w:rPr>
         <w:t>9. Governança, Auditoria e Manutenção do Conhecimento</w:t>
       </w:r>
-      <w:bookmarkEnd w:id="20"/>
+      <w:bookmarkEnd w:id="19"/>
     </w:p>
     <w:p>
       <w:pPr>
@@ -4804,7 +7564,27 @@
           <w:sz w:val="22"/>
           <w:szCs w:val="22"/>
         </w:rPr>
-        <w:t>Para que o Jobs IA permaneça confiável ao longo do tempo, é essencial que a base de conhecimento seja tratada como um ativo institucional vivo. Prompts de sistema, normas, dicionários e mapeamentos de jobs devem passar por ciclos controlados de revisão, aprovação e atualização. Essa governança evita que a IA utilize referências obsoletas e garante que os artefatos gerados estejam alinhados com as práticas vigentes da organização.</w:t>
+        <w:t xml:space="preserve">Para que o Jobs IA permaneça confiável ao longo do tempo, é essencial que a base de conhecimento seja tratada como um ativo institucional vivo. Prompts de sistema, normas, dicionários e mapeamentos de </w:t>
+      </w:r>
+      <w:proofErr w:type="spellStart"/>
+      <w:r>
+        <w:rPr>
+          <w:rFonts w:ascii="Calibri" w:hAnsi="Calibri" w:cs="Calibri"/>
+          <w:color w:val="333333"/>
+          <w:sz w:val="22"/>
+          <w:szCs w:val="22"/>
+        </w:rPr>
+        <w:t>jobs</w:t>
+      </w:r>
+      <w:proofErr w:type="spellEnd"/>
+      <w:r>
+        <w:rPr>
+          <w:rFonts w:ascii="Calibri" w:hAnsi="Calibri" w:cs="Calibri"/>
+          <w:color w:val="333333"/>
+          <w:sz w:val="22"/>
+          <w:szCs w:val="22"/>
+        </w:rPr>
+        <w:t xml:space="preserve"> devem passar por ciclos controlados de revisão, aprovação e atualização. Essa governança evita que a IA utilize referências obsoletas e garante que os artefatos gerados estejam alinhados com as práticas vigentes da organização.</w:t>
       </w:r>
     </w:p>
     <w:p>
@@ -4893,7 +7673,7 @@
           <w14:ligatures w14:val="standardContextual"/>
         </w:rPr>
       </w:pPr>
-      <w:bookmarkStart w:id="21" w:name="_Toc233183139"/>
+      <w:bookmarkStart w:id="20" w:name="_Toc233183139"/>
       <w:r>
         <w:rPr>
           <w:rFonts w:ascii="Calibri" w:hAnsi="Calibri" w:cs="Calibri"/>
@@ -4904,9 +7684,33 @@
           <w:szCs w:val="36"/>
         </w:rPr>
         <w:lastRenderedPageBreak/>
-        <w:t>10. Observabilidade, Qualidade e Continuidade Operacional</w:t>
-      </w:r>
-      <w:bookmarkEnd w:id="21"/>
+        <w:t xml:space="preserve">10. </w:t>
+      </w:r>
+      <w:proofErr w:type="spellStart"/>
+      <w:r>
+        <w:rPr>
+          <w:rFonts w:ascii="Calibri" w:hAnsi="Calibri" w:cs="Calibri"/>
+          <w:b/>
+          <w:bCs/>
+          <w:color w:val="1B365D"/>
+          <w:sz w:val="36"/>
+          <w:szCs w:val="36"/>
+        </w:rPr>
+        <w:t>Observabilidade</w:t>
+      </w:r>
+      <w:proofErr w:type="spellEnd"/>
+      <w:r>
+        <w:rPr>
+          <w:rFonts w:ascii="Calibri" w:hAnsi="Calibri" w:cs="Calibri"/>
+          <w:b/>
+          <w:bCs/>
+          <w:color w:val="1B365D"/>
+          <w:sz w:val="36"/>
+          <w:szCs w:val="36"/>
+        </w:rPr>
+        <w:t>, Qualidade e Continuidade Operacional</w:t>
+      </w:r>
+      <w:bookmarkEnd w:id="20"/>
     </w:p>
     <w:p>
       <w:pPr>
@@ -4924,7 +7728,27 @@
           <w:sz w:val="22"/>
           <w:szCs w:val="22"/>
         </w:rPr>
-        <w:t>A continuidade operacional do Jobs IA depende da capacidade de identificar falhas rapidamente, compreender o comportamento da aplicação e acompanhar indicadores de uso. Recomenda-se que o backend registre eventos relevantes, como autenticações, chamadas à LIA API, erros de validação, geração de checklists e indisponibilidades de serviços externos. Esses dados permitem análises posteriores e apoiam decisões sobre melhoria de desempenho, escalabilidade e estabilidade.</w:t>
+        <w:t xml:space="preserve">A continuidade operacional do Jobs IA depende da capacidade de identificar falhas rapidamente, compreender o comportamento da aplicação e acompanhar indicadores de uso. Recomenda-se que o </w:t>
+      </w:r>
+      <w:proofErr w:type="spellStart"/>
+      <w:r>
+        <w:rPr>
+          <w:rFonts w:ascii="Calibri" w:hAnsi="Calibri" w:cs="Calibri"/>
+          <w:color w:val="333333"/>
+          <w:sz w:val="22"/>
+          <w:szCs w:val="22"/>
+        </w:rPr>
+        <w:t>backend</w:t>
+      </w:r>
+      <w:proofErr w:type="spellEnd"/>
+      <w:r>
+        <w:rPr>
+          <w:rFonts w:ascii="Calibri" w:hAnsi="Calibri" w:cs="Calibri"/>
+          <w:color w:val="333333"/>
+          <w:sz w:val="22"/>
+          <w:szCs w:val="22"/>
+        </w:rPr>
+        <w:t xml:space="preserve"> registre eventos relevantes, como autenticações, chamadas à LIA API, erros de validação, geração de checklists e indisponibilidades de serviços externos. Esses dados permitem análises posteriores e apoiam decisões sobre melhoria de desempenho, escalabilidade e estabilidade.</w:t>
       </w:r>
     </w:p>
     <w:tbl>
@@ -5000,7 +7824,7 @@
           <w14:ligatures w14:val="standardContextual"/>
         </w:rPr>
       </w:pPr>
-      <w:bookmarkStart w:id="22" w:name="_Toc233183140"/>
+      <w:bookmarkStart w:id="21" w:name="_Toc233183140"/>
       <w:r>
         <w:rPr>
           <w:rFonts w:ascii="Calibri" w:hAnsi="Calibri" w:cs="Calibri"/>
@@ -5012,7 +7836,7 @@
         </w:rPr>
         <w:t>11. Riscos, Mitigações e Boas Práticas</w:t>
       </w:r>
-      <w:bookmarkEnd w:id="22"/>
+      <w:bookmarkEnd w:id="21"/>
     </w:p>
     <w:p>
       <w:pPr>
@@ -5030,7 +7854,27 @@
           <w:sz w:val="22"/>
           <w:szCs w:val="22"/>
         </w:rPr>
-        <w:t>Como qualquer solução baseada em automação e inteligência artificial, o Jobs IA deve ser operado com controles adequados. A IA atua como apoio à tomada de decisão e à composição técnica, mas a responsabilidade final sobre homologação, execução e validação do workload permanece com os profissionais responsáveis pelo processo. Por isso, recomenda-se que os comandos gerados sejam sempre revisados em cenários críticos, especialmente quando envolverem ambientes produtivos, rotinas sensíveis ou dados de alta criticidade.</w:t>
+        <w:t xml:space="preserve">Como qualquer solução baseada em automação e inteligência artificial, o Jobs IA deve ser operado com controles adequados. A IA atua como apoio à tomada de decisão e à composição técnica, mas a responsabilidade final sobre homologação, execução e validação do </w:t>
+      </w:r>
+      <w:proofErr w:type="spellStart"/>
+      <w:r>
+        <w:rPr>
+          <w:rFonts w:ascii="Calibri" w:hAnsi="Calibri" w:cs="Calibri"/>
+          <w:color w:val="333333"/>
+          <w:sz w:val="22"/>
+          <w:szCs w:val="22"/>
+        </w:rPr>
+        <w:t>workload</w:t>
+      </w:r>
+      <w:proofErr w:type="spellEnd"/>
+      <w:r>
+        <w:rPr>
+          <w:rFonts w:ascii="Calibri" w:hAnsi="Calibri" w:cs="Calibri"/>
+          <w:color w:val="333333"/>
+          <w:sz w:val="22"/>
+          <w:szCs w:val="22"/>
+        </w:rPr>
+        <w:t xml:space="preserve"> permanece com os profissionais responsáveis pelo processo. Por isso, recomenda-se que os comandos gerados sejam sempre revisados em cenários críticos, especialmente quando envolverem ambientes produtivos, rotinas sensíveis ou dados de alta criticidade.</w:t>
       </w:r>
     </w:p>
     <w:p>
@@ -5119,7 +7963,7 @@
           <w14:ligatures w14:val="standardContextual"/>
         </w:rPr>
       </w:pPr>
-      <w:bookmarkStart w:id="23" w:name="_Toc233183141"/>
+      <w:bookmarkStart w:id="22" w:name="_Toc233183141"/>
       <w:r>
         <w:rPr>
           <w:rFonts w:ascii="Calibri" w:hAnsi="Calibri" w:cs="Calibri"/>
@@ -5129,134 +7973,9 @@
           <w:sz w:val="36"/>
           <w:szCs w:val="36"/>
         </w:rPr>
-        <w:t>12. Roadmap Evolutivo Recomendado</w:t>
-      </w:r>
-      <w:bookmarkEnd w:id="23"/>
-    </w:p>
-    <w:p>
-      <w:pPr>
-        <w:spacing w:before="120" w:after="120" w:line="288" w:lineRule="auto"/>
-        <w:jc w:val="both"/>
-        <w:rPr>
-          <w:kern w:val="2"/>
-          <w14:ligatures w14:val="standardContextual"/>
-        </w:rPr>
-      </w:pPr>
-      <w:r>
-        <w:rPr>
-          <w:rFonts w:ascii="Calibri" w:hAnsi="Calibri" w:cs="Calibri"/>
-          <w:color w:val="333333"/>
-          <w:sz w:val="22"/>
-          <w:szCs w:val="22"/>
-        </w:rPr>
-        <w:t>A arquitetura atual já oferece uma base sólida para evolução incremental. O roadmap recomendado prioriza melhorias que aumentem segurança, governança, rastreabilidade e capacidade de integração com processos corporativos existentes, preservando a simplicidade da experiência do usuário.</w:t>
-      </w:r>
-    </w:p>
-    <w:p>
-      <w:pPr>
-        <w:pStyle w:val="PargrafodaLista"/>
-        <w:numPr>
-          <w:ilvl w:val="0"/>
-          <w:numId w:val="6"/>
-        </w:numPr>
-        <w:rPr>
-          <w:kern w:val="2"/>
-          <w14:ligatures w14:val="standardContextual"/>
-        </w:rPr>
-      </w:pPr>
-      <w:r>
-        <w:rPr>
-          <w:rFonts w:ascii="Calibri" w:hAnsi="Calibri" w:cs="Calibri"/>
-          <w:color w:val="333333"/>
-          <w:sz w:val="22"/>
-          <w:szCs w:val="22"/>
-        </w:rPr>
-        <w:t>Implementar perfis de acesso mais granulares, diferenciando usuários comuns, validadores técnicos e administradores.</w:t>
-      </w:r>
-    </w:p>
-    <w:p>
-      <w:pPr>
-        <w:pStyle w:val="PargrafodaLista"/>
-        <w:numPr>
-          <w:ilvl w:val="0"/>
-          <w:numId w:val="6"/>
-        </w:numPr>
-      </w:pPr>
-      <w:r>
-        <w:rPr>
-          <w:rFonts w:ascii="Calibri" w:hAnsi="Calibri" w:cs="Calibri"/>
-          <w:color w:val="333333"/>
-          <w:sz w:val="22"/>
-          <w:szCs w:val="22"/>
-        </w:rPr>
-        <w:t>Criar trilhas detalhadas de auditoria para alterações em normas, dicionários, prompts e parâmetros de jobs.</w:t>
-      </w:r>
-    </w:p>
-    <w:p>
-      <w:pPr>
-        <w:pStyle w:val="PargrafodaLista"/>
-        <w:numPr>
-          <w:ilvl w:val="0"/>
-          <w:numId w:val="6"/>
-        </w:numPr>
-      </w:pPr>
-      <w:r>
-        <w:rPr>
-          <w:rFonts w:ascii="Calibri" w:hAnsi="Calibri" w:cs="Calibri"/>
-          <w:color w:val="333333"/>
-          <w:sz w:val="22"/>
-          <w:szCs w:val="22"/>
-        </w:rPr>
-        <w:t>Adicionar painel gerencial com indicadores de uso, produtividade e qualidade dos checklists gerados.</w:t>
-      </w:r>
-    </w:p>
-    <w:p>
-      <w:pPr>
-        <w:pStyle w:val="PargrafodaLista"/>
-        <w:numPr>
-          <w:ilvl w:val="0"/>
-          <w:numId w:val="6"/>
-        </w:numPr>
-      </w:pPr>
-      <w:r>
-        <w:rPr>
-          <w:rFonts w:ascii="Calibri" w:hAnsi="Calibri" w:cs="Calibri"/>
-          <w:color w:val="333333"/>
-          <w:sz w:val="22"/>
-          <w:szCs w:val="22"/>
-        </w:rPr>
-        <w:t>Evoluir o mecanismo de validação para simulações prévias de comandos antes da execução operacional.</w:t>
-      </w:r>
-    </w:p>
-    <w:p>
-      <w:pPr>
-        <w:pStyle w:val="PargrafodaLista"/>
-        <w:numPr>
-          <w:ilvl w:val="0"/>
-          <w:numId w:val="6"/>
-        </w:numPr>
-      </w:pPr>
-      <w:r>
-        <w:rPr>
-          <w:rFonts w:ascii="Calibri" w:hAnsi="Calibri" w:cs="Calibri"/>
-          <w:color w:val="333333"/>
-          <w:sz w:val="22"/>
-          <w:szCs w:val="22"/>
-        </w:rPr>
-        <w:t>Avaliar integração com catálogos internos, repositórios de documentação e ferramentas corporativas de observabilidade.</w:t>
-      </w:r>
-    </w:p>
-    <w:p>
-      <w:pPr>
-        <w:pStyle w:val="Ttulo1"/>
-        <w:keepNext/>
-        <w:spacing w:before="240" w:after="120"/>
-        <w:rPr>
-          <w:kern w:val="36"/>
-          <w14:ligatures w14:val="standardContextual"/>
-        </w:rPr>
-      </w:pPr>
-      <w:bookmarkStart w:id="24" w:name="_Toc233183142"/>
+        <w:t xml:space="preserve">12. </w:t>
+      </w:r>
+      <w:proofErr w:type="spellStart"/>
       <w:r>
         <w:rPr>
           <w:rFonts w:ascii="Calibri" w:hAnsi="Calibri" w:cs="Calibri"/>
@@ -5266,10 +7985,219 @@
           <w:sz w:val="36"/>
           <w:szCs w:val="36"/>
         </w:rPr>
+        <w:t>Roadmap</w:t>
+      </w:r>
+      <w:proofErr w:type="spellEnd"/>
+      <w:r>
+        <w:rPr>
+          <w:rFonts w:ascii="Calibri" w:hAnsi="Calibri" w:cs="Calibri"/>
+          <w:b/>
+          <w:bCs/>
+          <w:color w:val="1B365D"/>
+          <w:sz w:val="36"/>
+          <w:szCs w:val="36"/>
+        </w:rPr>
+        <w:t xml:space="preserve"> Evolutivo Recomendado</w:t>
+      </w:r>
+      <w:bookmarkEnd w:id="22"/>
+    </w:p>
+    <w:p>
+      <w:pPr>
+        <w:spacing w:before="120" w:after="120" w:line="288" w:lineRule="auto"/>
+        <w:jc w:val="both"/>
+        <w:rPr>
+          <w:kern w:val="2"/>
+          <w14:ligatures w14:val="standardContextual"/>
+        </w:rPr>
+      </w:pPr>
+      <w:r>
+        <w:rPr>
+          <w:rFonts w:ascii="Calibri" w:hAnsi="Calibri" w:cs="Calibri"/>
+          <w:color w:val="333333"/>
+          <w:sz w:val="22"/>
+          <w:szCs w:val="22"/>
+        </w:rPr>
+        <w:t xml:space="preserve">A arquitetura atual já oferece uma base sólida para evolução incremental. O </w:t>
+      </w:r>
+      <w:proofErr w:type="spellStart"/>
+      <w:r>
+        <w:rPr>
+          <w:rFonts w:ascii="Calibri" w:hAnsi="Calibri" w:cs="Calibri"/>
+          <w:color w:val="333333"/>
+          <w:sz w:val="22"/>
+          <w:szCs w:val="22"/>
+        </w:rPr>
+        <w:t>roadmap</w:t>
+      </w:r>
+      <w:proofErr w:type="spellEnd"/>
+      <w:r>
+        <w:rPr>
+          <w:rFonts w:ascii="Calibri" w:hAnsi="Calibri" w:cs="Calibri"/>
+          <w:color w:val="333333"/>
+          <w:sz w:val="22"/>
+          <w:szCs w:val="22"/>
+        </w:rPr>
+        <w:t xml:space="preserve"> recomendado prioriza melhorias que aumentem segurança, governança, rastreabilidade e capacidade de integração com processos corporativos existentes, preservando a simplicidade da experiência do usuário.</w:t>
+      </w:r>
+    </w:p>
+    <w:p>
+      <w:pPr>
+        <w:pStyle w:val="PargrafodaLista"/>
+        <w:numPr>
+          <w:ilvl w:val="0"/>
+          <w:numId w:val="6"/>
+        </w:numPr>
+        <w:rPr>
+          <w:kern w:val="2"/>
+          <w14:ligatures w14:val="standardContextual"/>
+        </w:rPr>
+      </w:pPr>
+      <w:r>
+        <w:rPr>
+          <w:rFonts w:ascii="Calibri" w:hAnsi="Calibri" w:cs="Calibri"/>
+          <w:color w:val="333333"/>
+          <w:sz w:val="22"/>
+          <w:szCs w:val="22"/>
+        </w:rPr>
+        <w:t>Implementar perfis de acesso mais granulares, diferenciando usuários comuns, validadores técnicos e administradores.</w:t>
+      </w:r>
+    </w:p>
+    <w:p>
+      <w:pPr>
+        <w:pStyle w:val="PargrafodaLista"/>
+        <w:numPr>
+          <w:ilvl w:val="0"/>
+          <w:numId w:val="6"/>
+        </w:numPr>
+      </w:pPr>
+      <w:r>
+        <w:rPr>
+          <w:rFonts w:ascii="Calibri" w:hAnsi="Calibri" w:cs="Calibri"/>
+          <w:color w:val="333333"/>
+          <w:sz w:val="22"/>
+          <w:szCs w:val="22"/>
+        </w:rPr>
+        <w:t xml:space="preserve">Criar trilhas detalhadas de auditoria para alterações em normas, dicionários, prompts e parâmetros de </w:t>
+      </w:r>
+      <w:proofErr w:type="spellStart"/>
+      <w:r>
+        <w:rPr>
+          <w:rFonts w:ascii="Calibri" w:hAnsi="Calibri" w:cs="Calibri"/>
+          <w:color w:val="333333"/>
+          <w:sz w:val="22"/>
+          <w:szCs w:val="22"/>
+        </w:rPr>
+        <w:t>jobs</w:t>
+      </w:r>
+      <w:proofErr w:type="spellEnd"/>
+      <w:r>
+        <w:rPr>
+          <w:rFonts w:ascii="Calibri" w:hAnsi="Calibri" w:cs="Calibri"/>
+          <w:color w:val="333333"/>
+          <w:sz w:val="22"/>
+          <w:szCs w:val="22"/>
+        </w:rPr>
+        <w:t>.</w:t>
+      </w:r>
+    </w:p>
+    <w:p>
+      <w:pPr>
+        <w:pStyle w:val="PargrafodaLista"/>
+        <w:numPr>
+          <w:ilvl w:val="0"/>
+          <w:numId w:val="6"/>
+        </w:numPr>
+      </w:pPr>
+      <w:r>
+        <w:rPr>
+          <w:rFonts w:ascii="Calibri" w:hAnsi="Calibri" w:cs="Calibri"/>
+          <w:color w:val="333333"/>
+          <w:sz w:val="22"/>
+          <w:szCs w:val="22"/>
+        </w:rPr>
+        <w:t>Adicionar painel gerencial com indicadores de uso, produtividade e qualidade dos checklists gerados.</w:t>
+      </w:r>
+    </w:p>
+    <w:p>
+      <w:pPr>
+        <w:pStyle w:val="PargrafodaLista"/>
+        <w:numPr>
+          <w:ilvl w:val="0"/>
+          <w:numId w:val="6"/>
+        </w:numPr>
+      </w:pPr>
+      <w:r>
+        <w:rPr>
+          <w:rFonts w:ascii="Calibri" w:hAnsi="Calibri" w:cs="Calibri"/>
+          <w:color w:val="333333"/>
+          <w:sz w:val="22"/>
+          <w:szCs w:val="22"/>
+        </w:rPr>
+        <w:t>Evoluir o mecanismo de validação para simulações prévias de comandos antes da execução operacional.</w:t>
+      </w:r>
+    </w:p>
+    <w:p>
+      <w:pPr>
+        <w:pStyle w:val="PargrafodaLista"/>
+        <w:numPr>
+          <w:ilvl w:val="0"/>
+          <w:numId w:val="6"/>
+        </w:numPr>
+      </w:pPr>
+      <w:r>
+        <w:rPr>
+          <w:rFonts w:ascii="Calibri" w:hAnsi="Calibri" w:cs="Calibri"/>
+          <w:color w:val="333333"/>
+          <w:sz w:val="22"/>
+          <w:szCs w:val="22"/>
+        </w:rPr>
+        <w:t xml:space="preserve">Avaliar integração com catálogos internos, repositórios de documentação e ferramentas corporativas de </w:t>
+      </w:r>
+      <w:proofErr w:type="spellStart"/>
+      <w:r>
+        <w:rPr>
+          <w:rFonts w:ascii="Calibri" w:hAnsi="Calibri" w:cs="Calibri"/>
+          <w:color w:val="333333"/>
+          <w:sz w:val="22"/>
+          <w:szCs w:val="22"/>
+        </w:rPr>
+        <w:t>observabilidade</w:t>
+      </w:r>
+      <w:proofErr w:type="spellEnd"/>
+      <w:r>
+        <w:rPr>
+          <w:rFonts w:ascii="Calibri" w:hAnsi="Calibri" w:cs="Calibri"/>
+          <w:color w:val="333333"/>
+          <w:sz w:val="22"/>
+          <w:szCs w:val="22"/>
+        </w:rPr>
+        <w:t>.</w:t>
+      </w:r>
+    </w:p>
+    <w:p>
+      <w:pPr>
+        <w:pStyle w:val="Ttulo1"/>
+        <w:keepNext/>
+        <w:spacing w:before="240" w:after="120"/>
+        <w:rPr>
+          <w:kern w:val="36"/>
+          <w14:ligatures w14:val="standardContextual"/>
+        </w:rPr>
+      </w:pPr>
+      <w:bookmarkStart w:id="23" w:name="_Toc233183142"/>
+      <w:r>
+        <w:rPr>
+          <w:rFonts w:ascii="Calibri" w:hAnsi="Calibri" w:cs="Calibri"/>
+          <w:b/>
+          <w:bCs/>
+          <w:color w:val="1B365D"/>
+          <w:sz w:val="36"/>
+          <w:szCs w:val="36"/>
+        </w:rPr>
         <w:lastRenderedPageBreak/>
         <w:t>13. Conclusão Executiva</w:t>
       </w:r>
-      <w:bookmarkEnd w:id="24"/>
+      <w:bookmarkEnd w:id="23"/>
     </w:p>
     <w:p>
       <w:pPr>
@@ -5287,7 +8215,27 @@
           <w:sz w:val="22"/>
           <w:szCs w:val="22"/>
         </w:rPr>
-        <w:t>O Jobs IA consolida uma proposta relevante para modernização de rotinas técnicas associadas à criação, validação e documentação de workloads. Ao unir uma interface conversacional, regras de negócio centralizadas, geração automática de checklist e arquitetura local controlada, a solução oferece ganhos práticos para a operação e fortalece a governança sobre processos sensíveis.</w:t>
+        <w:t xml:space="preserve">O Jobs IA consolida uma proposta relevante para modernização de rotinas técnicas associadas à criação, validação e documentação de </w:t>
+      </w:r>
+      <w:proofErr w:type="spellStart"/>
+      <w:r>
+        <w:rPr>
+          <w:rFonts w:ascii="Calibri" w:hAnsi="Calibri" w:cs="Calibri"/>
+          <w:color w:val="333333"/>
+          <w:sz w:val="22"/>
+          <w:szCs w:val="22"/>
+        </w:rPr>
+        <w:t>workloads</w:t>
+      </w:r>
+      <w:proofErr w:type="spellEnd"/>
+      <w:r>
+        <w:rPr>
+          <w:rFonts w:ascii="Calibri" w:hAnsi="Calibri" w:cs="Calibri"/>
+          <w:color w:val="333333"/>
+          <w:sz w:val="22"/>
+          <w:szCs w:val="22"/>
+        </w:rPr>
+        <w:t>. Ao unir uma interface conversacional, regras de negócio centralizadas, geração automática de checklist e arquitetura local controlada, a solução oferece ganhos práticos para a operação e fortalece a governança sobre processos sensíveis.</w:t>
       </w:r>
     </w:p>
     <w:p>
@@ -5306,7 +8254,27 @@
           <w:sz w:val="22"/>
           <w:szCs w:val="22"/>
         </w:rPr>
-        <w:t>Mais do que automatizar tarefas, o sistema organiza conhecimento, reduz dependência de interpretações manuais e cria uma ponte entre a experiência dos analistas e a padronização exigida pelos ambientes corporativos. Com evolução contínua, governança adequada e acompanhamento de indicadores, o Jobs IA tende a se tornar uma ferramenta estratégica para aumentar eficiência, confiabilidade e qualidade na execução de jobs em lote.</w:t>
+        <w:t xml:space="preserve">Mais do que automatizar tarefas, o sistema organiza conhecimento, reduz dependência de interpretações manuais e cria uma ponte entre a experiência dos analistas e a padronização exigida pelos ambientes corporativos. Com evolução contínua, governança adequada e acompanhamento de indicadores, o Jobs IA tende a se tornar uma ferramenta estratégica para aumentar eficiência, confiabilidade e qualidade na execução de </w:t>
+      </w:r>
+      <w:proofErr w:type="spellStart"/>
+      <w:r>
+        <w:rPr>
+          <w:rFonts w:ascii="Calibri" w:hAnsi="Calibri" w:cs="Calibri"/>
+          <w:color w:val="333333"/>
+          <w:sz w:val="22"/>
+          <w:szCs w:val="22"/>
+        </w:rPr>
+        <w:t>jobs</w:t>
+      </w:r>
+      <w:proofErr w:type="spellEnd"/>
+      <w:r>
+        <w:rPr>
+          <w:rFonts w:ascii="Calibri" w:hAnsi="Calibri" w:cs="Calibri"/>
+          <w:color w:val="333333"/>
+          <w:sz w:val="22"/>
+          <w:szCs w:val="22"/>
+        </w:rPr>
+        <w:t xml:space="preserve"> em lote.</w:t>
       </w:r>
     </w:p>
     <w:p/>

</xml_diff>